<commit_message>
Lesson 63 Initiating Order and Redirecting to Order Page
</commit_message>
<xml_diff>
--- a/Note3.docx
+++ b/Note3.docx
@@ -93,14 +93,209 @@
         </w:rPr>
         <w:t xml:space="preserve">how to implement </w:t>
       </w:r>
-      <w:proofErr w:type="spellStart"/>
-      <w:r>
-        <w:rPr>
-          <w:lang w:val="en-US"/>
-        </w:rPr>
-        <w:t>paytm</w:t>
-      </w:r>
-      <w:proofErr w:type="spellEnd"/>
+      <w:r>
+        <w:rPr>
+          <w:lang w:val="en-US"/>
+        </w:rPr>
+        <w:t xml:space="preserve">paytm </w:t>
+      </w:r>
+      <w:r>
+        <w:rPr>
+          <w:lang w:val="en-US"/>
+        </w:rPr>
+        <w:t xml:space="preserve">payment gateway. </w:t>
+      </w:r>
+      <w:r>
+        <w:rPr>
+          <w:lang w:val="en-US"/>
+        </w:rPr>
+        <w:t>If you go to Razorpay or</w:t>
+      </w:r>
+      <w:r>
+        <w:rPr>
+          <w:lang w:val="en-US"/>
+        </w:rPr>
+        <w:t xml:space="preserve"> instamozo then in their d</w:t>
+      </w:r>
+      <w:r>
+        <w:rPr>
+          <w:lang w:val="en-US"/>
+        </w:rPr>
+        <w:t>oc</w:t>
+      </w:r>
+      <w:r>
+        <w:rPr>
+          <w:lang w:val="en-US"/>
+        </w:rPr>
+        <w:t>umentat</w:t>
+      </w:r>
+      <w:r>
+        <w:rPr>
+          <w:lang w:val="en-US"/>
+        </w:rPr>
+        <w:t>i</w:t>
+      </w:r>
+      <w:r>
+        <w:rPr>
+          <w:lang w:val="en-US"/>
+        </w:rPr>
+        <w:t>on</w:t>
+      </w:r>
+      <w:r>
+        <w:rPr>
+          <w:lang w:val="en-US"/>
+        </w:rPr>
+        <w:t xml:space="preserve">. </w:t>
+      </w:r>
+      <w:r>
+        <w:rPr>
+          <w:lang w:val="en-US"/>
+        </w:rPr>
+        <w:t xml:space="preserve">They will tell how to integrate </w:t>
+      </w:r>
+      <w:r>
+        <w:rPr>
+          <w:lang w:val="en-US"/>
+        </w:rPr>
+        <w:t>them in your website</w:t>
+      </w:r>
+      <w:r>
+        <w:rPr>
+          <w:lang w:val="en-US"/>
+        </w:rPr>
+        <w:t xml:space="preserve"> or App</w:t>
+      </w:r>
+      <w:r>
+        <w:rPr>
+          <w:lang w:val="en-US"/>
+        </w:rPr>
+        <w:t>.</w:t>
+      </w:r>
+    </w:p>
+    <w:p>
+      <w:pPr>
+        <w:rPr>
+          <w:lang w:val="en-US"/>
+        </w:rPr>
+      </w:pPr>
+      <w:r>
+        <w:rPr>
+          <w:lang w:val="en-US"/>
+        </w:rPr>
+        <w:t xml:space="preserve">Some payment gateway </w:t>
+      </w:r>
+      <w:proofErr w:type="gramStart"/>
+      <w:r>
+        <w:rPr>
+          <w:lang w:val="en-US"/>
+        </w:rPr>
+        <w:t>have</w:t>
+      </w:r>
+      <w:proofErr w:type="gramEnd"/>
+      <w:r>
+        <w:rPr>
+          <w:lang w:val="en-US"/>
+        </w:rPr>
+        <w:t xml:space="preserve"> pr</w:t>
+      </w:r>
+      <w:r>
+        <w:rPr>
+          <w:lang w:val="en-US"/>
+        </w:rPr>
+        <w:t>i</w:t>
+      </w:r>
+      <w:r>
+        <w:rPr>
+          <w:lang w:val="en-US"/>
+        </w:rPr>
+        <w:t>cing methods (who knows maybe paytm also have).</w:t>
+      </w:r>
+    </w:p>
+    <w:p>
+      <w:pPr>
+        <w:rPr>
+          <w:b/>
+          <w:bCs/>
+          <w:lang w:val="en-US"/>
+        </w:rPr>
+      </w:pPr>
+      <w:r>
+        <w:rPr>
+          <w:b/>
+          <w:bCs/>
+          <w:lang w:val="en-US"/>
+        </w:rPr>
+        <w:t>New Lesson</w:t>
+      </w:r>
+    </w:p>
+    <w:p>
+      <w:pPr>
+        <w:rPr>
+          <w:lang w:val="en-US"/>
+        </w:rPr>
+      </w:pPr>
+      <w:r>
+        <w:rPr>
+          <w:lang w:val="en-US"/>
+        </w:rPr>
+        <w:t xml:space="preserve">One user </w:t>
+      </w:r>
+      <w:proofErr w:type="gramStart"/>
+      <w:r>
+        <w:rPr>
+          <w:lang w:val="en-US"/>
+        </w:rPr>
+        <w:t>make</w:t>
+      </w:r>
+      <w:proofErr w:type="gramEnd"/>
+      <w:r>
+        <w:rPr>
+          <w:lang w:val="en-US"/>
+        </w:rPr>
+        <w:t xml:space="preserve"> some cart in out website </w:t>
+      </w:r>
+      <w:r>
+        <w:rPr>
+          <w:lang w:val="en-US"/>
+        </w:rPr>
+        <w:t xml:space="preserve">and add their personal details and then checkout </w:t>
+      </w:r>
+      <w:r>
+        <w:rPr>
+          <w:lang w:val="en-US"/>
+        </w:rPr>
+        <w:t xml:space="preserve">and do the payment then our order </w:t>
+      </w:r>
+      <w:r>
+        <w:rPr>
+          <w:lang w:val="en-US"/>
+        </w:rPr>
+        <w:t>s</w:t>
+      </w:r>
+      <w:r>
+        <w:rPr>
+          <w:lang w:val="en-US"/>
+        </w:rPr>
+        <w:t>hould come in ou</w:t>
+      </w:r>
+      <w:r>
+        <w:rPr>
+          <w:lang w:val="en-US"/>
+        </w:rPr>
+        <w:t>r</w:t>
+      </w:r>
+      <w:r>
+        <w:rPr>
+          <w:lang w:val="en-US"/>
+        </w:rPr>
+        <w:t xml:space="preserve"> database and at the same tie we need o</w:t>
+      </w:r>
+      <w:r>
+        <w:rPr>
+          <w:lang w:val="en-US"/>
+        </w:rPr>
+        <w:t>r</w:t>
+      </w:r>
       <w:r>
         <w:rPr>
           <w:lang w:val="en-US"/>
@@ -111,27 +306,49 @@
         <w:rPr>
           <w:lang w:val="en-US"/>
         </w:rPr>
-        <w:t xml:space="preserve">payment gateway. </w:t>
-      </w:r>
-      <w:r>
-        <w:rPr>
-          <w:lang w:val="en-US"/>
-        </w:rPr>
-        <w:t xml:space="preserve">If you go to </w:t>
-      </w:r>
-      <w:proofErr w:type="spellStart"/>
-      <w:r>
-        <w:rPr>
-          <w:lang w:val="en-US"/>
-        </w:rPr>
-        <w:t>Razorpay</w:t>
-      </w:r>
-      <w:proofErr w:type="spellEnd"/>
-      <w:r>
-        <w:rPr>
-          <w:lang w:val="en-US"/>
-        </w:rPr>
-        <w:t xml:space="preserve"> or</w:t>
+        <w:t>g</w:t>
+      </w:r>
+      <w:r>
+        <w:rPr>
+          <w:lang w:val="en-US"/>
+        </w:rPr>
+        <w:t>i</w:t>
+      </w:r>
+      <w:r>
+        <w:rPr>
+          <w:lang w:val="en-US"/>
+        </w:rPr>
+        <w:t>ve user in</w:t>
+      </w:r>
+      <w:r>
+        <w:rPr>
+          <w:lang w:val="en-US"/>
+        </w:rPr>
+        <w:t>t</w:t>
+      </w:r>
+      <w:r>
+        <w:rPr>
+          <w:lang w:val="en-US"/>
+        </w:rPr>
+        <w:t xml:space="preserve">imation that </w:t>
+      </w:r>
+      <w:r>
+        <w:rPr>
+          <w:lang w:val="en-US"/>
+        </w:rPr>
+        <w:t>your order is success</w:t>
+      </w:r>
+      <w:r>
+        <w:rPr>
+          <w:lang w:val="en-US"/>
+        </w:rPr>
+        <w:t>f</w:t>
+      </w:r>
+      <w:r>
+        <w:rPr>
+          <w:lang w:val="en-US"/>
+        </w:rPr>
+        <w:t>ul</w:t>
       </w:r>
       <w:r>
         <w:rPr>
@@ -139,43 +356,462 @@
         </w:rPr>
         <w:t xml:space="preserve"> </w:t>
       </w:r>
-      <w:proofErr w:type="spellStart"/>
-      <w:r>
-        <w:rPr>
-          <w:lang w:val="en-US"/>
-        </w:rPr>
-        <w:t>instamozo</w:t>
-      </w:r>
-      <w:proofErr w:type="spellEnd"/>
-      <w:r>
-        <w:rPr>
-          <w:lang w:val="en-US"/>
-        </w:rPr>
-        <w:t xml:space="preserve"> then in their d</w:t>
-      </w:r>
-      <w:r>
-        <w:rPr>
-          <w:lang w:val="en-US"/>
-        </w:rPr>
-        <w:t>oc</w:t>
-      </w:r>
-      <w:r>
-        <w:rPr>
-          <w:lang w:val="en-US"/>
-        </w:rPr>
-        <w:t>umentat</w:t>
-      </w:r>
-      <w:r>
-        <w:rPr>
-          <w:lang w:val="en-US"/>
-        </w:rPr>
-        <w:t>i</w:t>
-      </w:r>
-      <w:r>
-        <w:rPr>
-          <w:lang w:val="en-US"/>
-        </w:rPr>
-        <w:t>on</w:t>
+      <w:r>
+        <w:rPr>
+          <w:lang w:val="en-US"/>
+        </w:rPr>
+        <w:t xml:space="preserve">you don’t worry we will </w:t>
+      </w:r>
+      <w:r>
+        <w:rPr>
+          <w:lang w:val="en-US"/>
+        </w:rPr>
+        <w:t xml:space="preserve">fulfill your order. </w:t>
+      </w:r>
+      <w:r>
+        <w:rPr>
+          <w:lang w:val="en-US"/>
+        </w:rPr>
+        <w:t>How we will do it in our code</w:t>
+      </w:r>
+      <w:r>
+        <w:rPr>
+          <w:lang w:val="en-US"/>
+        </w:rPr>
+        <w:t xml:space="preserve"> on our end.</w:t>
+      </w:r>
+    </w:p>
+    <w:p>
+      <w:pPr>
+        <w:rPr>
+          <w:lang w:val="en-US"/>
+        </w:rPr>
+      </w:pPr>
+      <w:r>
+        <w:rPr>
+          <w:lang w:val="en-US"/>
+        </w:rPr>
+        <w:t>We come to know that in Nextjs we can set a style according to Boolean attribute vari</w:t>
+      </w:r>
+      <w:r>
+        <w:rPr>
+          <w:lang w:val="en-US"/>
+        </w:rPr>
+        <w:t>ab</w:t>
+      </w:r>
+      <w:r>
+        <w:rPr>
+          <w:lang w:val="en-US"/>
+        </w:rPr>
+        <w:t>le</w:t>
+      </w:r>
+      <w:r>
+        <w:rPr>
+          <w:lang w:val="en-US"/>
+        </w:rPr>
+        <w:t xml:space="preserve"> maybe for example dor disabled we can do so. That is disabled:bg-pink-300</w:t>
+      </w:r>
+      <w:r>
+        <w:rPr>
+          <w:lang w:val="en-US"/>
+        </w:rPr>
+        <w:t>.</w:t>
+      </w:r>
+    </w:p>
+    <w:p>
+      <w:pPr>
+        <w:rPr>
+          <w:b/>
+          <w:bCs/>
+          <w:lang w:val="en-US"/>
+        </w:rPr>
+      </w:pPr>
+      <w:r>
+        <w:rPr>
+          <w:b/>
+          <w:bCs/>
+          <w:lang w:val="en-US"/>
+        </w:rPr>
+        <w:t xml:space="preserve">You can </w:t>
+      </w:r>
+      <w:proofErr w:type="gramStart"/>
+      <w:r>
+        <w:rPr>
+          <w:b/>
+          <w:bCs/>
+          <w:lang w:val="en-US"/>
+        </w:rPr>
+        <w:t>useStateSnippets</w:t>
+      </w:r>
+      <w:r>
+        <w:rPr>
+          <w:b/>
+          <w:bCs/>
+          <w:lang w:val="en-US"/>
+        </w:rPr>
+        <w:t>(</w:t>
+      </w:r>
+      <w:proofErr w:type="gramEnd"/>
+      <w:r>
+        <w:rPr>
+          <w:b/>
+          <w:bCs/>
+          <w:lang w:val="en-US"/>
+        </w:rPr>
+        <w:t>codeword that is showin</w:t>
+      </w:r>
+      <w:r>
+        <w:rPr>
+          <w:b/>
+          <w:bCs/>
+          <w:lang w:val="en-US"/>
+        </w:rPr>
+        <w:t>g</w:t>
+      </w:r>
+      <w:r>
+        <w:rPr>
+          <w:b/>
+          <w:bCs/>
+          <w:lang w:val="en-US"/>
+        </w:rPr>
+        <w:t xml:space="preserve"> in the suggestion)</w:t>
+      </w:r>
+      <w:r>
+        <w:rPr>
+          <w:b/>
+          <w:bCs/>
+          <w:lang w:val="en-US"/>
+        </w:rPr>
+        <w:t xml:space="preserve"> to make useState very fast</w:t>
+      </w:r>
+    </w:p>
+    <w:p>
+      <w:pPr>
+        <w:rPr>
+          <w:lang w:val="en-US"/>
+        </w:rPr>
+      </w:pPr>
+      <w:r>
+        <w:rPr>
+          <w:lang w:val="en-US"/>
+        </w:rPr>
+        <w:t xml:space="preserve">We observed </w:t>
+      </w:r>
+      <w:r>
+        <w:rPr>
+          <w:lang w:val="en-US"/>
+        </w:rPr>
+        <w:t xml:space="preserve">that </w:t>
+      </w:r>
+      <w:r>
+        <w:rPr>
+          <w:lang w:val="en-US"/>
+        </w:rPr>
+        <w:t xml:space="preserve">if a function is in a </w:t>
+      </w:r>
+      <w:proofErr w:type="gramStart"/>
+      <w:r>
+        <w:rPr>
+          <w:lang w:val="en-US"/>
+        </w:rPr>
+        <w:t>render</w:t>
+      </w:r>
+      <w:proofErr w:type="gramEnd"/>
+      <w:r>
+        <w:rPr>
+          <w:lang w:val="en-US"/>
+        </w:rPr>
+        <w:t xml:space="preserve"> it will only use that </w:t>
+      </w:r>
+      <w:r>
+        <w:rPr>
+          <w:lang w:val="en-US"/>
+        </w:rPr>
+        <w:t xml:space="preserve">state </w:t>
+      </w:r>
+      <w:r>
+        <w:rPr>
+          <w:lang w:val="en-US"/>
+        </w:rPr>
+        <w:t xml:space="preserve">value of the </w:t>
+      </w:r>
+      <w:proofErr w:type="gramStart"/>
+      <w:r>
+        <w:rPr>
+          <w:lang w:val="en-US"/>
+        </w:rPr>
+        <w:t>render</w:t>
+      </w:r>
+      <w:r>
+        <w:rPr>
+          <w:lang w:val="en-US"/>
+        </w:rPr>
+        <w:t>(</w:t>
+      </w:r>
+      <w:proofErr w:type="gramEnd"/>
+      <w:r>
+        <w:rPr>
+          <w:lang w:val="en-US"/>
+        </w:rPr>
+        <w:t>or we might say environment of th</w:t>
+      </w:r>
+      <w:r>
+        <w:rPr>
+          <w:lang w:val="en-US"/>
+        </w:rPr>
+        <w:t>at render</w:t>
+      </w:r>
+      <w:r>
+        <w:rPr>
+          <w:lang w:val="en-US"/>
+        </w:rPr>
+        <w:t xml:space="preserve"> stays for that function (who knows)</w:t>
+      </w:r>
+      <w:r>
+        <w:rPr>
+          <w:lang w:val="en-US"/>
+        </w:rPr>
+        <w:t>) not of new render</w:t>
+      </w:r>
+      <w:r>
+        <w:rPr>
+          <w:lang w:val="en-US"/>
+        </w:rPr>
+        <w:t>.</w:t>
+      </w:r>
+    </w:p>
+    <w:p>
+      <w:pPr>
+        <w:rPr>
+          <w:b/>
+          <w:bCs/>
+          <w:color w:val="EE0000"/>
+          <w:lang w:val="en-US"/>
+        </w:rPr>
+      </w:pPr>
+      <w:r>
+        <w:rPr>
+          <w:b/>
+          <w:bCs/>
+          <w:color w:val="EE0000"/>
+          <w:lang w:val="en-US"/>
+        </w:rPr>
+        <w:t>I</w:t>
+      </w:r>
+      <w:r>
+        <w:rPr>
+          <w:b/>
+          <w:bCs/>
+          <w:color w:val="EE0000"/>
+          <w:lang w:val="en-US"/>
+        </w:rPr>
+        <w:t>n</w:t>
+      </w:r>
+      <w:r>
+        <w:rPr>
+          <w:b/>
+          <w:bCs/>
+          <w:color w:val="EE0000"/>
+          <w:lang w:val="en-US"/>
+        </w:rPr>
+        <w:t xml:space="preserve"> old mongodb it was very merciful it used to ignore if no value passed for a field that has not required to true.</w:t>
+      </w:r>
+      <w:r>
+        <w:rPr>
+          <w:b/>
+          <w:bCs/>
+          <w:color w:val="EE0000"/>
+          <w:lang w:val="en-US"/>
+        </w:rPr>
+        <w:t xml:space="preserve"> But not anymore </w:t>
+      </w:r>
+      <w:r>
+        <w:rPr>
+          <w:b/>
+          <w:bCs/>
+          <w:color w:val="EE0000"/>
+          <w:lang w:val="en-US"/>
+        </w:rPr>
+        <w:t>(who knows)</w:t>
+      </w:r>
+      <w:r>
+        <w:rPr>
+          <w:b/>
+          <w:bCs/>
+          <w:color w:val="EE0000"/>
+          <w:lang w:val="en-US"/>
+        </w:rPr>
+        <w:t>. If you have added required to true then you have to pass the value to the</w:t>
+      </w:r>
+      <w:r>
+        <w:rPr>
+          <w:b/>
+          <w:bCs/>
+          <w:color w:val="EE0000"/>
+          <w:lang w:val="en-US"/>
+        </w:rPr>
+        <w:t xml:space="preserve"> field even</w:t>
+      </w:r>
+      <w:r>
+        <w:rPr>
+          <w:b/>
+          <w:bCs/>
+          <w:color w:val="EE0000"/>
+          <w:lang w:val="en-US"/>
+        </w:rPr>
+        <w:t xml:space="preserve"> </w:t>
+      </w:r>
+      <w:r>
+        <w:rPr>
+          <w:b/>
+          <w:bCs/>
+          <w:color w:val="EE0000"/>
+          <w:lang w:val="en-US"/>
+        </w:rPr>
+        <w:t>though defa</w:t>
+      </w:r>
+      <w:r>
+        <w:rPr>
+          <w:b/>
+          <w:bCs/>
+          <w:color w:val="EE0000"/>
+          <w:lang w:val="en-US"/>
+        </w:rPr>
+        <w:t>u</w:t>
+      </w:r>
+      <w:r>
+        <w:rPr>
+          <w:b/>
+          <w:bCs/>
+          <w:color w:val="EE0000"/>
+          <w:lang w:val="en-US"/>
+        </w:rPr>
+        <w:t>l</w:t>
+      </w:r>
+      <w:r>
+        <w:rPr>
+          <w:b/>
+          <w:bCs/>
+          <w:color w:val="EE0000"/>
+          <w:lang w:val="en-US"/>
+        </w:rPr>
+        <w:t xml:space="preserve">t value was mentioned in the </w:t>
+      </w:r>
+      <w:r>
+        <w:rPr>
+          <w:b/>
+          <w:bCs/>
+          <w:color w:val="EE0000"/>
+          <w:lang w:val="en-US"/>
+        </w:rPr>
+        <w:t>Schema</w:t>
+      </w:r>
+      <w:r>
+        <w:rPr>
+          <w:b/>
+          <w:bCs/>
+          <w:color w:val="EE0000"/>
+          <w:lang w:val="en-US"/>
+        </w:rPr>
+        <w:t>.</w:t>
+      </w:r>
+    </w:p>
+    <w:p>
+      <w:pPr>
+        <w:rPr>
+          <w:lang w:val="en-US"/>
+        </w:rPr>
+      </w:pPr>
+      <w:r>
+        <w:rPr>
+          <w:lang w:val="en-US"/>
+        </w:rPr>
+        <w:t xml:space="preserve">The data client send to the server </w:t>
+      </w:r>
+      <w:r>
+        <w:rPr>
+          <w:lang w:val="en-US"/>
+        </w:rPr>
+        <w:t>can be tempered from the local storage(</w:t>
+      </w:r>
+      <w:r>
+        <w:rPr>
+          <w:lang w:val="en-US"/>
+        </w:rPr>
+        <w:t>maybe)</w:t>
+      </w:r>
+      <w:r>
+        <w:rPr>
+          <w:lang w:val="en-US"/>
+        </w:rPr>
+        <w:t>.</w:t>
+      </w:r>
+    </w:p>
+    <w:p>
+      <w:pPr>
+        <w:rPr>
+          <w:lang w:val="en-US"/>
+        </w:rPr>
+      </w:pPr>
+      <w:r>
+        <w:rPr>
+          <w:lang w:val="en-US"/>
+        </w:rPr>
+        <w:t xml:space="preserve">FYI </w:t>
+      </w:r>
+      <w:r>
+        <w:rPr>
+          <w:lang w:val="en-US"/>
+        </w:rPr>
+        <w:t xml:space="preserve">if you remember </w:t>
+      </w:r>
+      <w:r>
+        <w:rPr>
+          <w:lang w:val="en-US"/>
+        </w:rPr>
+        <w:t>P</w:t>
+      </w:r>
+      <w:r>
+        <w:rPr>
+          <w:lang w:val="en-US"/>
+        </w:rPr>
+        <w:t xml:space="preserve">aytm give you checksum </w:t>
+      </w:r>
+      <w:r>
+        <w:rPr>
+          <w:lang w:val="en-US"/>
+        </w:rPr>
+        <w:t xml:space="preserve">through which </w:t>
+      </w:r>
+      <w:r>
+        <w:rPr>
+          <w:lang w:val="en-US"/>
+        </w:rPr>
+        <w:t xml:space="preserve">the data sent by the </w:t>
+      </w:r>
+      <w:r>
+        <w:rPr>
+          <w:lang w:val="en-US"/>
+        </w:rPr>
+        <w:t>P</w:t>
+      </w:r>
+      <w:r>
+        <w:rPr>
+          <w:lang w:val="en-US"/>
+        </w:rPr>
+        <w:t>aytm along with it a checksum</w:t>
+      </w:r>
+      <w:r>
+        <w:rPr>
+          <w:lang w:val="en-US"/>
+        </w:rPr>
+        <w:t xml:space="preserve"> of data</w:t>
+      </w:r>
+      <w:r>
+        <w:rPr>
+          <w:lang w:val="en-US"/>
+        </w:rPr>
+        <w:t xml:space="preserve"> is also sent</w:t>
       </w:r>
       <w:r>
         <w:rPr>
@@ -183,82 +819,2398 @@
         </w:rPr>
         <w:t xml:space="preserve">. </w:t>
       </w:r>
-      <w:r>
-        <w:rPr>
-          <w:lang w:val="en-US"/>
-        </w:rPr>
-        <w:t xml:space="preserve">They will tell how to integrate </w:t>
-      </w:r>
-      <w:r>
-        <w:rPr>
-          <w:lang w:val="en-US"/>
-        </w:rPr>
-        <w:t>them in your website</w:t>
-      </w:r>
-      <w:r>
-        <w:rPr>
-          <w:lang w:val="en-US"/>
-        </w:rPr>
-        <w:t xml:space="preserve"> or App</w:t>
-      </w:r>
-      <w:r>
-        <w:rPr>
-          <w:lang w:val="en-US"/>
-        </w:rPr>
+      <w:proofErr w:type="gramStart"/>
+      <w:r>
+        <w:rPr>
+          <w:lang w:val="en-US"/>
+        </w:rPr>
+        <w:t>So</w:t>
+      </w:r>
+      <w:proofErr w:type="gramEnd"/>
+      <w:r>
+        <w:rPr>
+          <w:lang w:val="en-US"/>
+        </w:rPr>
+        <w:t xml:space="preserve"> by using our merchant </w:t>
+      </w:r>
+      <w:r>
+        <w:rPr>
+          <w:lang w:val="en-US"/>
+        </w:rPr>
+        <w:t xml:space="preserve">key </w:t>
+      </w:r>
+      <w:r>
+        <w:rPr>
+          <w:lang w:val="en-US"/>
+        </w:rPr>
+        <w:t xml:space="preserve">we can check </w:t>
+      </w:r>
+      <w:r>
+        <w:rPr>
+          <w:lang w:val="en-US"/>
+        </w:rPr>
+        <w:t xml:space="preserve">that the data </w:t>
+      </w:r>
+      <w:r>
+        <w:rPr>
+          <w:lang w:val="en-US"/>
+        </w:rPr>
+        <w:t xml:space="preserve">sent to us </w:t>
+      </w:r>
+      <w:r>
+        <w:rPr>
+          <w:lang w:val="en-US"/>
+        </w:rPr>
+        <w:t>is valid or not.</w:t>
+      </w:r>
+      <w:r>
+        <w:rPr>
+          <w:lang w:val="en-US"/>
+        </w:rPr>
+        <w:t xml:space="preserve"> </w:t>
+      </w:r>
+      <w:proofErr w:type="gramStart"/>
+      <w:r>
+        <w:rPr>
+          <w:lang w:val="en-US"/>
+        </w:rPr>
+        <w:t>So</w:t>
+      </w:r>
+      <w:proofErr w:type="gramEnd"/>
+      <w:r>
+        <w:rPr>
+          <w:lang w:val="en-US"/>
+        </w:rPr>
+        <w:t xml:space="preserve"> through checksum we come to know is that valid or not.</w:t>
+      </w:r>
+    </w:p>
+    <w:p>
+      <w:pPr>
+        <w:rPr>
+          <w:lang w:val="en-US"/>
+        </w:rPr>
+      </w:pPr>
+      <w:r>
+        <w:rPr>
+          <w:lang w:val="en-US"/>
+        </w:rPr>
+        <w:t xml:space="preserve">If it sent by Paytm or not. It should not be like that </w:t>
+      </w:r>
+      <w:r>
+        <w:rPr>
+          <w:lang w:val="en-US"/>
+        </w:rPr>
+        <w:t xml:space="preserve">someone sent aa random order ID </w:t>
+      </w:r>
+      <w:r>
+        <w:rPr>
+          <w:lang w:val="en-US"/>
+        </w:rPr>
+        <w:t xml:space="preserve">set us Payment successful notification by hitting </w:t>
+      </w:r>
+      <w:r>
+        <w:rPr>
+          <w:lang w:val="en-US"/>
+        </w:rPr>
+        <w:t>the callback url end point</w:t>
+      </w:r>
+      <w:r>
+        <w:rPr>
+          <w:lang w:val="en-US"/>
+        </w:rPr>
+        <w:t xml:space="preserve"> that we passed earlier</w:t>
+      </w:r>
+      <w:r>
+        <w:rPr>
+          <w:lang w:val="en-US"/>
+        </w:rPr>
+        <w:t xml:space="preserve"> and then we worry </w:t>
+      </w:r>
+      <w:r>
+        <w:rPr>
+          <w:lang w:val="en-US"/>
+        </w:rPr>
+        <w:t>nobody can do it as we validate checksum</w:t>
+      </w:r>
+      <w:r>
+        <w:rPr>
+          <w:lang w:val="en-US"/>
+        </w:rPr>
+        <w:t xml:space="preserve"> and then we move forward otherwise</w:t>
+      </w:r>
+      <w:r>
+        <w:rPr>
+          <w:lang w:val="en-US"/>
+        </w:rPr>
+        <w:t xml:space="preserve"> we will return the user and throw error (maybe by status).</w:t>
+      </w:r>
+    </w:p>
+    <w:p>
+      <w:pPr>
+        <w:rPr>
+          <w:lang w:val="en-US"/>
+        </w:rPr>
+      </w:pPr>
+      <w:r>
+        <w:rPr>
+          <w:lang w:val="en-US"/>
+        </w:rPr>
+        <w:drawing>
+          <wp:inline distT="0" distB="0" distL="0" distR="0" wp14:anchorId="11C2B6B3" wp14:editId="7714E1E0">
+            <wp:extent cx="5731510" cy="1837055"/>
+            <wp:effectExtent l="0" t="0" r="2540" b="0"/>
+            <wp:docPr id="647407393" name="Picture 1"/>
+            <wp:cNvGraphicFramePr>
+              <a:graphicFrameLocks xmlns:a="http://schemas.openxmlformats.org/drawingml/2006/main" noChangeAspect="1"/>
+            </wp:cNvGraphicFramePr>
+            <a:graphic xmlns:a="http://schemas.openxmlformats.org/drawingml/2006/main">
+              <a:graphicData uri="http://schemas.openxmlformats.org/drawingml/2006/picture">
+                <pic:pic xmlns:pic="http://schemas.openxmlformats.org/drawingml/2006/picture">
+                  <pic:nvPicPr>
+                    <pic:cNvPr id="647407393" name=""/>
+                    <pic:cNvPicPr/>
+                  </pic:nvPicPr>
+                  <pic:blipFill>
+                    <a:blip r:embed="rId5"/>
+                    <a:stretch>
+                      <a:fillRect/>
+                    </a:stretch>
+                  </pic:blipFill>
+                  <pic:spPr>
+                    <a:xfrm>
+                      <a:off x="0" y="0"/>
+                      <a:ext cx="5731510" cy="1837055"/>
+                    </a:xfrm>
+                    <a:prstGeom prst="rect">
+                      <a:avLst/>
+                    </a:prstGeom>
+                  </pic:spPr>
+                </pic:pic>
+              </a:graphicData>
+            </a:graphic>
+          </wp:inline>
+        </w:drawing>
+      </w:r>
+    </w:p>
+    <w:p>
+      <w:pPr>
+        <w:rPr>
+          <w:lang w:val="en-US"/>
+        </w:rPr>
+      </w:pPr>
+      <w:r>
+        <w:rPr>
+          <w:lang w:val="en-US"/>
+        </w:rPr>
+        <w:t>The urlCallback is sent this type of data.</w:t>
+      </w:r>
+    </w:p>
+    <w:p>
+      <w:pPr>
+        <w:rPr>
+          <w:color w:val="EE0000"/>
+          <w:lang w:val="en-US"/>
+        </w:rPr>
+      </w:pPr>
+      <w:r>
+        <w:rPr>
+          <w:b/>
+          <w:bCs/>
+          <w:color w:val="EE0000"/>
+          <w:lang w:val="en-US"/>
+        </w:rPr>
+        <w:t>T</w:t>
+      </w:r>
+      <w:r>
+        <w:rPr>
+          <w:b/>
+          <w:bCs/>
+          <w:color w:val="EE0000"/>
+          <w:lang w:val="en-US"/>
+        </w:rPr>
+        <w:t>e</w:t>
+      </w:r>
+      <w:r>
+        <w:rPr>
+          <w:b/>
+          <w:bCs/>
+          <w:color w:val="EE0000"/>
+          <w:lang w:val="en-US"/>
+        </w:rPr>
+        <w:t xml:space="preserve">acher says we get logical error that is no updation was happening in mongodb because </w:t>
+      </w:r>
+      <w:r>
+        <w:rPr>
+          <w:b/>
+          <w:bCs/>
+          <w:color w:val="EE0000"/>
+          <w:lang w:val="en-US"/>
+        </w:rPr>
+        <w:t xml:space="preserve">some method does not return promise die which error may </w:t>
+      </w:r>
+      <w:proofErr w:type="gramStart"/>
+      <w:r>
+        <w:rPr>
+          <w:b/>
+          <w:bCs/>
+          <w:color w:val="EE0000"/>
+          <w:lang w:val="en-US"/>
+        </w:rPr>
+        <w:t>arise(</w:t>
+      </w:r>
+      <w:proofErr w:type="gramEnd"/>
+      <w:r>
+        <w:rPr>
+          <w:b/>
+          <w:bCs/>
+          <w:color w:val="EE0000"/>
+          <w:lang w:val="en-US"/>
+        </w:rPr>
+        <w:t xml:space="preserve">who knows maybe we are wrong) according to teacher. </w:t>
+      </w:r>
+    </w:p>
+    <w:p>
+      <w:pPr>
+        <w:rPr>
+          <w:b/>
+          <w:bCs/>
+        </w:rPr>
+      </w:pPr>
+      <w:r>
+        <w:rPr>
+          <w:b/>
+          <w:bCs/>
+        </w:rPr>
+        <w:lastRenderedPageBreak/>
+        <w:t>return Response.redirect("/order",302) why we get this error</w:t>
+      </w:r>
+    </w:p>
+    <w:p>
+      <w:r>
+        <w:t xml:space="preserve">Good—this is a common Next.js App Router issue </w:t>
+      </w:r>
+      <w:r>
+        <w:rPr>
+          <w:rFonts w:ascii="Segoe UI Emoji" w:hAnsi="Segoe UI Emoji" w:cs="Segoe UI Emoji"/>
+        </w:rPr>
+        <w:t>👍</w:t>
+      </w:r>
+    </w:p>
+    <w:p>
+      <w:pPr>
+        <w:rPr>
+          <w:b/>
+          <w:bCs/>
+        </w:rPr>
+      </w:pPr>
+      <w:r>
+        <w:rPr>
+          <w:rFonts w:ascii="Segoe UI Emoji" w:hAnsi="Segoe UI Emoji" w:cs="Segoe UI Emoji"/>
+          <w:b/>
+          <w:bCs/>
+        </w:rPr>
+        <w:t>🔴</w:t>
+      </w:r>
+      <w:r>
+        <w:rPr>
+          <w:b/>
+          <w:bCs/>
+        </w:rPr>
+        <w:t xml:space="preserve"> Why this error happens</w:t>
+      </w:r>
+    </w:p>
+    <w:p>
+      <w:r>
+        <w:t>return Response.redirect("/order", 302)</w:t>
+      </w:r>
+    </w:p>
+    <w:p>
+      <w:r>
+        <w:rPr>
+          <w:rFonts w:ascii="Segoe UI Emoji" w:hAnsi="Segoe UI Emoji" w:cs="Segoe UI Emoji"/>
+        </w:rPr>
+        <w:t>❌</w:t>
+      </w:r>
+      <w:r>
+        <w:t xml:space="preserve"> Fails because </w:t>
+      </w:r>
+      <w:r>
+        <w:rPr>
+          <w:b/>
+          <w:bCs/>
+        </w:rPr>
+        <w:t>Response.redirect expects a full URL</w:t>
+      </w:r>
+      <w:r>
+        <w:t>, not just a relative path</w:t>
+      </w:r>
+    </w:p>
+    <w:p>
+      <w:r>
+        <w:pict w14:anchorId="53939596">
+          <v:rect id="_x0000_i1133" style="width:0;height:1.5pt" o:hralign="center" o:hrstd="t" o:hr="t" fillcolor="#a0a0a0" stroked="f"/>
+        </w:pict>
+      </w:r>
+    </w:p>
+    <w:p>
+      <w:pPr>
+        <w:rPr>
+          <w:b/>
+          <w:bCs/>
+        </w:rPr>
+      </w:pPr>
+      <w:r>
+        <w:rPr>
+          <w:rFonts w:ascii="Segoe UI Emoji" w:hAnsi="Segoe UI Emoji" w:cs="Segoe UI Emoji"/>
+          <w:b/>
+          <w:bCs/>
+        </w:rPr>
+        <w:t>🧠</w:t>
+      </w:r>
+      <w:r>
+        <w:rPr>
+          <w:b/>
+          <w:bCs/>
+        </w:rPr>
+        <w:t xml:space="preserve"> What’s happening</w:t>
+      </w:r>
+    </w:p>
+    <w:p>
+      <w:pPr>
+        <w:numPr>
+          <w:ilvl w:val="0"/>
+          <w:numId w:val="3"/>
+        </w:numPr>
+      </w:pPr>
+      <w:r>
+        <w:t xml:space="preserve">In server (Node/Edge), there is </w:t>
+      </w:r>
+      <w:r>
+        <w:rPr>
+          <w:b/>
+          <w:bCs/>
+        </w:rPr>
+        <w:t>no browser context</w:t>
+      </w:r>
+    </w:p>
+    <w:p>
+      <w:pPr>
+        <w:numPr>
+          <w:ilvl w:val="0"/>
+          <w:numId w:val="3"/>
+        </w:numPr>
+      </w:pPr>
+      <w:r>
+        <w:t xml:space="preserve">So /order → </w:t>
+      </w:r>
+      <w:r>
+        <w:rPr>
+          <w:rFonts w:ascii="Segoe UI Emoji" w:hAnsi="Segoe UI Emoji" w:cs="Segoe UI Emoji"/>
+        </w:rPr>
+        <w:t>❌</w:t>
+      </w:r>
+      <w:r>
+        <w:t xml:space="preserve"> unknown base URL</w:t>
+      </w:r>
+    </w:p>
+    <w:p>
+      <w:r>
+        <w:pict w14:anchorId="5FDE82AB">
+          <v:rect id="_x0000_i1134" style="width:0;height:1.5pt" o:hralign="center" o:hrstd="t" o:hr="t" fillcolor="#a0a0a0" stroked="f"/>
+        </w:pict>
+      </w:r>
+    </w:p>
+    <w:p>
+      <w:pPr>
+        <w:rPr>
+          <w:b/>
+          <w:bCs/>
+        </w:rPr>
+      </w:pPr>
+      <w:r>
+        <w:rPr>
+          <w:rFonts w:ascii="Segoe UI Emoji" w:hAnsi="Segoe UI Emoji" w:cs="Segoe UI Emoji"/>
+          <w:b/>
+          <w:bCs/>
+        </w:rPr>
+        <w:t>✅</w:t>
+      </w:r>
+      <w:r>
+        <w:rPr>
+          <w:b/>
+          <w:bCs/>
+        </w:rPr>
+        <w:t xml:space="preserve"> Correct way (important)</w:t>
+      </w:r>
+    </w:p>
+    <w:p>
+      <w:pPr>
+        <w:rPr>
+          <w:b/>
+          <w:bCs/>
+        </w:rPr>
+      </w:pPr>
+      <w:r>
+        <w:rPr>
+          <w:rFonts w:ascii="Segoe UI Emoji" w:hAnsi="Segoe UI Emoji" w:cs="Segoe UI Emoji"/>
+          <w:b/>
+          <w:bCs/>
+        </w:rPr>
+        <w:t>✔️</w:t>
+      </w:r>
+      <w:r>
+        <w:rPr>
+          <w:b/>
+          <w:bCs/>
+        </w:rPr>
+        <w:t xml:space="preserve"> Use absolute URL</w:t>
+      </w:r>
+    </w:p>
+    <w:p>
+      <w:r>
+        <w:t>return Response.redirect(`${</w:t>
+      </w:r>
+      <w:proofErr w:type="gramStart"/>
+      <w:r>
+        <w:t>process.env.NEXT</w:t>
+      </w:r>
+      <w:proofErr w:type="gramEnd"/>
+      <w:r>
+        <w:t>_PUBLIC_HOST}/order`, 302);</w:t>
+      </w:r>
+    </w:p>
+    <w:p>
+      <w:r>
+        <w:pict w14:anchorId="7647B887">
+          <v:rect id="_x0000_i1135" style="width:0;height:1.5pt" o:hralign="center" o:hrstd="t" o:hr="t" fillcolor="#a0a0a0" stroked="f"/>
+        </w:pict>
+      </w:r>
+    </w:p>
+    <w:p>
+      <w:pPr>
+        <w:rPr>
+          <w:b/>
+          <w:bCs/>
+        </w:rPr>
+      </w:pPr>
+      <w:r>
+        <w:rPr>
+          <w:rFonts w:ascii="Segoe UI Emoji" w:hAnsi="Segoe UI Emoji" w:cs="Segoe UI Emoji"/>
+          <w:b/>
+          <w:bCs/>
+        </w:rPr>
+        <w:t>🔥</w:t>
+      </w:r>
+      <w:r>
+        <w:rPr>
+          <w:b/>
+          <w:bCs/>
+        </w:rPr>
+        <w:t xml:space="preserve"> Better (recommended by Next.js)</w:t>
+      </w:r>
+    </w:p>
+    <w:p>
+      <w:r>
+        <w:t>Use URL constructor:</w:t>
+      </w:r>
+    </w:p>
+    <w:p>
+      <w:r>
+        <w:t xml:space="preserve">return Response.redirect(new </w:t>
+      </w:r>
+      <w:proofErr w:type="gramStart"/>
+      <w:r>
+        <w:t>URL(</w:t>
+      </w:r>
+      <w:proofErr w:type="gramEnd"/>
+      <w:r>
+        <w:t>"/order", req.url), 302);</w:t>
+      </w:r>
+    </w:p>
+    <w:p>
+      <w:r>
+        <w:rPr>
+          <w:rFonts w:ascii="Segoe UI Emoji" w:hAnsi="Segoe UI Emoji" w:cs="Segoe UI Emoji"/>
+        </w:rPr>
+        <w:t>👉</w:t>
+      </w:r>
+      <w:r>
+        <w:t xml:space="preserve"> This:</w:t>
+      </w:r>
+    </w:p>
+    <w:p>
+      <w:pPr>
+        <w:numPr>
+          <w:ilvl w:val="0"/>
+          <w:numId w:val="4"/>
+        </w:numPr>
+      </w:pPr>
+      <w:r>
+        <w:t xml:space="preserve">builds full URL automatically </w:t>
+      </w:r>
+      <w:r>
+        <w:rPr>
+          <w:rFonts w:ascii="Segoe UI Emoji" w:hAnsi="Segoe UI Emoji" w:cs="Segoe UI Emoji"/>
+        </w:rPr>
+        <w:t>✔️</w:t>
+      </w:r>
+    </w:p>
+    <w:p>
+      <w:pPr>
+        <w:numPr>
+          <w:ilvl w:val="0"/>
+          <w:numId w:val="4"/>
+        </w:numPr>
+      </w:pPr>
+      <w:r>
+        <w:t xml:space="preserve">works in all environments </w:t>
+      </w:r>
+      <w:r>
+        <w:rPr>
+          <w:rFonts w:ascii="Segoe UI Emoji" w:hAnsi="Segoe UI Emoji" w:cs="Segoe UI Emoji"/>
+        </w:rPr>
+        <w:t>✔️</w:t>
+      </w:r>
+    </w:p>
+    <w:p>
+      <w:r>
+        <w:pict w14:anchorId="387F0E27">
+          <v:rect id="_x0000_i1136" style="width:0;height:1.5pt" o:hralign="center" o:hrstd="t" o:hr="t" fillcolor="#a0a0a0" stroked="f"/>
+        </w:pict>
+      </w:r>
+    </w:p>
+    <w:p>
+      <w:pPr>
+        <w:rPr>
+          <w:b/>
+          <w:bCs/>
+        </w:rPr>
+      </w:pPr>
+      <w:r>
+        <w:rPr>
+          <w:rFonts w:ascii="Segoe UI Emoji" w:hAnsi="Segoe UI Emoji" w:cs="Segoe UI Emoji"/>
+          <w:b/>
+          <w:bCs/>
+        </w:rPr>
+        <w:t>🎯</w:t>
+      </w:r>
+      <w:r>
+        <w:rPr>
+          <w:b/>
+          <w:bCs/>
+        </w:rPr>
+        <w:t xml:space="preserve"> Why this works</w:t>
+      </w:r>
+    </w:p>
+    <w:p>
+      <w:r>
+        <w:t xml:space="preserve">new </w:t>
+      </w:r>
+      <w:proofErr w:type="gramStart"/>
+      <w:r>
+        <w:t>URL(</w:t>
+      </w:r>
+      <w:proofErr w:type="gramEnd"/>
+      <w:r>
+        <w:t>"/order", req.url)</w:t>
+      </w:r>
+    </w:p>
+    <w:p>
+      <w:r>
+        <w:rPr>
+          <w:rFonts w:ascii="Segoe UI Emoji" w:hAnsi="Segoe UI Emoji" w:cs="Segoe UI Emoji"/>
+        </w:rPr>
+        <w:t>👉</w:t>
+      </w:r>
+      <w:r>
+        <w:t xml:space="preserve"> Converts:</w:t>
+      </w:r>
+    </w:p>
+    <w:p>
+      <w:r>
+        <w:t>/order → http://localhost:3000/order</w:t>
+      </w:r>
+    </w:p>
+    <w:p>
+      <w:r>
+        <w:pict w14:anchorId="7D4EB26D">
+          <v:rect id="_x0000_i1137" style="width:0;height:1.5pt" o:hralign="center" o:hrstd="t" o:hr="t" fillcolor="#a0a0a0" stroked="f"/>
+        </w:pict>
+      </w:r>
+    </w:p>
+    <w:p>
+      <w:pPr>
+        <w:rPr>
+          <w:b/>
+          <w:bCs/>
+        </w:rPr>
+      </w:pPr>
+      <w:r>
+        <w:rPr>
+          <w:rFonts w:ascii="Segoe UI Emoji" w:hAnsi="Segoe UI Emoji" w:cs="Segoe UI Emoji"/>
+          <w:b/>
+          <w:bCs/>
+        </w:rPr>
+        <w:t>🚀</w:t>
+      </w:r>
+      <w:r>
+        <w:rPr>
+          <w:b/>
+          <w:bCs/>
+        </w:rPr>
+        <w:t xml:space="preserve"> One-line answer</w:t>
+      </w:r>
+    </w:p>
+    <w:p>
+      <w:r>
+        <w:t xml:space="preserve">Response.redirect needs a full URL, so use new </w:t>
+      </w:r>
+      <w:proofErr w:type="gramStart"/>
+      <w:r>
+        <w:t>URL(</w:t>
+      </w:r>
+      <w:proofErr w:type="gramEnd"/>
+      <w:r>
+        <w:t>"/order", req.url) instead of just "/order".</w:t>
+      </w:r>
+    </w:p>
+    <w:p>
+      <w:r>
+        <w:pict w14:anchorId="4F1FEBA5">
+          <v:rect id="_x0000_i1138" style="width:0;height:1.5pt" o:hralign="center" o:hrstd="t" o:hr="t" fillcolor="#a0a0a0" stroked="f"/>
+        </w:pict>
+      </w:r>
+    </w:p>
+    <w:p>
+      <w:r>
+        <w:t xml:space="preserve">If you want, I can show you </w:t>
+      </w:r>
+      <w:r>
+        <w:rPr>
+          <w:b/>
+          <w:bCs/>
+        </w:rPr>
+        <w:t xml:space="preserve">when to use </w:t>
+      </w:r>
+      <w:proofErr w:type="gramStart"/>
+      <w:r>
+        <w:rPr>
+          <w:b/>
+          <w:bCs/>
+        </w:rPr>
+        <w:t>redirect(</w:t>
+      </w:r>
+      <w:proofErr w:type="gramEnd"/>
+      <w:r>
+        <w:rPr>
+          <w:b/>
+          <w:bCs/>
+        </w:rPr>
+        <w:t>) vs Response.redirect() (important distinction)</w:t>
+      </w:r>
+      <w:r>
         <w:t>.</w:t>
       </w:r>
     </w:p>
     <w:p>
       <w:pPr>
         <w:rPr>
-          <w:lang w:val="en-US"/>
-        </w:rPr>
-      </w:pPr>
-      <w:r>
-        <w:rPr>
-          <w:lang w:val="en-US"/>
-        </w:rPr>
-        <w:t xml:space="preserve">Some payment gateway </w:t>
-      </w:r>
+          <w:b/>
+          <w:bCs/>
+          <w:lang w:val="en-US"/>
+        </w:rPr>
+      </w:pPr>
+      <w:r>
+        <w:rPr>
+          <w:b/>
+          <w:bCs/>
+          <w:lang w:val="en-US"/>
+        </w:rPr>
+        <w:lastRenderedPageBreak/>
+        <w:t>why it needs full url</w:t>
+      </w:r>
+    </w:p>
+    <w:p>
+      <w:r>
+        <w:t xml:space="preserve">Great question—this is the core concept </w:t>
+      </w:r>
+      <w:r>
+        <w:rPr>
+          <w:rFonts w:ascii="Segoe UI Emoji" w:hAnsi="Segoe UI Emoji" w:cs="Segoe UI Emoji"/>
+        </w:rPr>
+        <w:t>👍</w:t>
+      </w:r>
+    </w:p>
+    <w:p>
+      <w:pPr>
+        <w:rPr>
+          <w:b/>
+          <w:bCs/>
+        </w:rPr>
+      </w:pPr>
+      <w:r>
+        <w:rPr>
+          <w:rFonts w:ascii="Segoe UI Emoji" w:hAnsi="Segoe UI Emoji" w:cs="Segoe UI Emoji"/>
+          <w:b/>
+          <w:bCs/>
+        </w:rPr>
+        <w:t>🧠</w:t>
+      </w:r>
+      <w:r>
+        <w:rPr>
+          <w:b/>
+          <w:bCs/>
+        </w:rPr>
+        <w:t xml:space="preserve"> Why Response.redirect() needs full URL</w:t>
+      </w:r>
+    </w:p>
+    <w:p>
+      <w:r>
+        <w:rPr>
+          <w:rFonts w:ascii="Segoe UI Emoji" w:hAnsi="Segoe UI Emoji" w:cs="Segoe UI Emoji"/>
+        </w:rPr>
+        <w:t>✔️</w:t>
+      </w:r>
+      <w:r>
+        <w:t xml:space="preserve"> Because it runs on the </w:t>
+      </w:r>
+      <w:r>
+        <w:rPr>
+          <w:b/>
+          <w:bCs/>
+        </w:rPr>
+        <w:t>server</w:t>
+      </w:r>
+      <w:r>
+        <w:t>, not in the browser</w:t>
+      </w:r>
+    </w:p>
+    <w:p>
+      <w:r>
+        <w:pict w14:anchorId="7146F152">
+          <v:rect id="_x0000_i1181" style="width:0;height:1.5pt" o:hralign="center" o:hrstd="t" o:hr="t" fillcolor="#a0a0a0" stroked="f"/>
+        </w:pict>
+      </w:r>
+    </w:p>
+    <w:p>
+      <w:pPr>
+        <w:rPr>
+          <w:b/>
+          <w:bCs/>
+        </w:rPr>
+      </w:pPr>
+      <w:r>
+        <w:rPr>
+          <w:rFonts w:ascii="Segoe UI Emoji" w:hAnsi="Segoe UI Emoji" w:cs="Segoe UI Emoji"/>
+          <w:b/>
+          <w:bCs/>
+        </w:rPr>
+        <w:t>🔴</w:t>
+      </w:r>
+      <w:r>
+        <w:rPr>
+          <w:b/>
+          <w:bCs/>
+        </w:rPr>
+        <w:t xml:space="preserve"> Key difference</w:t>
+      </w:r>
+    </w:p>
+    <w:p>
+      <w:pPr>
+        <w:rPr>
+          <w:b/>
+          <w:bCs/>
+        </w:rPr>
+      </w:pPr>
+      <w:r>
+        <w:rPr>
+          <w:b/>
+          <w:bCs/>
+        </w:rPr>
+        <w:t>In browser:</w:t>
+      </w:r>
+    </w:p>
+    <w:p>
       <w:proofErr w:type="gramStart"/>
       <w:r>
-        <w:rPr>
-          <w:lang w:val="en-US"/>
-        </w:rPr>
-        <w:t>have</w:t>
+        <w:t>window.location</w:t>
       </w:r>
       <w:proofErr w:type="gramEnd"/>
       <w:r>
-        <w:rPr>
-          <w:lang w:val="en-US"/>
-        </w:rPr>
-        <w:t xml:space="preserve"> pr</w:t>
-      </w:r>
-      <w:r>
-        <w:rPr>
-          <w:lang w:val="en-US"/>
-        </w:rPr>
-        <w:t>i</w:t>
-      </w:r>
-      <w:r>
-        <w:rPr>
-          <w:lang w:val="en-US"/>
-        </w:rPr>
-        <w:t xml:space="preserve">cing methods (who knows maybe </w:t>
-      </w:r>
-      <w:proofErr w:type="spellStart"/>
-      <w:r>
-        <w:rPr>
-          <w:lang w:val="en-US"/>
-        </w:rPr>
-        <w:t>paytm</w:t>
-      </w:r>
-      <w:proofErr w:type="spellEnd"/>
-      <w:r>
-        <w:rPr>
-          <w:lang w:val="en-US"/>
-        </w:rPr>
-        <w:t xml:space="preserve"> also have).</w:t>
+        <w:t xml:space="preserve"> = "/order"</w:t>
+      </w:r>
+    </w:p>
+    <w:p>
+      <w:r>
+        <w:rPr>
+          <w:rFonts w:ascii="Segoe UI Emoji" w:hAnsi="Segoe UI Emoji" w:cs="Segoe UI Emoji"/>
+        </w:rPr>
+        <w:t>👉</w:t>
+      </w:r>
+      <w:r>
+        <w:t xml:space="preserve"> Browser knows:</w:t>
+      </w:r>
+    </w:p>
+    <w:p>
+      <w:r>
+        <w:t>current site = https://example.com</w:t>
+      </w:r>
+    </w:p>
+    <w:p>
+      <w:r>
+        <w:rPr>
+          <w:rFonts w:ascii="Segoe UI Emoji" w:hAnsi="Segoe UI Emoji" w:cs="Segoe UI Emoji"/>
+        </w:rPr>
+        <w:t>👉</w:t>
+      </w:r>
+      <w:r>
+        <w:t xml:space="preserve"> So it becomes:</w:t>
+      </w:r>
+    </w:p>
+    <w:p>
+      <w:r>
+        <w:t xml:space="preserve">https://example.com/order </w:t>
+      </w:r>
+      <w:r>
+        <w:rPr>
+          <w:rFonts w:ascii="Segoe UI Emoji" w:hAnsi="Segoe UI Emoji" w:cs="Segoe UI Emoji"/>
+        </w:rPr>
+        <w:t>✔️</w:t>
+      </w:r>
+    </w:p>
+    <w:p>
+      <w:r>
+        <w:pict w14:anchorId="49A4CC93">
+          <v:rect id="_x0000_i1182" style="width:0;height:1.5pt" o:hralign="center" o:hrstd="t" o:hr="t" fillcolor="#a0a0a0" stroked="f"/>
+        </w:pict>
+      </w:r>
+    </w:p>
+    <w:p>
+      <w:pPr>
+        <w:rPr>
+          <w:b/>
+          <w:bCs/>
+        </w:rPr>
+      </w:pPr>
+      <w:r>
+        <w:rPr>
+          <w:b/>
+          <w:bCs/>
+        </w:rPr>
+        <w:t>On server (Next.js / Node):</w:t>
+      </w:r>
+    </w:p>
+    <w:p>
+      <w:r>
+        <w:t>Response.redirect("/order")</w:t>
+      </w:r>
+    </w:p>
+    <w:p>
+      <w:r>
+        <w:rPr>
+          <w:rFonts w:ascii="Segoe UI Emoji" w:hAnsi="Segoe UI Emoji" w:cs="Segoe UI Emoji"/>
+        </w:rPr>
+        <w:t>👉</w:t>
+      </w:r>
+      <w:r>
+        <w:t xml:space="preserve"> Server does </w:t>
+      </w:r>
+      <w:r>
+        <w:rPr>
+          <w:b/>
+          <w:bCs/>
+        </w:rPr>
+        <w:t>NOT know</w:t>
+      </w:r>
+      <w:r>
+        <w:t>:</w:t>
+      </w:r>
+    </w:p>
+    <w:p>
+      <w:pPr>
+        <w:numPr>
+          <w:ilvl w:val="0"/>
+          <w:numId w:val="5"/>
+        </w:numPr>
+      </w:pPr>
+      <w:r>
+        <w:t xml:space="preserve">current domain </w:t>
+      </w:r>
+      <w:r>
+        <w:rPr>
+          <w:rFonts w:ascii="Segoe UI Emoji" w:hAnsi="Segoe UI Emoji" w:cs="Segoe UI Emoji"/>
+        </w:rPr>
+        <w:t>❌</w:t>
+      </w:r>
+    </w:p>
+    <w:p>
+      <w:pPr>
+        <w:numPr>
+          <w:ilvl w:val="0"/>
+          <w:numId w:val="5"/>
+        </w:numPr>
+      </w:pPr>
+      <w:r>
+        <w:t xml:space="preserve">hostname </w:t>
+      </w:r>
+      <w:r>
+        <w:rPr>
+          <w:rFonts w:ascii="Segoe UI Emoji" w:hAnsi="Segoe UI Emoji" w:cs="Segoe UI Emoji"/>
+        </w:rPr>
+        <w:t>❌</w:t>
+      </w:r>
+    </w:p>
+    <w:p>
+      <w:pPr>
+        <w:numPr>
+          <w:ilvl w:val="0"/>
+          <w:numId w:val="5"/>
+        </w:numPr>
+      </w:pPr>
+      <w:r>
+        <w:t xml:space="preserve">protocol </w:t>
+      </w:r>
+      <w:r>
+        <w:rPr>
+          <w:rFonts w:ascii="Segoe UI Emoji" w:hAnsi="Segoe UI Emoji" w:cs="Segoe UI Emoji"/>
+        </w:rPr>
+        <w:t>❌</w:t>
+      </w:r>
+    </w:p>
+    <w:p>
+      <w:r>
+        <w:rPr>
+          <w:rFonts w:ascii="Segoe UI Emoji" w:hAnsi="Segoe UI Emoji" w:cs="Segoe UI Emoji"/>
+        </w:rPr>
+        <w:t>👉</w:t>
+      </w:r>
+      <w:r>
+        <w:t xml:space="preserve"> So /order is </w:t>
+      </w:r>
+      <w:r>
+        <w:rPr>
+          <w:b/>
+          <w:bCs/>
+        </w:rPr>
+        <w:t>incomplete</w:t>
+      </w:r>
+    </w:p>
+    <w:p>
+      <w:r>
+        <w:pict w14:anchorId="524911EC">
+          <v:rect id="_x0000_i1183" style="width:0;height:1.5pt" o:hralign="center" o:hrstd="t" o:hr="t" fillcolor="#a0a0a0" stroked="f"/>
+        </w:pict>
+      </w:r>
+    </w:p>
+    <w:p>
+      <w:pPr>
+        <w:rPr>
+          <w:b/>
+          <w:bCs/>
+        </w:rPr>
+      </w:pPr>
+      <w:r>
+        <w:rPr>
+          <w:rFonts w:ascii="Segoe UI Emoji" w:hAnsi="Segoe UI Emoji" w:cs="Segoe UI Emoji"/>
+          <w:b/>
+          <w:bCs/>
+        </w:rPr>
+        <w:t>🧠</w:t>
+      </w:r>
+      <w:r>
+        <w:rPr>
+          <w:b/>
+          <w:bCs/>
+        </w:rPr>
+        <w:t xml:space="preserve"> What server needs</w:t>
+      </w:r>
+    </w:p>
+    <w:p>
+      <w:r>
+        <w:t xml:space="preserve">https://example.com/order </w:t>
+      </w:r>
+      <w:r>
+        <w:rPr>
+          <w:rFonts w:ascii="Segoe UI Emoji" w:hAnsi="Segoe UI Emoji" w:cs="Segoe UI Emoji"/>
+        </w:rPr>
+        <w:t>✔️</w:t>
+      </w:r>
+      <w:r>
+        <w:t xml:space="preserve"> (full URL)</w:t>
+      </w:r>
+    </w:p>
+    <w:p>
+      <w:r>
+        <w:pict w14:anchorId="58416180">
+          <v:rect id="_x0000_i1184" style="width:0;height:1.5pt" o:hralign="center" o:hrstd="t" o:hr="t" fillcolor="#a0a0a0" stroked="f"/>
+        </w:pict>
+      </w:r>
+    </w:p>
+    <w:p>
+      <w:pPr>
+        <w:rPr>
+          <w:b/>
+          <w:bCs/>
+        </w:rPr>
+      </w:pPr>
+      <w:r>
+        <w:rPr>
+          <w:rFonts w:ascii="Segoe UI Emoji" w:hAnsi="Segoe UI Emoji" w:cs="Segoe UI Emoji"/>
+          <w:b/>
+          <w:bCs/>
+        </w:rPr>
+        <w:t>✅</w:t>
+      </w:r>
+      <w:r>
+        <w:rPr>
+          <w:b/>
+          <w:bCs/>
+        </w:rPr>
+        <w:t xml:space="preserve"> That’s why we do</w:t>
+      </w:r>
+    </w:p>
+    <w:p>
+      <w:r>
+        <w:t xml:space="preserve">new </w:t>
+      </w:r>
+      <w:proofErr w:type="gramStart"/>
+      <w:r>
+        <w:t>URL(</w:t>
+      </w:r>
+      <w:proofErr w:type="gramEnd"/>
+      <w:r>
+        <w:t>"/order", req.url)</w:t>
+      </w:r>
+    </w:p>
+    <w:p>
+      <w:r>
+        <w:rPr>
+          <w:rFonts w:ascii="Segoe UI Emoji" w:hAnsi="Segoe UI Emoji" w:cs="Segoe UI Emoji"/>
+        </w:rPr>
+        <w:t>👉</w:t>
+      </w:r>
+      <w:r>
+        <w:t xml:space="preserve"> It builds:</w:t>
+      </w:r>
+    </w:p>
+    <w:p>
+      <w:r>
+        <w:t xml:space="preserve">http://localhost:3000/order </w:t>
+      </w:r>
+      <w:r>
+        <w:rPr>
+          <w:rFonts w:ascii="Segoe UI Emoji" w:hAnsi="Segoe UI Emoji" w:cs="Segoe UI Emoji"/>
+        </w:rPr>
+        <w:t>✔️</w:t>
+      </w:r>
+    </w:p>
+    <w:p>
+      <w:r>
+        <w:pict w14:anchorId="5F465260">
+          <v:rect id="_x0000_i1185" style="width:0;height:1.5pt" o:hralign="center" o:hrstd="t" o:hr="t" fillcolor="#a0a0a0" stroked="f"/>
+        </w:pict>
+      </w:r>
+    </w:p>
+    <w:p>
+      <w:pPr>
+        <w:rPr>
+          <w:b/>
+          <w:bCs/>
+        </w:rPr>
+      </w:pPr>
+      <w:r>
+        <w:rPr>
+          <w:rFonts w:ascii="Segoe UI Emoji" w:hAnsi="Segoe UI Emoji" w:cs="Segoe UI Emoji"/>
+          <w:b/>
+          <w:bCs/>
+        </w:rPr>
+        <w:t>🔥</w:t>
+      </w:r>
+      <w:r>
+        <w:rPr>
+          <w:b/>
+          <w:bCs/>
+        </w:rPr>
+        <w:t xml:space="preserve"> Simple analogy</w:t>
+      </w:r>
+    </w:p>
+    <w:p>
+      <w:pPr>
+        <w:numPr>
+          <w:ilvl w:val="0"/>
+          <w:numId w:val="6"/>
+        </w:numPr>
+      </w:pPr>
+      <w:r>
+        <w:lastRenderedPageBreak/>
+        <w:t xml:space="preserve">/order = “Go to room 5” </w:t>
+      </w:r>
+      <w:r>
+        <w:rPr>
+          <w:rFonts w:ascii="Segoe UI Emoji" w:hAnsi="Segoe UI Emoji" w:cs="Segoe UI Emoji"/>
+        </w:rPr>
+        <w:t>❌</w:t>
+      </w:r>
+      <w:r>
+        <w:t xml:space="preserve"> (which building?)</w:t>
+      </w:r>
+    </w:p>
+    <w:p>
+      <w:pPr>
+        <w:numPr>
+          <w:ilvl w:val="0"/>
+          <w:numId w:val="6"/>
+        </w:numPr>
+      </w:pPr>
+      <w:r>
+        <w:t xml:space="preserve">https://site.com/order = full address </w:t>
+      </w:r>
+      <w:r>
+        <w:rPr>
+          <w:rFonts w:ascii="Segoe UI Emoji" w:hAnsi="Segoe UI Emoji" w:cs="Segoe UI Emoji"/>
+        </w:rPr>
+        <w:t>✔️</w:t>
+      </w:r>
+    </w:p>
+    <w:p>
+      <w:r>
+        <w:pict w14:anchorId="27D315C7">
+          <v:rect id="_x0000_i1186" style="width:0;height:1.5pt" o:hralign="center" o:hrstd="t" o:hr="t" fillcolor="#a0a0a0" stroked="f"/>
+        </w:pict>
+      </w:r>
+    </w:p>
+    <w:p>
+      <w:pPr>
+        <w:rPr>
+          <w:b/>
+          <w:bCs/>
+        </w:rPr>
+      </w:pPr>
+      <w:r>
+        <w:rPr>
+          <w:rFonts w:ascii="Segoe UI Emoji" w:hAnsi="Segoe UI Emoji" w:cs="Segoe UI Emoji"/>
+          <w:b/>
+          <w:bCs/>
+        </w:rPr>
+        <w:t>🚀</w:t>
+      </w:r>
+      <w:r>
+        <w:rPr>
+          <w:b/>
+          <w:bCs/>
+        </w:rPr>
+        <w:t xml:space="preserve"> One-line answer</w:t>
+      </w:r>
+    </w:p>
+    <w:p>
+      <w:r>
+        <w:t>Response.redirect() needs a full URL because the server doesn’t know the current domain, unlike the browser.</w:t>
+      </w:r>
+    </w:p>
+    <w:p>
+      <w:pPr>
+        <w:rPr>
+          <w:b/>
+          <w:bCs/>
+          <w:lang w:val="en-US"/>
+        </w:rPr>
+      </w:pPr>
+      <w:r>
+        <w:rPr>
+          <w:b/>
+          <w:bCs/>
+          <w:lang w:val="en-US"/>
+        </w:rPr>
+        <w:t>but why server don't knwo domain it can point to itself</w:t>
+      </w:r>
+    </w:p>
+    <w:p>
+      <w:r>
+        <w:t xml:space="preserve">Great question—this gets to how servers actually work </w:t>
+      </w:r>
+      <w:r>
+        <w:rPr>
+          <w:rFonts w:ascii="Segoe UI Emoji" w:hAnsi="Segoe UI Emoji" w:cs="Segoe UI Emoji"/>
+        </w:rPr>
+        <w:t>👍</w:t>
+      </w:r>
+    </w:p>
+    <w:p>
+      <w:pPr>
+        <w:rPr>
+          <w:b/>
+          <w:bCs/>
+        </w:rPr>
+      </w:pPr>
+      <w:r>
+        <w:rPr>
+          <w:rFonts w:ascii="Segoe UI Emoji" w:hAnsi="Segoe UI Emoji" w:cs="Segoe UI Emoji"/>
+          <w:b/>
+          <w:bCs/>
+        </w:rPr>
+        <w:t>🧠</w:t>
+      </w:r>
+      <w:r>
+        <w:rPr>
+          <w:b/>
+          <w:bCs/>
+        </w:rPr>
+        <w:t xml:space="preserve"> Short answer</w:t>
+      </w:r>
+    </w:p>
+    <w:p>
+      <w:r>
+        <w:rPr>
+          <w:rFonts w:ascii="Segoe UI Emoji" w:hAnsi="Segoe UI Emoji" w:cs="Segoe UI Emoji"/>
+        </w:rPr>
+        <w:t>❌</w:t>
+      </w:r>
+      <w:r>
+        <w:t xml:space="preserve"> Server </w:t>
+      </w:r>
+      <w:r>
+        <w:rPr>
+          <w:b/>
+          <w:bCs/>
+        </w:rPr>
+        <w:t>doesn’t assume a domain</w:t>
+      </w:r>
+      <w:r>
+        <w:t xml:space="preserve"> because the same code can run on many domains</w:t>
+      </w:r>
+      <w:r>
+        <w:br/>
+      </w:r>
+      <w:r>
+        <w:rPr>
+          <w:rFonts w:ascii="Segoe UI Emoji" w:hAnsi="Segoe UI Emoji" w:cs="Segoe UI Emoji"/>
+        </w:rPr>
+        <w:t>✔️</w:t>
+      </w:r>
+      <w:r>
+        <w:t xml:space="preserve"> So it needs the </w:t>
+      </w:r>
+      <w:r>
+        <w:rPr>
+          <w:b/>
+          <w:bCs/>
+        </w:rPr>
+        <w:t>full URL explicitly</w:t>
+      </w:r>
+    </w:p>
+    <w:p>
+      <w:r>
+        <w:pict w14:anchorId="4BE64276">
+          <v:rect id="_x0000_i1235" style="width:0;height:1.5pt" o:hralign="center" o:hrstd="t" o:hr="t" fillcolor="#a0a0a0" stroked="f"/>
+        </w:pict>
+      </w:r>
+    </w:p>
+    <w:p>
+      <w:pPr>
+        <w:rPr>
+          <w:b/>
+          <w:bCs/>
+        </w:rPr>
+      </w:pPr>
+      <w:r>
+        <w:rPr>
+          <w:rFonts w:ascii="Segoe UI Emoji" w:hAnsi="Segoe UI Emoji" w:cs="Segoe UI Emoji"/>
+          <w:b/>
+          <w:bCs/>
+        </w:rPr>
+        <w:t>🔴</w:t>
+      </w:r>
+      <w:r>
+        <w:rPr>
+          <w:b/>
+          <w:bCs/>
+        </w:rPr>
+        <w:t xml:space="preserve"> Why server doesn’t “point to itself”</w:t>
+      </w:r>
+    </w:p>
+    <w:p>
+      <w:r>
+        <w:t>Your app might be accessed as:</w:t>
+      </w:r>
+    </w:p>
+    <w:p>
+      <w:r>
+        <w:t>https://myshop.com</w:t>
+      </w:r>
+    </w:p>
+    <w:p>
+      <w:r>
+        <w:t>https://www.myshop.com</w:t>
+      </w:r>
+    </w:p>
+    <w:p>
+      <w:r>
+        <w:t>https://staging.myshop.com</w:t>
+      </w:r>
+    </w:p>
+    <w:p>
+      <w:r>
+        <w:t>http://localhost:3000</w:t>
+      </w:r>
+    </w:p>
+    <w:p>
+      <w:r>
+        <w:rPr>
+          <w:rFonts w:ascii="Segoe UI Emoji" w:hAnsi="Segoe UI Emoji" w:cs="Segoe UI Emoji"/>
+        </w:rPr>
+        <w:t>👉</w:t>
+      </w:r>
+      <w:r>
+        <w:t xml:space="preserve"> All hit the </w:t>
+      </w:r>
+      <w:r>
+        <w:rPr>
+          <w:b/>
+          <w:bCs/>
+        </w:rPr>
+        <w:t>same server code</w:t>
+      </w:r>
+    </w:p>
+    <w:p>
+      <w:r>
+        <w:pict w14:anchorId="5B9085ED">
+          <v:rect id="_x0000_i1236" style="width:0;height:1.5pt" o:hralign="center" o:hrstd="t" o:hr="t" fillcolor="#a0a0a0" stroked="f"/>
+        </w:pict>
+      </w:r>
+    </w:p>
+    <w:p>
+      <w:pPr>
+        <w:rPr>
+          <w:b/>
+          <w:bCs/>
+        </w:rPr>
+      </w:pPr>
+      <w:r>
+        <w:rPr>
+          <w:rFonts w:ascii="Segoe UI Emoji" w:hAnsi="Segoe UI Emoji" w:cs="Segoe UI Emoji"/>
+          <w:b/>
+          <w:bCs/>
+        </w:rPr>
+        <w:t>🧠</w:t>
+      </w:r>
+      <w:r>
+        <w:rPr>
+          <w:b/>
+          <w:bCs/>
+        </w:rPr>
+        <w:t xml:space="preserve"> So what is “itself”?</w:t>
+      </w:r>
+    </w:p>
+    <w:p>
+      <w:r>
+        <w:rPr>
+          <w:rFonts w:ascii="Segoe UI Emoji" w:hAnsi="Segoe UI Emoji" w:cs="Segoe UI Emoji"/>
+        </w:rPr>
+        <w:t>❌</w:t>
+      </w:r>
+      <w:r>
+        <w:t xml:space="preserve"> There is no single fixed “self”</w:t>
+      </w:r>
+      <w:r>
+        <w:br/>
+      </w:r>
+      <w:r>
+        <w:rPr>
+          <w:rFonts w:ascii="Segoe UI Emoji" w:hAnsi="Segoe UI Emoji" w:cs="Segoe UI Emoji"/>
+        </w:rPr>
+        <w:t>✔️</w:t>
+      </w:r>
+      <w:r>
+        <w:t xml:space="preserve"> Domain comes from the </w:t>
+      </w:r>
+      <w:r>
+        <w:rPr>
+          <w:b/>
+          <w:bCs/>
+        </w:rPr>
+        <w:t>incoming request</w:t>
+      </w:r>
+    </w:p>
+    <w:p>
+      <w:r>
+        <w:pict w14:anchorId="526EC5DD">
+          <v:rect id="_x0000_i1237" style="width:0;height:1.5pt" o:hralign="center" o:hrstd="t" o:hr="t" fillcolor="#a0a0a0" stroked="f"/>
+        </w:pict>
+      </w:r>
+    </w:p>
+    <w:p>
+      <w:pPr>
+        <w:rPr>
+          <w:b/>
+          <w:bCs/>
+        </w:rPr>
+      </w:pPr>
+      <w:r>
+        <w:rPr>
+          <w:rFonts w:ascii="Segoe UI Emoji" w:hAnsi="Segoe UI Emoji" w:cs="Segoe UI Emoji"/>
+          <w:b/>
+          <w:bCs/>
+        </w:rPr>
+        <w:t>🔥</w:t>
+      </w:r>
+      <w:r>
+        <w:rPr>
+          <w:b/>
+          <w:bCs/>
+        </w:rPr>
+        <w:t xml:space="preserve"> That’s why req.url is used</w:t>
+      </w:r>
+    </w:p>
+    <w:p>
+      <w:r>
+        <w:t xml:space="preserve">new </w:t>
+      </w:r>
+      <w:proofErr w:type="gramStart"/>
+      <w:r>
+        <w:t>URL(</w:t>
+      </w:r>
+      <w:proofErr w:type="gramEnd"/>
+      <w:r>
+        <w:t>"/order", req.url)</w:t>
+      </w:r>
+    </w:p>
+    <w:p>
+      <w:r>
+        <w:rPr>
+          <w:rFonts w:ascii="Segoe UI Emoji" w:hAnsi="Segoe UI Emoji" w:cs="Segoe UI Emoji"/>
+        </w:rPr>
+        <w:t>👉</w:t>
+      </w:r>
+      <w:r>
+        <w:t xml:space="preserve"> If request came from:</w:t>
+      </w:r>
+    </w:p>
+    <w:p>
+      <w:r>
+        <w:t>https://myshop.com/cart</w:t>
+      </w:r>
+    </w:p>
+    <w:p>
+      <w:r>
+        <w:rPr>
+          <w:rFonts w:ascii="Segoe UI Emoji" w:hAnsi="Segoe UI Emoji" w:cs="Segoe UI Emoji"/>
+        </w:rPr>
+        <w:t>👉</w:t>
+      </w:r>
+      <w:r>
+        <w:t xml:space="preserve"> It builds:</w:t>
+      </w:r>
+    </w:p>
+    <w:p>
+      <w:r>
+        <w:t xml:space="preserve">https://myshop.com/order </w:t>
+      </w:r>
+      <w:r>
+        <w:rPr>
+          <w:rFonts w:ascii="Segoe UI Emoji" w:hAnsi="Segoe UI Emoji" w:cs="Segoe UI Emoji"/>
+        </w:rPr>
+        <w:t>✔️</w:t>
+      </w:r>
+    </w:p>
+    <w:p>
+      <w:r>
+        <w:pict w14:anchorId="7EA99748">
+          <v:rect id="_x0000_i1238" style="width:0;height:1.5pt" o:hralign="center" o:hrstd="t" o:hr="t" fillcolor="#a0a0a0" stroked="f"/>
+        </w:pict>
+      </w:r>
+    </w:p>
+    <w:p>
+      <w:pPr>
+        <w:rPr>
+          <w:b/>
+          <w:bCs/>
+        </w:rPr>
+      </w:pPr>
+      <w:r>
+        <w:rPr>
+          <w:rFonts w:ascii="Segoe UI Emoji" w:hAnsi="Segoe UI Emoji" w:cs="Segoe UI Emoji"/>
+          <w:b/>
+          <w:bCs/>
+        </w:rPr>
+        <w:lastRenderedPageBreak/>
+        <w:t>⚠️</w:t>
+      </w:r>
+      <w:r>
+        <w:rPr>
+          <w:b/>
+          <w:bCs/>
+        </w:rPr>
+        <w:t xml:space="preserve"> Important</w:t>
+      </w:r>
+    </w:p>
+    <w:p>
+      <w:r>
+        <w:t>Server:</w:t>
+      </w:r>
+    </w:p>
+    <w:p>
+      <w:pPr>
+        <w:numPr>
+          <w:ilvl w:val="0"/>
+          <w:numId w:val="7"/>
+        </w:numPr>
+      </w:pPr>
+      <w:r>
+        <w:t>runs behind proxies/CDNs</w:t>
+      </w:r>
+    </w:p>
+    <w:p>
+      <w:pPr>
+        <w:numPr>
+          <w:ilvl w:val="0"/>
+          <w:numId w:val="7"/>
+        </w:numPr>
+      </w:pPr>
+      <w:r>
+        <w:t>can serve multiple domains</w:t>
+      </w:r>
+    </w:p>
+    <w:p>
+      <w:pPr>
+        <w:numPr>
+          <w:ilvl w:val="0"/>
+          <w:numId w:val="7"/>
+        </w:numPr>
+      </w:pPr>
+      <w:r>
+        <w:t>doesn’t hardcode hostname</w:t>
+      </w:r>
+    </w:p>
+    <w:p>
+      <w:r>
+        <w:pict w14:anchorId="4B1DA9DB">
+          <v:rect id="_x0000_i1239" style="width:0;height:1.5pt" o:hralign="center" o:hrstd="t" o:hr="t" fillcolor="#a0a0a0" stroked="f"/>
+        </w:pict>
+      </w:r>
+    </w:p>
+    <w:p>
+      <w:pPr>
+        <w:rPr>
+          <w:b/>
+          <w:bCs/>
+        </w:rPr>
+      </w:pPr>
+      <w:r>
+        <w:rPr>
+          <w:rFonts w:ascii="Segoe UI Emoji" w:hAnsi="Segoe UI Emoji" w:cs="Segoe UI Emoji"/>
+          <w:b/>
+          <w:bCs/>
+        </w:rPr>
+        <w:t>🎯</w:t>
+      </w:r>
+      <w:r>
+        <w:rPr>
+          <w:b/>
+          <w:bCs/>
+        </w:rPr>
+        <w:t xml:space="preserve"> Key idea</w:t>
+      </w:r>
+    </w:p>
+    <w:p>
+      <w:r>
+        <w:t>Browser knows current URL → server does NOT assume it</w:t>
+      </w:r>
+    </w:p>
+    <w:p>
+      <w:r>
+        <w:pict w14:anchorId="4C0A0469">
+          <v:rect id="_x0000_i1240" style="width:0;height:1.5pt" o:hralign="center" o:hrstd="t" o:hr="t" fillcolor="#a0a0a0" stroked="f"/>
+        </w:pict>
+      </w:r>
+    </w:p>
+    <w:p>
+      <w:pPr>
+        <w:rPr>
+          <w:b/>
+          <w:bCs/>
+        </w:rPr>
+      </w:pPr>
+      <w:r>
+        <w:rPr>
+          <w:rFonts w:ascii="Segoe UI Emoji" w:hAnsi="Segoe UI Emoji" w:cs="Segoe UI Emoji"/>
+          <w:b/>
+          <w:bCs/>
+        </w:rPr>
+        <w:t>🚀</w:t>
+      </w:r>
+      <w:r>
+        <w:rPr>
+          <w:b/>
+          <w:bCs/>
+        </w:rPr>
+        <w:t xml:space="preserve"> One-line answer</w:t>
+      </w:r>
+    </w:p>
+    <w:p>
+      <w:r>
+        <w:t>The server doesn’t assume a domain because the same code can serve multiple domains, so it relies on the incoming request (req.url) to determine the correct one.</w:t>
+      </w:r>
+    </w:p>
+    <w:p>
+      <w:r>
+        <w:pict w14:anchorId="3757FF6B">
+          <v:rect id="_x0000_i1241" style="width:0;height:1.5pt" o:hralign="center" o:hrstd="t" o:hr="t" fillcolor="#a0a0a0" stroked="f"/>
+        </w:pict>
+      </w:r>
+    </w:p>
+    <w:p>
+      <w:r>
+        <w:t xml:space="preserve">If you want, I can show you how this behaves in </w:t>
+      </w:r>
+      <w:r>
+        <w:rPr>
+          <w:b/>
+          <w:bCs/>
+        </w:rPr>
+        <w:t>Vercel / production vs localhost</w:t>
+      </w:r>
+      <w:r>
+        <w:t xml:space="preserve"> (very useful insight).</w:t>
+      </w:r>
+    </w:p>
+    <w:p>
+      <w:pPr>
+        <w:rPr>
+          <w:b/>
+          <w:bCs/>
+          <w:lang w:val="en-US"/>
+        </w:rPr>
+      </w:pPr>
+      <w:r>
+        <w:rPr>
+          <w:b/>
+          <w:bCs/>
+          <w:lang w:val="en-US"/>
+        </w:rPr>
+        <w:t>but in old NExtjs it was possible</w:t>
+      </w:r>
+    </w:p>
+    <w:p>
+      <w:r>
+        <w:t xml:space="preserve">Good point—you’re noticing a real difference </w:t>
+      </w:r>
+      <w:r>
+        <w:rPr>
+          <w:rFonts w:ascii="Segoe UI Emoji" w:hAnsi="Segoe UI Emoji" w:cs="Segoe UI Emoji"/>
+        </w:rPr>
+        <w:t>👍</w:t>
+      </w:r>
+    </w:p>
+    <w:p>
+      <w:pPr>
+        <w:rPr>
+          <w:b/>
+          <w:bCs/>
+        </w:rPr>
+      </w:pPr>
+      <w:r>
+        <w:rPr>
+          <w:rFonts w:ascii="Segoe UI Emoji" w:hAnsi="Segoe UI Emoji" w:cs="Segoe UI Emoji"/>
+          <w:b/>
+          <w:bCs/>
+        </w:rPr>
+        <w:t>🧠</w:t>
+      </w:r>
+      <w:r>
+        <w:rPr>
+          <w:b/>
+          <w:bCs/>
+        </w:rPr>
+        <w:t xml:space="preserve"> Why it worked in old Next.js</w:t>
+      </w:r>
+    </w:p>
+    <w:p>
+      <w:r>
+        <w:rPr>
+          <w:rFonts w:ascii="Segoe UI Emoji" w:hAnsi="Segoe UI Emoji" w:cs="Segoe UI Emoji"/>
+        </w:rPr>
+        <w:t>✔️</w:t>
+      </w:r>
+      <w:r>
+        <w:t xml:space="preserve"> Old Next.js </w:t>
+      </w:r>
+      <w:r>
+        <w:rPr>
+          <w:b/>
+          <w:bCs/>
+        </w:rPr>
+        <w:t>hid this complexity for you</w:t>
+      </w:r>
+    </w:p>
+    <w:p>
+      <w:r>
+        <w:pict w14:anchorId="787AE54F">
+          <v:rect id="_x0000_i1279" style="width:0;height:1.5pt" o:hralign="center" o:hrstd="t" o:hr="t" fillcolor="#a0a0a0" stroked="f"/>
+        </w:pict>
+      </w:r>
+    </w:p>
+    <w:p>
+      <w:pPr>
+        <w:rPr>
+          <w:b/>
+          <w:bCs/>
+        </w:rPr>
+      </w:pPr>
+      <w:r>
+        <w:rPr>
+          <w:rFonts w:ascii="Segoe UI Emoji" w:hAnsi="Segoe UI Emoji" w:cs="Segoe UI Emoji"/>
+          <w:b/>
+          <w:bCs/>
+        </w:rPr>
+        <w:t>🔴</w:t>
+      </w:r>
+      <w:r>
+        <w:rPr>
+          <w:b/>
+          <w:bCs/>
+        </w:rPr>
+        <w:t xml:space="preserve"> In Pages Router (old Next.js)</w:t>
+      </w:r>
+    </w:p>
+    <w:p>
+      <w:r>
+        <w:t>You used:</w:t>
+      </w:r>
+    </w:p>
+    <w:p>
+      <w:proofErr w:type="gramStart"/>
+      <w:r>
+        <w:t>res.redirect</w:t>
+      </w:r>
+      <w:proofErr w:type="gramEnd"/>
+      <w:r>
+        <w:t>("/order")</w:t>
+      </w:r>
+    </w:p>
+    <w:p>
+      <w:r>
+        <w:rPr>
+          <w:rFonts w:ascii="Segoe UI Emoji" w:hAnsi="Segoe UI Emoji" w:cs="Segoe UI Emoji"/>
+        </w:rPr>
+        <w:t>👉</w:t>
+      </w:r>
+      <w:r>
+        <w:t xml:space="preserve"> It worked because:</w:t>
+      </w:r>
+    </w:p>
+    <w:p>
+      <w:pPr>
+        <w:numPr>
+          <w:ilvl w:val="0"/>
+          <w:numId w:val="8"/>
+        </w:numPr>
+      </w:pPr>
+      <w:r>
+        <w:t xml:space="preserve">Next.js/Node </w:t>
+      </w:r>
+      <w:r>
+        <w:rPr>
+          <w:b/>
+          <w:bCs/>
+        </w:rPr>
+        <w:t>automatically converted it</w:t>
+      </w:r>
+    </w:p>
+    <w:p>
+      <w:pPr>
+        <w:numPr>
+          <w:ilvl w:val="0"/>
+          <w:numId w:val="8"/>
+        </w:numPr>
+      </w:pPr>
+      <w:r>
+        <w:t>Internally used request info (</w:t>
+      </w:r>
+      <w:proofErr w:type="gramStart"/>
+      <w:r>
+        <w:t>req.headers</w:t>
+      </w:r>
+      <w:proofErr w:type="gramEnd"/>
+      <w:r>
+        <w:t>.host)</w:t>
+      </w:r>
+    </w:p>
+    <w:p>
+      <w:pPr>
+        <w:numPr>
+          <w:ilvl w:val="0"/>
+          <w:numId w:val="8"/>
+        </w:numPr>
+      </w:pPr>
+      <w:r>
+        <w:t>Built full URL for you</w:t>
+      </w:r>
+    </w:p>
+    <w:p>
+      <w:r>
+        <w:pict w14:anchorId="1DBC0668">
+          <v:rect id="_x0000_i1280" style="width:0;height:1.5pt" o:hralign="center" o:hrstd="t" o:hr="t" fillcolor="#a0a0a0" stroked="f"/>
+        </w:pict>
+      </w:r>
+    </w:p>
+    <w:p>
+      <w:pPr>
+        <w:rPr>
+          <w:b/>
+          <w:bCs/>
+        </w:rPr>
+      </w:pPr>
+      <w:r>
+        <w:rPr>
+          <w:rFonts w:ascii="Segoe UI Emoji" w:hAnsi="Segoe UI Emoji" w:cs="Segoe UI Emoji"/>
+          <w:b/>
+          <w:bCs/>
+        </w:rPr>
+        <w:t>🟢</w:t>
+      </w:r>
+      <w:r>
+        <w:rPr>
+          <w:b/>
+          <w:bCs/>
+        </w:rPr>
+        <w:t xml:space="preserve"> In modern Next.js (App Router)</w:t>
+      </w:r>
+    </w:p>
+    <w:p>
+      <w:r>
+        <w:t>You use:</w:t>
+      </w:r>
+    </w:p>
+    <w:p>
+      <w:r>
+        <w:t>return Response.redirect(...)</w:t>
+      </w:r>
+    </w:p>
+    <w:p>
+      <w:r>
+        <w:rPr>
+          <w:rFonts w:ascii="Segoe UI Emoji" w:hAnsi="Segoe UI Emoji" w:cs="Segoe UI Emoji"/>
+        </w:rPr>
+        <w:t>👉</w:t>
+      </w:r>
+      <w:r>
+        <w:t xml:space="preserve"> This is </w:t>
+      </w:r>
+      <w:r>
+        <w:rPr>
+          <w:b/>
+          <w:bCs/>
+        </w:rPr>
+        <w:t>Web Standard API (Fetch API)</w:t>
+      </w:r>
+    </w:p>
+    <w:p>
+      <w:r>
+        <w:rPr>
+          <w:rFonts w:ascii="Segoe UI Emoji" w:hAnsi="Segoe UI Emoji" w:cs="Segoe UI Emoji"/>
+        </w:rPr>
+        <w:lastRenderedPageBreak/>
+        <w:t>❗</w:t>
+      </w:r>
+      <w:r>
+        <w:t xml:space="preserve"> It does NOT assume anything</w:t>
+      </w:r>
+      <w:r>
+        <w:br/>
+      </w:r>
+      <w:r>
+        <w:rPr>
+          <w:rFonts w:ascii="Segoe UI Emoji" w:hAnsi="Segoe UI Emoji" w:cs="Segoe UI Emoji"/>
+        </w:rPr>
+        <w:t>❗</w:t>
+      </w:r>
+      <w:r>
+        <w:t xml:space="preserve"> It requires full URL strictly</w:t>
+      </w:r>
+    </w:p>
+    <w:p>
+      <w:r>
+        <w:pict w14:anchorId="514E7D40">
+          <v:rect id="_x0000_i1281" style="width:0;height:1.5pt" o:hralign="center" o:hrstd="t" o:hr="t" fillcolor="#a0a0a0" stroked="f"/>
+        </w:pict>
+      </w:r>
+    </w:p>
+    <w:p>
+      <w:pPr>
+        <w:rPr>
+          <w:b/>
+          <w:bCs/>
+        </w:rPr>
+      </w:pPr>
+      <w:r>
+        <w:rPr>
+          <w:rFonts w:ascii="Segoe UI Emoji" w:hAnsi="Segoe UI Emoji" w:cs="Segoe UI Emoji"/>
+          <w:b/>
+          <w:bCs/>
+        </w:rPr>
+        <w:t>🔥</w:t>
+      </w:r>
+      <w:r>
+        <w:rPr>
+          <w:b/>
+          <w:bCs/>
+        </w:rPr>
+        <w:t xml:space="preserve"> Key difference</w:t>
+      </w:r>
+    </w:p>
+    <w:tbl>
+      <w:tblPr>
+        <w:tblW w:w="0" w:type="auto"/>
+        <w:tblCellSpacing w:w="15" w:type="dxa"/>
+        <w:tblCellMar>
+          <w:top w:w="15" w:type="dxa"/>
+          <w:left w:w="15" w:type="dxa"/>
+          <w:bottom w:w="15" w:type="dxa"/>
+          <w:right w:w="15" w:type="dxa"/>
+        </w:tblCellMar>
+        <w:tblLook w:val="04A0" w:firstRow="1" w:lastRow="0" w:firstColumn="1" w:lastColumn="0" w:noHBand="0" w:noVBand="1"/>
+      </w:tblPr>
+      <w:tblGrid>
+        <w:gridCol w:w="1942"/>
+        <w:gridCol w:w="2526"/>
+      </w:tblGrid>
+      <w:tr>
+        <w:trPr>
+          <w:tblHeader/>
+          <w:tblCellSpacing w:w="15" w:type="dxa"/>
+        </w:trPr>
+        <w:tc>
+          <w:tcPr>
+            <w:tcW w:w="0" w:type="auto"/>
+            <w:vAlign w:val="center"/>
+            <w:hideMark/>
+          </w:tcPr>
+          <w:p>
+            <w:pPr>
+              <w:rPr>
+                <w:b/>
+                <w:bCs/>
+              </w:rPr>
+            </w:pPr>
+            <w:r>
+              <w:rPr>
+                <w:b/>
+                <w:bCs/>
+              </w:rPr>
+              <w:t>Old Next.js</w:t>
+            </w:r>
+          </w:p>
+        </w:tc>
+        <w:tc>
+          <w:tcPr>
+            <w:tcW w:w="0" w:type="auto"/>
+            <w:vAlign w:val="center"/>
+            <w:hideMark/>
+          </w:tcPr>
+          <w:p>
+            <w:pPr>
+              <w:rPr>
+                <w:b/>
+                <w:bCs/>
+              </w:rPr>
+            </w:pPr>
+            <w:r>
+              <w:rPr>
+                <w:b/>
+                <w:bCs/>
+              </w:rPr>
+              <w:t>New Next.js</w:t>
+            </w:r>
+          </w:p>
+        </w:tc>
+      </w:tr>
+      <w:tr>
+        <w:trPr>
+          <w:tblCellSpacing w:w="15" w:type="dxa"/>
+        </w:trPr>
+        <w:tc>
+          <w:tcPr>
+            <w:tcW w:w="0" w:type="auto"/>
+            <w:vAlign w:val="center"/>
+            <w:hideMark/>
+          </w:tcPr>
+          <w:p>
+            <w:r>
+              <w:t>Node-based helper</w:t>
+            </w:r>
+          </w:p>
+        </w:tc>
+        <w:tc>
+          <w:tcPr>
+            <w:tcW w:w="0" w:type="auto"/>
+            <w:vAlign w:val="center"/>
+            <w:hideMark/>
+          </w:tcPr>
+          <w:p>
+            <w:r>
+              <w:t>Web standard API</w:t>
+            </w:r>
+          </w:p>
+        </w:tc>
+      </w:tr>
+      <w:tr>
+        <w:trPr>
+          <w:tblCellSpacing w:w="15" w:type="dxa"/>
+        </w:trPr>
+        <w:tc>
+          <w:tcPr>
+            <w:tcW w:w="0" w:type="auto"/>
+            <w:vAlign w:val="center"/>
+            <w:hideMark/>
+          </w:tcPr>
+          <w:p>
+            <w:r>
+              <w:t>Auto handled URL</w:t>
+            </w:r>
+          </w:p>
+        </w:tc>
+        <w:tc>
+          <w:tcPr>
+            <w:tcW w:w="0" w:type="auto"/>
+            <w:vAlign w:val="center"/>
+            <w:hideMark/>
+          </w:tcPr>
+          <w:p>
+            <w:r>
+              <w:t>You must provide full URL</w:t>
+            </w:r>
+          </w:p>
+        </w:tc>
+      </w:tr>
+      <w:tr>
+        <w:trPr>
+          <w:tblCellSpacing w:w="15" w:type="dxa"/>
+        </w:trPr>
+        <w:tc>
+          <w:tcPr>
+            <w:tcW w:w="0" w:type="auto"/>
+            <w:vAlign w:val="center"/>
+            <w:hideMark/>
+          </w:tcPr>
+          <w:p>
+            <w:proofErr w:type="gramStart"/>
+            <w:r>
+              <w:t>res.redirect</w:t>
+            </w:r>
+            <w:proofErr w:type="gramEnd"/>
+            <w:r>
+              <w:t xml:space="preserve">("/x") </w:t>
+            </w:r>
+            <w:r>
+              <w:rPr>
+                <w:rFonts w:ascii="Segoe UI Emoji" w:hAnsi="Segoe UI Emoji" w:cs="Segoe UI Emoji"/>
+              </w:rPr>
+              <w:t>✔️</w:t>
+            </w:r>
+          </w:p>
+        </w:tc>
+        <w:tc>
+          <w:tcPr>
+            <w:tcW w:w="0" w:type="auto"/>
+            <w:vAlign w:val="center"/>
+            <w:hideMark/>
+          </w:tcPr>
+          <w:p>
+            <w:r>
+              <w:t xml:space="preserve">Response.redirect("/x") </w:t>
+            </w:r>
+            <w:r>
+              <w:rPr>
+                <w:rFonts w:ascii="Segoe UI Emoji" w:hAnsi="Segoe UI Emoji" w:cs="Segoe UI Emoji"/>
+              </w:rPr>
+              <w:t>❌</w:t>
+            </w:r>
+          </w:p>
+        </w:tc>
+      </w:tr>
+    </w:tbl>
+    <w:p>
+      <w:r>
+        <w:pict w14:anchorId="4B27E64D">
+          <v:rect id="_x0000_i1282" style="width:0;height:1.5pt" o:hralign="center" o:hrstd="t" o:hr="t" fillcolor="#a0a0a0" stroked="f"/>
+        </w:pict>
+      </w:r>
+    </w:p>
+    <w:p>
+      <w:pPr>
+        <w:rPr>
+          <w:b/>
+          <w:bCs/>
+        </w:rPr>
+      </w:pPr>
+      <w:r>
+        <w:rPr>
+          <w:rFonts w:ascii="Segoe UI Emoji" w:hAnsi="Segoe UI Emoji" w:cs="Segoe UI Emoji"/>
+          <w:b/>
+          <w:bCs/>
+        </w:rPr>
+        <w:t>🎯</w:t>
+      </w:r>
+      <w:r>
+        <w:rPr>
+          <w:b/>
+          <w:bCs/>
+        </w:rPr>
+        <w:t xml:space="preserve"> Why change happened</w:t>
+      </w:r>
+    </w:p>
+    <w:p>
+      <w:r>
+        <w:rPr>
+          <w:rFonts w:ascii="Segoe UI Emoji" w:hAnsi="Segoe UI Emoji" w:cs="Segoe UI Emoji"/>
+        </w:rPr>
+        <w:t>✔️</w:t>
+      </w:r>
+      <w:r>
+        <w:t xml:space="preserve"> To support:</w:t>
+      </w:r>
+    </w:p>
+    <w:p>
+      <w:pPr>
+        <w:numPr>
+          <w:ilvl w:val="0"/>
+          <w:numId w:val="9"/>
+        </w:numPr>
+      </w:pPr>
+      <w:r>
+        <w:t>Edge runtime</w:t>
+      </w:r>
+    </w:p>
+    <w:p>
+      <w:pPr>
+        <w:numPr>
+          <w:ilvl w:val="0"/>
+          <w:numId w:val="9"/>
+        </w:numPr>
+      </w:pPr>
+      <w:r>
+        <w:t>Web standards</w:t>
+      </w:r>
+    </w:p>
+    <w:p>
+      <w:pPr>
+        <w:numPr>
+          <w:ilvl w:val="0"/>
+          <w:numId w:val="9"/>
+        </w:numPr>
+      </w:pPr>
+      <w:r>
+        <w:t>platform independence</w:t>
+      </w:r>
+    </w:p>
+    <w:p>
+      <w:r>
+        <w:pict w14:anchorId="54BB00F2">
+          <v:rect id="_x0000_i1283" style="width:0;height:1.5pt" o:hralign="center" o:hrstd="t" o:hr="t" fillcolor="#a0a0a0" stroked="f"/>
+        </w:pict>
+      </w:r>
+    </w:p>
+    <w:p>
+      <w:pPr>
+        <w:rPr>
+          <w:b/>
+          <w:bCs/>
+        </w:rPr>
+      </w:pPr>
+      <w:r>
+        <w:rPr>
+          <w:rFonts w:ascii="Segoe UI Emoji" w:hAnsi="Segoe UI Emoji" w:cs="Segoe UI Emoji"/>
+          <w:b/>
+          <w:bCs/>
+        </w:rPr>
+        <w:t>🚀</w:t>
+      </w:r>
+      <w:r>
+        <w:rPr>
+          <w:b/>
+          <w:bCs/>
+        </w:rPr>
+        <w:t xml:space="preserve"> One-line answer</w:t>
+      </w:r>
+    </w:p>
+    <w:p>
+      <w:pPr>
+        <w:pBdr>
+          <w:bottom w:val="single" w:sz="12" w:space="1" w:color="auto"/>
+        </w:pBdr>
+      </w:pPr>
+      <w:r>
+        <w:t xml:space="preserve">In old Next.js, </w:t>
+      </w:r>
+      <w:proofErr w:type="gramStart"/>
+      <w:r>
+        <w:t>res.redirect</w:t>
+      </w:r>
+      <w:proofErr w:type="gramEnd"/>
+      <w:r>
+        <w:t xml:space="preserve"> auto-built the full URL, but modern Next.js uses standard Response.redirect, which requires a full URL.</w:t>
+      </w:r>
+    </w:p>
+    <w:p>
+      <w:pPr>
+        <w:rPr>
+          <w:b/>
+          <w:bCs/>
+          <w:color w:val="EE0000"/>
+          <w:lang w:val="en-US"/>
+        </w:rPr>
+      </w:pPr>
+      <w:r>
+        <w:rPr>
+          <w:b/>
+          <w:bCs/>
+          <w:color w:val="EE0000"/>
+          <w:lang w:val="en-US"/>
+        </w:rPr>
+        <w:t>There is another property in the body of callb</w:t>
+      </w:r>
+      <w:r>
+        <w:rPr>
+          <w:b/>
+          <w:bCs/>
+          <w:color w:val="EE0000"/>
+          <w:lang w:val="en-US"/>
+        </w:rPr>
+        <w:t>a</w:t>
+      </w:r>
+      <w:r>
+        <w:rPr>
+          <w:b/>
+          <w:bCs/>
+          <w:color w:val="EE0000"/>
+          <w:lang w:val="en-US"/>
+        </w:rPr>
+        <w:t xml:space="preserve">ck url that is </w:t>
+      </w:r>
+      <w:r>
+        <w:rPr>
+          <w:b/>
+          <w:bCs/>
+          <w:color w:val="EE0000"/>
+          <w:lang w:val="en-US"/>
+        </w:rPr>
+        <w:t>S</w:t>
+      </w:r>
+      <w:r>
+        <w:rPr>
+          <w:b/>
+          <w:bCs/>
+          <w:color w:val="EE0000"/>
+          <w:lang w:val="en-US"/>
+        </w:rPr>
+        <w:t xml:space="preserve">TATUS and if the transaction was successful then its value </w:t>
+      </w:r>
+      <w:r>
+        <w:rPr>
+          <w:b/>
+          <w:bCs/>
+          <w:color w:val="EE0000"/>
+          <w:lang w:val="en-US"/>
+        </w:rPr>
+        <w:t>will be TXN_SUCCESS</w:t>
+      </w:r>
+      <w:r>
+        <w:rPr>
+          <w:b/>
+          <w:bCs/>
+          <w:color w:val="EE0000"/>
+          <w:lang w:val="en-US"/>
+        </w:rPr>
+        <w:t>.</w:t>
+      </w:r>
+    </w:p>
+    <w:p>
+      <w:pPr>
+        <w:rPr>
+          <w:lang w:val="en-US"/>
+        </w:rPr>
+      </w:pPr>
+      <w:r>
+        <w:rPr>
+          <w:lang w:val="en-US"/>
+        </w:rPr>
+        <w:t xml:space="preserve">We can use order id </w:t>
+      </w:r>
+      <w:r>
+        <w:rPr>
+          <w:lang w:val="en-US"/>
+        </w:rPr>
+        <w:t>and transaction d to identify an order so that one cannot track any order by just any ran</w:t>
+      </w:r>
+      <w:r>
+        <w:rPr>
+          <w:lang w:val="en-US"/>
+        </w:rPr>
+        <w:t>d</w:t>
+      </w:r>
+      <w:r>
+        <w:rPr>
+          <w:lang w:val="en-US"/>
+        </w:rPr>
+        <w:t xml:space="preserve">om </w:t>
+      </w:r>
+      <w:proofErr w:type="gramStart"/>
+      <w:r>
+        <w:rPr>
+          <w:lang w:val="en-US"/>
+        </w:rPr>
+        <w:t>number.</w:t>
+      </w:r>
+      <w:r>
+        <w:rPr>
+          <w:lang w:val="en-US"/>
+        </w:rPr>
+        <w:t>(</w:t>
+      </w:r>
+      <w:proofErr w:type="gramEnd"/>
+      <w:r>
+        <w:rPr>
+          <w:lang w:val="en-US"/>
+        </w:rPr>
+        <w:t xml:space="preserve">maybe by guess by which </w:t>
+      </w:r>
+      <w:r>
+        <w:rPr>
+          <w:lang w:val="en-US"/>
+        </w:rPr>
+        <w:t xml:space="preserve">user information may get </w:t>
+      </w:r>
+      <w:r>
+        <w:rPr>
+          <w:lang w:val="en-US"/>
+        </w:rPr>
+        <w:t>exposed</w:t>
+      </w:r>
+      <w:r>
+        <w:rPr>
+          <w:lang w:val="en-US"/>
+        </w:rPr>
+        <w:t xml:space="preserve"> by the </w:t>
+      </w:r>
+      <w:proofErr w:type="gramStart"/>
+      <w:r>
+        <w:rPr>
+          <w:lang w:val="en-US"/>
+        </w:rPr>
+        <w:t>hacker(</w:t>
+      </w:r>
+      <w:proofErr w:type="gramEnd"/>
+      <w:r>
+        <w:rPr>
+          <w:lang w:val="en-US"/>
+        </w:rPr>
+        <w:t>who knows)</w:t>
+      </w:r>
+      <w:r>
+        <w:rPr>
+          <w:lang w:val="en-US"/>
+        </w:rPr>
+        <w:t>)</w:t>
       </w:r>
     </w:p>
     <w:p>
@@ -276,6 +3228,1379 @@
     </w:sectPr>
   </w:body>
 </w:document>
+</file>
+
+<file path=word/numbering.xml><?xml version="1.0" encoding="utf-8"?>
+<w:numbering xmlns:wpc="http://schemas.microsoft.com/office/word/2010/wordprocessingCanvas" xmlns:cx="http://schemas.microsoft.com/office/drawing/2014/chartex" xmlns:cx1="http://schemas.microsoft.com/office/drawing/2015/9/8/chartex" xmlns:cx2="http://schemas.microsoft.com/office/drawing/2015/10/21/chartex" xmlns:cx3="http://schemas.microsoft.com/office/drawing/2016/5/9/chartex" xmlns:cx4="http://schemas.microsoft.com/office/drawing/2016/5/10/chartex" xmlns:cx5="http://schemas.microsoft.com/office/drawing/2016/5/11/chartex" xmlns:cx6="http://schemas.microsoft.com/office/drawing/2016/5/12/chartex" xmlns:cx7="http://schemas.microsoft.com/office/drawing/2016/5/13/chartex" xmlns:cx8="http://schemas.microsoft.com/office/drawing/2016/5/14/chartex" xmlns:mc="http://schemas.openxmlformats.org/markup-compatibility/2006" xmlns:aink="http://schemas.microsoft.com/office/drawing/2016/ink" xmlns:am3d="http://schemas.microsoft.com/office/drawing/2017/model3d" xmlns:o="urn:schemas-microsoft-com:office:office" xmlns:oel="http://schemas.microsoft.com/office/2019/extlst" xmlns:r="http://schemas.openxmlformats.org/officeDocument/2006/relationships" xmlns:m="http://schemas.openxmlformats.org/officeDocument/2006/math" xmlns:v="urn:schemas-microsoft-com:vml" xmlns:wp14="http://schemas.microsoft.com/office/word/2010/wordprocessingDrawing" xmlns:wp="http://schemas.openxmlformats.org/drawingml/2006/wordprocessingDrawing" xmlns:w10="urn:schemas-microsoft-com:office:word" xmlns:w="http://schemas.openxmlformats.org/wordprocessingml/2006/main" xmlns:w14="http://schemas.microsoft.com/office/word/2010/wordml" xmlns:w15="http://schemas.microsoft.com/office/word/2012/wordml" xmlns:w16cex="http://schemas.microsoft.com/office/word/2018/wordml/cex" xmlns:w16cid="http://schemas.microsoft.com/office/word/2016/wordml/cid" xmlns:w16="http://schemas.microsoft.com/office/word/2018/wordml" xmlns:w16du="http://schemas.microsoft.com/office/word/2023/wordml/word16du" xmlns:w16sdtdh="http://schemas.microsoft.com/office/word/2020/wordml/sdtdatahash" xmlns:w16sdtfl="http://schemas.microsoft.com/office/word/2024/wordml/sdtformatlock" xmlns:w16se="http://schemas.microsoft.com/office/word/2015/wordml/symex" xmlns:wpg="http://schemas.microsoft.com/office/word/2010/wordprocessingGroup" xmlns:wpi="http://schemas.microsoft.com/office/word/2010/wordprocessingInk" xmlns:wne="http://schemas.microsoft.com/office/word/2006/wordml" xmlns:wps="http://schemas.microsoft.com/office/word/2010/wordprocessingShape" mc:Ignorable="w14 w15 w16se w16cid w16 w16cex w16sdtdh w16sdtfl w16du wp14">
+  <w:abstractNum w:abstractNumId="0" w15:restartNumberingAfterBreak="0">
+    <w:nsid w:val="12562D16"/>
+    <w:multiLevelType w:val="multilevel"/>
+    <w:tmpl w:val="C486EBF8"/>
+    <w:lvl w:ilvl="0">
+      <w:start w:val="1"/>
+      <w:numFmt w:val="bullet"/>
+      <w:lvlText w:val=""/>
+      <w:lvlJc w:val="left"/>
+      <w:pPr>
+        <w:tabs>
+          <w:tab w:val="num" w:pos="720"/>
+        </w:tabs>
+        <w:ind w:left="720" w:hanging="360"/>
+      </w:pPr>
+      <w:rPr>
+        <w:rFonts w:ascii="Symbol" w:hAnsi="Symbol" w:hint="default"/>
+        <w:sz w:val="20"/>
+      </w:rPr>
+    </w:lvl>
+    <w:lvl w:ilvl="1" w:tentative="1">
+      <w:start w:val="1"/>
+      <w:numFmt w:val="bullet"/>
+      <w:lvlText w:val="o"/>
+      <w:lvlJc w:val="left"/>
+      <w:pPr>
+        <w:tabs>
+          <w:tab w:val="num" w:pos="1440"/>
+        </w:tabs>
+        <w:ind w:left="1440" w:hanging="360"/>
+      </w:pPr>
+      <w:rPr>
+        <w:rFonts w:ascii="Courier New" w:hAnsi="Courier New" w:hint="default"/>
+        <w:sz w:val="20"/>
+      </w:rPr>
+    </w:lvl>
+    <w:lvl w:ilvl="2" w:tentative="1">
+      <w:start w:val="1"/>
+      <w:numFmt w:val="bullet"/>
+      <w:lvlText w:val=""/>
+      <w:lvlJc w:val="left"/>
+      <w:pPr>
+        <w:tabs>
+          <w:tab w:val="num" w:pos="2160"/>
+        </w:tabs>
+        <w:ind w:left="2160" w:hanging="360"/>
+      </w:pPr>
+      <w:rPr>
+        <w:rFonts w:ascii="Wingdings" w:hAnsi="Wingdings" w:hint="default"/>
+        <w:sz w:val="20"/>
+      </w:rPr>
+    </w:lvl>
+    <w:lvl w:ilvl="3" w:tentative="1">
+      <w:start w:val="1"/>
+      <w:numFmt w:val="bullet"/>
+      <w:lvlText w:val=""/>
+      <w:lvlJc w:val="left"/>
+      <w:pPr>
+        <w:tabs>
+          <w:tab w:val="num" w:pos="2880"/>
+        </w:tabs>
+        <w:ind w:left="2880" w:hanging="360"/>
+      </w:pPr>
+      <w:rPr>
+        <w:rFonts w:ascii="Wingdings" w:hAnsi="Wingdings" w:hint="default"/>
+        <w:sz w:val="20"/>
+      </w:rPr>
+    </w:lvl>
+    <w:lvl w:ilvl="4" w:tentative="1">
+      <w:start w:val="1"/>
+      <w:numFmt w:val="bullet"/>
+      <w:lvlText w:val=""/>
+      <w:lvlJc w:val="left"/>
+      <w:pPr>
+        <w:tabs>
+          <w:tab w:val="num" w:pos="3600"/>
+        </w:tabs>
+        <w:ind w:left="3600" w:hanging="360"/>
+      </w:pPr>
+      <w:rPr>
+        <w:rFonts w:ascii="Wingdings" w:hAnsi="Wingdings" w:hint="default"/>
+        <w:sz w:val="20"/>
+      </w:rPr>
+    </w:lvl>
+    <w:lvl w:ilvl="5" w:tentative="1">
+      <w:start w:val="1"/>
+      <w:numFmt w:val="bullet"/>
+      <w:lvlText w:val=""/>
+      <w:lvlJc w:val="left"/>
+      <w:pPr>
+        <w:tabs>
+          <w:tab w:val="num" w:pos="4320"/>
+        </w:tabs>
+        <w:ind w:left="4320" w:hanging="360"/>
+      </w:pPr>
+      <w:rPr>
+        <w:rFonts w:ascii="Wingdings" w:hAnsi="Wingdings" w:hint="default"/>
+        <w:sz w:val="20"/>
+      </w:rPr>
+    </w:lvl>
+    <w:lvl w:ilvl="6" w:tentative="1">
+      <w:start w:val="1"/>
+      <w:numFmt w:val="bullet"/>
+      <w:lvlText w:val=""/>
+      <w:lvlJc w:val="left"/>
+      <w:pPr>
+        <w:tabs>
+          <w:tab w:val="num" w:pos="5040"/>
+        </w:tabs>
+        <w:ind w:left="5040" w:hanging="360"/>
+      </w:pPr>
+      <w:rPr>
+        <w:rFonts w:ascii="Wingdings" w:hAnsi="Wingdings" w:hint="default"/>
+        <w:sz w:val="20"/>
+      </w:rPr>
+    </w:lvl>
+    <w:lvl w:ilvl="7" w:tentative="1">
+      <w:start w:val="1"/>
+      <w:numFmt w:val="bullet"/>
+      <w:lvlText w:val=""/>
+      <w:lvlJc w:val="left"/>
+      <w:pPr>
+        <w:tabs>
+          <w:tab w:val="num" w:pos="5760"/>
+        </w:tabs>
+        <w:ind w:left="5760" w:hanging="360"/>
+      </w:pPr>
+      <w:rPr>
+        <w:rFonts w:ascii="Wingdings" w:hAnsi="Wingdings" w:hint="default"/>
+        <w:sz w:val="20"/>
+      </w:rPr>
+    </w:lvl>
+    <w:lvl w:ilvl="8" w:tentative="1">
+      <w:start w:val="1"/>
+      <w:numFmt w:val="bullet"/>
+      <w:lvlText w:val=""/>
+      <w:lvlJc w:val="left"/>
+      <w:pPr>
+        <w:tabs>
+          <w:tab w:val="num" w:pos="6480"/>
+        </w:tabs>
+        <w:ind w:left="6480" w:hanging="360"/>
+      </w:pPr>
+      <w:rPr>
+        <w:rFonts w:ascii="Wingdings" w:hAnsi="Wingdings" w:hint="default"/>
+        <w:sz w:val="20"/>
+      </w:rPr>
+    </w:lvl>
+  </w:abstractNum>
+  <w:abstractNum w:abstractNumId="1" w15:restartNumberingAfterBreak="0">
+    <w:nsid w:val="151C097E"/>
+    <w:multiLevelType w:val="multilevel"/>
+    <w:tmpl w:val="A6323EAA"/>
+    <w:lvl w:ilvl="0">
+      <w:start w:val="1"/>
+      <w:numFmt w:val="bullet"/>
+      <w:lvlText w:val=""/>
+      <w:lvlJc w:val="left"/>
+      <w:pPr>
+        <w:tabs>
+          <w:tab w:val="num" w:pos="720"/>
+        </w:tabs>
+        <w:ind w:left="720" w:hanging="360"/>
+      </w:pPr>
+      <w:rPr>
+        <w:rFonts w:ascii="Symbol" w:hAnsi="Symbol" w:hint="default"/>
+        <w:sz w:val="20"/>
+      </w:rPr>
+    </w:lvl>
+    <w:lvl w:ilvl="1" w:tentative="1">
+      <w:start w:val="1"/>
+      <w:numFmt w:val="bullet"/>
+      <w:lvlText w:val="o"/>
+      <w:lvlJc w:val="left"/>
+      <w:pPr>
+        <w:tabs>
+          <w:tab w:val="num" w:pos="1440"/>
+        </w:tabs>
+        <w:ind w:left="1440" w:hanging="360"/>
+      </w:pPr>
+      <w:rPr>
+        <w:rFonts w:ascii="Courier New" w:hAnsi="Courier New" w:hint="default"/>
+        <w:sz w:val="20"/>
+      </w:rPr>
+    </w:lvl>
+    <w:lvl w:ilvl="2" w:tentative="1">
+      <w:start w:val="1"/>
+      <w:numFmt w:val="bullet"/>
+      <w:lvlText w:val=""/>
+      <w:lvlJc w:val="left"/>
+      <w:pPr>
+        <w:tabs>
+          <w:tab w:val="num" w:pos="2160"/>
+        </w:tabs>
+        <w:ind w:left="2160" w:hanging="360"/>
+      </w:pPr>
+      <w:rPr>
+        <w:rFonts w:ascii="Wingdings" w:hAnsi="Wingdings" w:hint="default"/>
+        <w:sz w:val="20"/>
+      </w:rPr>
+    </w:lvl>
+    <w:lvl w:ilvl="3" w:tentative="1">
+      <w:start w:val="1"/>
+      <w:numFmt w:val="bullet"/>
+      <w:lvlText w:val=""/>
+      <w:lvlJc w:val="left"/>
+      <w:pPr>
+        <w:tabs>
+          <w:tab w:val="num" w:pos="2880"/>
+        </w:tabs>
+        <w:ind w:left="2880" w:hanging="360"/>
+      </w:pPr>
+      <w:rPr>
+        <w:rFonts w:ascii="Wingdings" w:hAnsi="Wingdings" w:hint="default"/>
+        <w:sz w:val="20"/>
+      </w:rPr>
+    </w:lvl>
+    <w:lvl w:ilvl="4" w:tentative="1">
+      <w:start w:val="1"/>
+      <w:numFmt w:val="bullet"/>
+      <w:lvlText w:val=""/>
+      <w:lvlJc w:val="left"/>
+      <w:pPr>
+        <w:tabs>
+          <w:tab w:val="num" w:pos="3600"/>
+        </w:tabs>
+        <w:ind w:left="3600" w:hanging="360"/>
+      </w:pPr>
+      <w:rPr>
+        <w:rFonts w:ascii="Wingdings" w:hAnsi="Wingdings" w:hint="default"/>
+        <w:sz w:val="20"/>
+      </w:rPr>
+    </w:lvl>
+    <w:lvl w:ilvl="5" w:tentative="1">
+      <w:start w:val="1"/>
+      <w:numFmt w:val="bullet"/>
+      <w:lvlText w:val=""/>
+      <w:lvlJc w:val="left"/>
+      <w:pPr>
+        <w:tabs>
+          <w:tab w:val="num" w:pos="4320"/>
+        </w:tabs>
+        <w:ind w:left="4320" w:hanging="360"/>
+      </w:pPr>
+      <w:rPr>
+        <w:rFonts w:ascii="Wingdings" w:hAnsi="Wingdings" w:hint="default"/>
+        <w:sz w:val="20"/>
+      </w:rPr>
+    </w:lvl>
+    <w:lvl w:ilvl="6" w:tentative="1">
+      <w:start w:val="1"/>
+      <w:numFmt w:val="bullet"/>
+      <w:lvlText w:val=""/>
+      <w:lvlJc w:val="left"/>
+      <w:pPr>
+        <w:tabs>
+          <w:tab w:val="num" w:pos="5040"/>
+        </w:tabs>
+        <w:ind w:left="5040" w:hanging="360"/>
+      </w:pPr>
+      <w:rPr>
+        <w:rFonts w:ascii="Wingdings" w:hAnsi="Wingdings" w:hint="default"/>
+        <w:sz w:val="20"/>
+      </w:rPr>
+    </w:lvl>
+    <w:lvl w:ilvl="7" w:tentative="1">
+      <w:start w:val="1"/>
+      <w:numFmt w:val="bullet"/>
+      <w:lvlText w:val=""/>
+      <w:lvlJc w:val="left"/>
+      <w:pPr>
+        <w:tabs>
+          <w:tab w:val="num" w:pos="5760"/>
+        </w:tabs>
+        <w:ind w:left="5760" w:hanging="360"/>
+      </w:pPr>
+      <w:rPr>
+        <w:rFonts w:ascii="Wingdings" w:hAnsi="Wingdings" w:hint="default"/>
+        <w:sz w:val="20"/>
+      </w:rPr>
+    </w:lvl>
+    <w:lvl w:ilvl="8" w:tentative="1">
+      <w:start w:val="1"/>
+      <w:numFmt w:val="bullet"/>
+      <w:lvlText w:val=""/>
+      <w:lvlJc w:val="left"/>
+      <w:pPr>
+        <w:tabs>
+          <w:tab w:val="num" w:pos="6480"/>
+        </w:tabs>
+        <w:ind w:left="6480" w:hanging="360"/>
+      </w:pPr>
+      <w:rPr>
+        <w:rFonts w:ascii="Wingdings" w:hAnsi="Wingdings" w:hint="default"/>
+        <w:sz w:val="20"/>
+      </w:rPr>
+    </w:lvl>
+  </w:abstractNum>
+  <w:abstractNum w:abstractNumId="2" w15:restartNumberingAfterBreak="0">
+    <w:nsid w:val="1CE83152"/>
+    <w:multiLevelType w:val="multilevel"/>
+    <w:tmpl w:val="93A6B55A"/>
+    <w:lvl w:ilvl="0">
+      <w:start w:val="1"/>
+      <w:numFmt w:val="bullet"/>
+      <w:lvlText w:val=""/>
+      <w:lvlJc w:val="left"/>
+      <w:pPr>
+        <w:tabs>
+          <w:tab w:val="num" w:pos="720"/>
+        </w:tabs>
+        <w:ind w:left="720" w:hanging="360"/>
+      </w:pPr>
+      <w:rPr>
+        <w:rFonts w:ascii="Symbol" w:hAnsi="Symbol" w:hint="default"/>
+        <w:sz w:val="20"/>
+      </w:rPr>
+    </w:lvl>
+    <w:lvl w:ilvl="1" w:tentative="1">
+      <w:start w:val="1"/>
+      <w:numFmt w:val="bullet"/>
+      <w:lvlText w:val="o"/>
+      <w:lvlJc w:val="left"/>
+      <w:pPr>
+        <w:tabs>
+          <w:tab w:val="num" w:pos="1440"/>
+        </w:tabs>
+        <w:ind w:left="1440" w:hanging="360"/>
+      </w:pPr>
+      <w:rPr>
+        <w:rFonts w:ascii="Courier New" w:hAnsi="Courier New" w:hint="default"/>
+        <w:sz w:val="20"/>
+      </w:rPr>
+    </w:lvl>
+    <w:lvl w:ilvl="2" w:tentative="1">
+      <w:start w:val="1"/>
+      <w:numFmt w:val="bullet"/>
+      <w:lvlText w:val=""/>
+      <w:lvlJc w:val="left"/>
+      <w:pPr>
+        <w:tabs>
+          <w:tab w:val="num" w:pos="2160"/>
+        </w:tabs>
+        <w:ind w:left="2160" w:hanging="360"/>
+      </w:pPr>
+      <w:rPr>
+        <w:rFonts w:ascii="Wingdings" w:hAnsi="Wingdings" w:hint="default"/>
+        <w:sz w:val="20"/>
+      </w:rPr>
+    </w:lvl>
+    <w:lvl w:ilvl="3" w:tentative="1">
+      <w:start w:val="1"/>
+      <w:numFmt w:val="bullet"/>
+      <w:lvlText w:val=""/>
+      <w:lvlJc w:val="left"/>
+      <w:pPr>
+        <w:tabs>
+          <w:tab w:val="num" w:pos="2880"/>
+        </w:tabs>
+        <w:ind w:left="2880" w:hanging="360"/>
+      </w:pPr>
+      <w:rPr>
+        <w:rFonts w:ascii="Wingdings" w:hAnsi="Wingdings" w:hint="default"/>
+        <w:sz w:val="20"/>
+      </w:rPr>
+    </w:lvl>
+    <w:lvl w:ilvl="4" w:tentative="1">
+      <w:start w:val="1"/>
+      <w:numFmt w:val="bullet"/>
+      <w:lvlText w:val=""/>
+      <w:lvlJc w:val="left"/>
+      <w:pPr>
+        <w:tabs>
+          <w:tab w:val="num" w:pos="3600"/>
+        </w:tabs>
+        <w:ind w:left="3600" w:hanging="360"/>
+      </w:pPr>
+      <w:rPr>
+        <w:rFonts w:ascii="Wingdings" w:hAnsi="Wingdings" w:hint="default"/>
+        <w:sz w:val="20"/>
+      </w:rPr>
+    </w:lvl>
+    <w:lvl w:ilvl="5" w:tentative="1">
+      <w:start w:val="1"/>
+      <w:numFmt w:val="bullet"/>
+      <w:lvlText w:val=""/>
+      <w:lvlJc w:val="left"/>
+      <w:pPr>
+        <w:tabs>
+          <w:tab w:val="num" w:pos="4320"/>
+        </w:tabs>
+        <w:ind w:left="4320" w:hanging="360"/>
+      </w:pPr>
+      <w:rPr>
+        <w:rFonts w:ascii="Wingdings" w:hAnsi="Wingdings" w:hint="default"/>
+        <w:sz w:val="20"/>
+      </w:rPr>
+    </w:lvl>
+    <w:lvl w:ilvl="6" w:tentative="1">
+      <w:start w:val="1"/>
+      <w:numFmt w:val="bullet"/>
+      <w:lvlText w:val=""/>
+      <w:lvlJc w:val="left"/>
+      <w:pPr>
+        <w:tabs>
+          <w:tab w:val="num" w:pos="5040"/>
+        </w:tabs>
+        <w:ind w:left="5040" w:hanging="360"/>
+      </w:pPr>
+      <w:rPr>
+        <w:rFonts w:ascii="Wingdings" w:hAnsi="Wingdings" w:hint="default"/>
+        <w:sz w:val="20"/>
+      </w:rPr>
+    </w:lvl>
+    <w:lvl w:ilvl="7" w:tentative="1">
+      <w:start w:val="1"/>
+      <w:numFmt w:val="bullet"/>
+      <w:lvlText w:val=""/>
+      <w:lvlJc w:val="left"/>
+      <w:pPr>
+        <w:tabs>
+          <w:tab w:val="num" w:pos="5760"/>
+        </w:tabs>
+        <w:ind w:left="5760" w:hanging="360"/>
+      </w:pPr>
+      <w:rPr>
+        <w:rFonts w:ascii="Wingdings" w:hAnsi="Wingdings" w:hint="default"/>
+        <w:sz w:val="20"/>
+      </w:rPr>
+    </w:lvl>
+    <w:lvl w:ilvl="8" w:tentative="1">
+      <w:start w:val="1"/>
+      <w:numFmt w:val="bullet"/>
+      <w:lvlText w:val=""/>
+      <w:lvlJc w:val="left"/>
+      <w:pPr>
+        <w:tabs>
+          <w:tab w:val="num" w:pos="6480"/>
+        </w:tabs>
+        <w:ind w:left="6480" w:hanging="360"/>
+      </w:pPr>
+      <w:rPr>
+        <w:rFonts w:ascii="Wingdings" w:hAnsi="Wingdings" w:hint="default"/>
+        <w:sz w:val="20"/>
+      </w:rPr>
+    </w:lvl>
+  </w:abstractNum>
+  <w:abstractNum w:abstractNumId="3" w15:restartNumberingAfterBreak="0">
+    <w:nsid w:val="266656E6"/>
+    <w:multiLevelType w:val="multilevel"/>
+    <w:tmpl w:val="F604C1A0"/>
+    <w:lvl w:ilvl="0">
+      <w:start w:val="1"/>
+      <w:numFmt w:val="bullet"/>
+      <w:lvlText w:val=""/>
+      <w:lvlJc w:val="left"/>
+      <w:pPr>
+        <w:tabs>
+          <w:tab w:val="num" w:pos="720"/>
+        </w:tabs>
+        <w:ind w:left="720" w:hanging="360"/>
+      </w:pPr>
+      <w:rPr>
+        <w:rFonts w:ascii="Symbol" w:hAnsi="Symbol" w:hint="default"/>
+        <w:sz w:val="20"/>
+      </w:rPr>
+    </w:lvl>
+    <w:lvl w:ilvl="1" w:tentative="1">
+      <w:start w:val="1"/>
+      <w:numFmt w:val="bullet"/>
+      <w:lvlText w:val="o"/>
+      <w:lvlJc w:val="left"/>
+      <w:pPr>
+        <w:tabs>
+          <w:tab w:val="num" w:pos="1440"/>
+        </w:tabs>
+        <w:ind w:left="1440" w:hanging="360"/>
+      </w:pPr>
+      <w:rPr>
+        <w:rFonts w:ascii="Courier New" w:hAnsi="Courier New" w:hint="default"/>
+        <w:sz w:val="20"/>
+      </w:rPr>
+    </w:lvl>
+    <w:lvl w:ilvl="2" w:tentative="1">
+      <w:start w:val="1"/>
+      <w:numFmt w:val="bullet"/>
+      <w:lvlText w:val=""/>
+      <w:lvlJc w:val="left"/>
+      <w:pPr>
+        <w:tabs>
+          <w:tab w:val="num" w:pos="2160"/>
+        </w:tabs>
+        <w:ind w:left="2160" w:hanging="360"/>
+      </w:pPr>
+      <w:rPr>
+        <w:rFonts w:ascii="Wingdings" w:hAnsi="Wingdings" w:hint="default"/>
+        <w:sz w:val="20"/>
+      </w:rPr>
+    </w:lvl>
+    <w:lvl w:ilvl="3" w:tentative="1">
+      <w:start w:val="1"/>
+      <w:numFmt w:val="bullet"/>
+      <w:lvlText w:val=""/>
+      <w:lvlJc w:val="left"/>
+      <w:pPr>
+        <w:tabs>
+          <w:tab w:val="num" w:pos="2880"/>
+        </w:tabs>
+        <w:ind w:left="2880" w:hanging="360"/>
+      </w:pPr>
+      <w:rPr>
+        <w:rFonts w:ascii="Wingdings" w:hAnsi="Wingdings" w:hint="default"/>
+        <w:sz w:val="20"/>
+      </w:rPr>
+    </w:lvl>
+    <w:lvl w:ilvl="4" w:tentative="1">
+      <w:start w:val="1"/>
+      <w:numFmt w:val="bullet"/>
+      <w:lvlText w:val=""/>
+      <w:lvlJc w:val="left"/>
+      <w:pPr>
+        <w:tabs>
+          <w:tab w:val="num" w:pos="3600"/>
+        </w:tabs>
+        <w:ind w:left="3600" w:hanging="360"/>
+      </w:pPr>
+      <w:rPr>
+        <w:rFonts w:ascii="Wingdings" w:hAnsi="Wingdings" w:hint="default"/>
+        <w:sz w:val="20"/>
+      </w:rPr>
+    </w:lvl>
+    <w:lvl w:ilvl="5" w:tentative="1">
+      <w:start w:val="1"/>
+      <w:numFmt w:val="bullet"/>
+      <w:lvlText w:val=""/>
+      <w:lvlJc w:val="left"/>
+      <w:pPr>
+        <w:tabs>
+          <w:tab w:val="num" w:pos="4320"/>
+        </w:tabs>
+        <w:ind w:left="4320" w:hanging="360"/>
+      </w:pPr>
+      <w:rPr>
+        <w:rFonts w:ascii="Wingdings" w:hAnsi="Wingdings" w:hint="default"/>
+        <w:sz w:val="20"/>
+      </w:rPr>
+    </w:lvl>
+    <w:lvl w:ilvl="6" w:tentative="1">
+      <w:start w:val="1"/>
+      <w:numFmt w:val="bullet"/>
+      <w:lvlText w:val=""/>
+      <w:lvlJc w:val="left"/>
+      <w:pPr>
+        <w:tabs>
+          <w:tab w:val="num" w:pos="5040"/>
+        </w:tabs>
+        <w:ind w:left="5040" w:hanging="360"/>
+      </w:pPr>
+      <w:rPr>
+        <w:rFonts w:ascii="Wingdings" w:hAnsi="Wingdings" w:hint="default"/>
+        <w:sz w:val="20"/>
+      </w:rPr>
+    </w:lvl>
+    <w:lvl w:ilvl="7" w:tentative="1">
+      <w:start w:val="1"/>
+      <w:numFmt w:val="bullet"/>
+      <w:lvlText w:val=""/>
+      <w:lvlJc w:val="left"/>
+      <w:pPr>
+        <w:tabs>
+          <w:tab w:val="num" w:pos="5760"/>
+        </w:tabs>
+        <w:ind w:left="5760" w:hanging="360"/>
+      </w:pPr>
+      <w:rPr>
+        <w:rFonts w:ascii="Wingdings" w:hAnsi="Wingdings" w:hint="default"/>
+        <w:sz w:val="20"/>
+      </w:rPr>
+    </w:lvl>
+    <w:lvl w:ilvl="8" w:tentative="1">
+      <w:start w:val="1"/>
+      <w:numFmt w:val="bullet"/>
+      <w:lvlText w:val=""/>
+      <w:lvlJc w:val="left"/>
+      <w:pPr>
+        <w:tabs>
+          <w:tab w:val="num" w:pos="6480"/>
+        </w:tabs>
+        <w:ind w:left="6480" w:hanging="360"/>
+      </w:pPr>
+      <w:rPr>
+        <w:rFonts w:ascii="Wingdings" w:hAnsi="Wingdings" w:hint="default"/>
+        <w:sz w:val="20"/>
+      </w:rPr>
+    </w:lvl>
+  </w:abstractNum>
+  <w:abstractNum w:abstractNumId="4" w15:restartNumberingAfterBreak="0">
+    <w:nsid w:val="27564D58"/>
+    <w:multiLevelType w:val="multilevel"/>
+    <w:tmpl w:val="D6C4AA12"/>
+    <w:lvl w:ilvl="0">
+      <w:start w:val="1"/>
+      <w:numFmt w:val="bullet"/>
+      <w:lvlText w:val=""/>
+      <w:lvlJc w:val="left"/>
+      <w:pPr>
+        <w:tabs>
+          <w:tab w:val="num" w:pos="720"/>
+        </w:tabs>
+        <w:ind w:left="720" w:hanging="360"/>
+      </w:pPr>
+      <w:rPr>
+        <w:rFonts w:ascii="Symbol" w:hAnsi="Symbol" w:hint="default"/>
+        <w:sz w:val="20"/>
+      </w:rPr>
+    </w:lvl>
+    <w:lvl w:ilvl="1" w:tentative="1">
+      <w:start w:val="1"/>
+      <w:numFmt w:val="bullet"/>
+      <w:lvlText w:val="o"/>
+      <w:lvlJc w:val="left"/>
+      <w:pPr>
+        <w:tabs>
+          <w:tab w:val="num" w:pos="1440"/>
+        </w:tabs>
+        <w:ind w:left="1440" w:hanging="360"/>
+      </w:pPr>
+      <w:rPr>
+        <w:rFonts w:ascii="Courier New" w:hAnsi="Courier New" w:hint="default"/>
+        <w:sz w:val="20"/>
+      </w:rPr>
+    </w:lvl>
+    <w:lvl w:ilvl="2" w:tentative="1">
+      <w:start w:val="1"/>
+      <w:numFmt w:val="bullet"/>
+      <w:lvlText w:val=""/>
+      <w:lvlJc w:val="left"/>
+      <w:pPr>
+        <w:tabs>
+          <w:tab w:val="num" w:pos="2160"/>
+        </w:tabs>
+        <w:ind w:left="2160" w:hanging="360"/>
+      </w:pPr>
+      <w:rPr>
+        <w:rFonts w:ascii="Wingdings" w:hAnsi="Wingdings" w:hint="default"/>
+        <w:sz w:val="20"/>
+      </w:rPr>
+    </w:lvl>
+    <w:lvl w:ilvl="3" w:tentative="1">
+      <w:start w:val="1"/>
+      <w:numFmt w:val="bullet"/>
+      <w:lvlText w:val=""/>
+      <w:lvlJc w:val="left"/>
+      <w:pPr>
+        <w:tabs>
+          <w:tab w:val="num" w:pos="2880"/>
+        </w:tabs>
+        <w:ind w:left="2880" w:hanging="360"/>
+      </w:pPr>
+      <w:rPr>
+        <w:rFonts w:ascii="Wingdings" w:hAnsi="Wingdings" w:hint="default"/>
+        <w:sz w:val="20"/>
+      </w:rPr>
+    </w:lvl>
+    <w:lvl w:ilvl="4" w:tentative="1">
+      <w:start w:val="1"/>
+      <w:numFmt w:val="bullet"/>
+      <w:lvlText w:val=""/>
+      <w:lvlJc w:val="left"/>
+      <w:pPr>
+        <w:tabs>
+          <w:tab w:val="num" w:pos="3600"/>
+        </w:tabs>
+        <w:ind w:left="3600" w:hanging="360"/>
+      </w:pPr>
+      <w:rPr>
+        <w:rFonts w:ascii="Wingdings" w:hAnsi="Wingdings" w:hint="default"/>
+        <w:sz w:val="20"/>
+      </w:rPr>
+    </w:lvl>
+    <w:lvl w:ilvl="5" w:tentative="1">
+      <w:start w:val="1"/>
+      <w:numFmt w:val="bullet"/>
+      <w:lvlText w:val=""/>
+      <w:lvlJc w:val="left"/>
+      <w:pPr>
+        <w:tabs>
+          <w:tab w:val="num" w:pos="4320"/>
+        </w:tabs>
+        <w:ind w:left="4320" w:hanging="360"/>
+      </w:pPr>
+      <w:rPr>
+        <w:rFonts w:ascii="Wingdings" w:hAnsi="Wingdings" w:hint="default"/>
+        <w:sz w:val="20"/>
+      </w:rPr>
+    </w:lvl>
+    <w:lvl w:ilvl="6" w:tentative="1">
+      <w:start w:val="1"/>
+      <w:numFmt w:val="bullet"/>
+      <w:lvlText w:val=""/>
+      <w:lvlJc w:val="left"/>
+      <w:pPr>
+        <w:tabs>
+          <w:tab w:val="num" w:pos="5040"/>
+        </w:tabs>
+        <w:ind w:left="5040" w:hanging="360"/>
+      </w:pPr>
+      <w:rPr>
+        <w:rFonts w:ascii="Wingdings" w:hAnsi="Wingdings" w:hint="default"/>
+        <w:sz w:val="20"/>
+      </w:rPr>
+    </w:lvl>
+    <w:lvl w:ilvl="7" w:tentative="1">
+      <w:start w:val="1"/>
+      <w:numFmt w:val="bullet"/>
+      <w:lvlText w:val=""/>
+      <w:lvlJc w:val="left"/>
+      <w:pPr>
+        <w:tabs>
+          <w:tab w:val="num" w:pos="5760"/>
+        </w:tabs>
+        <w:ind w:left="5760" w:hanging="360"/>
+      </w:pPr>
+      <w:rPr>
+        <w:rFonts w:ascii="Wingdings" w:hAnsi="Wingdings" w:hint="default"/>
+        <w:sz w:val="20"/>
+      </w:rPr>
+    </w:lvl>
+    <w:lvl w:ilvl="8" w:tentative="1">
+      <w:start w:val="1"/>
+      <w:numFmt w:val="bullet"/>
+      <w:lvlText w:val=""/>
+      <w:lvlJc w:val="left"/>
+      <w:pPr>
+        <w:tabs>
+          <w:tab w:val="num" w:pos="6480"/>
+        </w:tabs>
+        <w:ind w:left="6480" w:hanging="360"/>
+      </w:pPr>
+      <w:rPr>
+        <w:rFonts w:ascii="Wingdings" w:hAnsi="Wingdings" w:hint="default"/>
+        <w:sz w:val="20"/>
+      </w:rPr>
+    </w:lvl>
+  </w:abstractNum>
+  <w:abstractNum w:abstractNumId="5" w15:restartNumberingAfterBreak="0">
+    <w:nsid w:val="5232049B"/>
+    <w:multiLevelType w:val="multilevel"/>
+    <w:tmpl w:val="C91E334C"/>
+    <w:lvl w:ilvl="0">
+      <w:start w:val="1"/>
+      <w:numFmt w:val="bullet"/>
+      <w:lvlText w:val=""/>
+      <w:lvlJc w:val="left"/>
+      <w:pPr>
+        <w:tabs>
+          <w:tab w:val="num" w:pos="720"/>
+        </w:tabs>
+        <w:ind w:left="720" w:hanging="360"/>
+      </w:pPr>
+      <w:rPr>
+        <w:rFonts w:ascii="Symbol" w:hAnsi="Symbol" w:hint="default"/>
+        <w:sz w:val="20"/>
+      </w:rPr>
+    </w:lvl>
+    <w:lvl w:ilvl="1" w:tentative="1">
+      <w:start w:val="1"/>
+      <w:numFmt w:val="bullet"/>
+      <w:lvlText w:val="o"/>
+      <w:lvlJc w:val="left"/>
+      <w:pPr>
+        <w:tabs>
+          <w:tab w:val="num" w:pos="1440"/>
+        </w:tabs>
+        <w:ind w:left="1440" w:hanging="360"/>
+      </w:pPr>
+      <w:rPr>
+        <w:rFonts w:ascii="Courier New" w:hAnsi="Courier New" w:hint="default"/>
+        <w:sz w:val="20"/>
+      </w:rPr>
+    </w:lvl>
+    <w:lvl w:ilvl="2" w:tentative="1">
+      <w:start w:val="1"/>
+      <w:numFmt w:val="bullet"/>
+      <w:lvlText w:val=""/>
+      <w:lvlJc w:val="left"/>
+      <w:pPr>
+        <w:tabs>
+          <w:tab w:val="num" w:pos="2160"/>
+        </w:tabs>
+        <w:ind w:left="2160" w:hanging="360"/>
+      </w:pPr>
+      <w:rPr>
+        <w:rFonts w:ascii="Wingdings" w:hAnsi="Wingdings" w:hint="default"/>
+        <w:sz w:val="20"/>
+      </w:rPr>
+    </w:lvl>
+    <w:lvl w:ilvl="3" w:tentative="1">
+      <w:start w:val="1"/>
+      <w:numFmt w:val="bullet"/>
+      <w:lvlText w:val=""/>
+      <w:lvlJc w:val="left"/>
+      <w:pPr>
+        <w:tabs>
+          <w:tab w:val="num" w:pos="2880"/>
+        </w:tabs>
+        <w:ind w:left="2880" w:hanging="360"/>
+      </w:pPr>
+      <w:rPr>
+        <w:rFonts w:ascii="Wingdings" w:hAnsi="Wingdings" w:hint="default"/>
+        <w:sz w:val="20"/>
+      </w:rPr>
+    </w:lvl>
+    <w:lvl w:ilvl="4" w:tentative="1">
+      <w:start w:val="1"/>
+      <w:numFmt w:val="bullet"/>
+      <w:lvlText w:val=""/>
+      <w:lvlJc w:val="left"/>
+      <w:pPr>
+        <w:tabs>
+          <w:tab w:val="num" w:pos="3600"/>
+        </w:tabs>
+        <w:ind w:left="3600" w:hanging="360"/>
+      </w:pPr>
+      <w:rPr>
+        <w:rFonts w:ascii="Wingdings" w:hAnsi="Wingdings" w:hint="default"/>
+        <w:sz w:val="20"/>
+      </w:rPr>
+    </w:lvl>
+    <w:lvl w:ilvl="5" w:tentative="1">
+      <w:start w:val="1"/>
+      <w:numFmt w:val="bullet"/>
+      <w:lvlText w:val=""/>
+      <w:lvlJc w:val="left"/>
+      <w:pPr>
+        <w:tabs>
+          <w:tab w:val="num" w:pos="4320"/>
+        </w:tabs>
+        <w:ind w:left="4320" w:hanging="360"/>
+      </w:pPr>
+      <w:rPr>
+        <w:rFonts w:ascii="Wingdings" w:hAnsi="Wingdings" w:hint="default"/>
+        <w:sz w:val="20"/>
+      </w:rPr>
+    </w:lvl>
+    <w:lvl w:ilvl="6" w:tentative="1">
+      <w:start w:val="1"/>
+      <w:numFmt w:val="bullet"/>
+      <w:lvlText w:val=""/>
+      <w:lvlJc w:val="left"/>
+      <w:pPr>
+        <w:tabs>
+          <w:tab w:val="num" w:pos="5040"/>
+        </w:tabs>
+        <w:ind w:left="5040" w:hanging="360"/>
+      </w:pPr>
+      <w:rPr>
+        <w:rFonts w:ascii="Wingdings" w:hAnsi="Wingdings" w:hint="default"/>
+        <w:sz w:val="20"/>
+      </w:rPr>
+    </w:lvl>
+    <w:lvl w:ilvl="7" w:tentative="1">
+      <w:start w:val="1"/>
+      <w:numFmt w:val="bullet"/>
+      <w:lvlText w:val=""/>
+      <w:lvlJc w:val="left"/>
+      <w:pPr>
+        <w:tabs>
+          <w:tab w:val="num" w:pos="5760"/>
+        </w:tabs>
+        <w:ind w:left="5760" w:hanging="360"/>
+      </w:pPr>
+      <w:rPr>
+        <w:rFonts w:ascii="Wingdings" w:hAnsi="Wingdings" w:hint="default"/>
+        <w:sz w:val="20"/>
+      </w:rPr>
+    </w:lvl>
+    <w:lvl w:ilvl="8" w:tentative="1">
+      <w:start w:val="1"/>
+      <w:numFmt w:val="bullet"/>
+      <w:lvlText w:val=""/>
+      <w:lvlJc w:val="left"/>
+      <w:pPr>
+        <w:tabs>
+          <w:tab w:val="num" w:pos="6480"/>
+        </w:tabs>
+        <w:ind w:left="6480" w:hanging="360"/>
+      </w:pPr>
+      <w:rPr>
+        <w:rFonts w:ascii="Wingdings" w:hAnsi="Wingdings" w:hint="default"/>
+        <w:sz w:val="20"/>
+      </w:rPr>
+    </w:lvl>
+  </w:abstractNum>
+  <w:abstractNum w:abstractNumId="6" w15:restartNumberingAfterBreak="0">
+    <w:nsid w:val="546C033C"/>
+    <w:multiLevelType w:val="multilevel"/>
+    <w:tmpl w:val="71AC7086"/>
+    <w:lvl w:ilvl="0">
+      <w:start w:val="1"/>
+      <w:numFmt w:val="bullet"/>
+      <w:lvlText w:val=""/>
+      <w:lvlJc w:val="left"/>
+      <w:pPr>
+        <w:tabs>
+          <w:tab w:val="num" w:pos="720"/>
+        </w:tabs>
+        <w:ind w:left="720" w:hanging="360"/>
+      </w:pPr>
+      <w:rPr>
+        <w:rFonts w:ascii="Symbol" w:hAnsi="Symbol" w:hint="default"/>
+        <w:sz w:val="20"/>
+      </w:rPr>
+    </w:lvl>
+    <w:lvl w:ilvl="1" w:tentative="1">
+      <w:start w:val="1"/>
+      <w:numFmt w:val="bullet"/>
+      <w:lvlText w:val="o"/>
+      <w:lvlJc w:val="left"/>
+      <w:pPr>
+        <w:tabs>
+          <w:tab w:val="num" w:pos="1440"/>
+        </w:tabs>
+        <w:ind w:left="1440" w:hanging="360"/>
+      </w:pPr>
+      <w:rPr>
+        <w:rFonts w:ascii="Courier New" w:hAnsi="Courier New" w:hint="default"/>
+        <w:sz w:val="20"/>
+      </w:rPr>
+    </w:lvl>
+    <w:lvl w:ilvl="2" w:tentative="1">
+      <w:start w:val="1"/>
+      <w:numFmt w:val="bullet"/>
+      <w:lvlText w:val=""/>
+      <w:lvlJc w:val="left"/>
+      <w:pPr>
+        <w:tabs>
+          <w:tab w:val="num" w:pos="2160"/>
+        </w:tabs>
+        <w:ind w:left="2160" w:hanging="360"/>
+      </w:pPr>
+      <w:rPr>
+        <w:rFonts w:ascii="Wingdings" w:hAnsi="Wingdings" w:hint="default"/>
+        <w:sz w:val="20"/>
+      </w:rPr>
+    </w:lvl>
+    <w:lvl w:ilvl="3" w:tentative="1">
+      <w:start w:val="1"/>
+      <w:numFmt w:val="bullet"/>
+      <w:lvlText w:val=""/>
+      <w:lvlJc w:val="left"/>
+      <w:pPr>
+        <w:tabs>
+          <w:tab w:val="num" w:pos="2880"/>
+        </w:tabs>
+        <w:ind w:left="2880" w:hanging="360"/>
+      </w:pPr>
+      <w:rPr>
+        <w:rFonts w:ascii="Wingdings" w:hAnsi="Wingdings" w:hint="default"/>
+        <w:sz w:val="20"/>
+      </w:rPr>
+    </w:lvl>
+    <w:lvl w:ilvl="4" w:tentative="1">
+      <w:start w:val="1"/>
+      <w:numFmt w:val="bullet"/>
+      <w:lvlText w:val=""/>
+      <w:lvlJc w:val="left"/>
+      <w:pPr>
+        <w:tabs>
+          <w:tab w:val="num" w:pos="3600"/>
+        </w:tabs>
+        <w:ind w:left="3600" w:hanging="360"/>
+      </w:pPr>
+      <w:rPr>
+        <w:rFonts w:ascii="Wingdings" w:hAnsi="Wingdings" w:hint="default"/>
+        <w:sz w:val="20"/>
+      </w:rPr>
+    </w:lvl>
+    <w:lvl w:ilvl="5" w:tentative="1">
+      <w:start w:val="1"/>
+      <w:numFmt w:val="bullet"/>
+      <w:lvlText w:val=""/>
+      <w:lvlJc w:val="left"/>
+      <w:pPr>
+        <w:tabs>
+          <w:tab w:val="num" w:pos="4320"/>
+        </w:tabs>
+        <w:ind w:left="4320" w:hanging="360"/>
+      </w:pPr>
+      <w:rPr>
+        <w:rFonts w:ascii="Wingdings" w:hAnsi="Wingdings" w:hint="default"/>
+        <w:sz w:val="20"/>
+      </w:rPr>
+    </w:lvl>
+    <w:lvl w:ilvl="6" w:tentative="1">
+      <w:start w:val="1"/>
+      <w:numFmt w:val="bullet"/>
+      <w:lvlText w:val=""/>
+      <w:lvlJc w:val="left"/>
+      <w:pPr>
+        <w:tabs>
+          <w:tab w:val="num" w:pos="5040"/>
+        </w:tabs>
+        <w:ind w:left="5040" w:hanging="360"/>
+      </w:pPr>
+      <w:rPr>
+        <w:rFonts w:ascii="Wingdings" w:hAnsi="Wingdings" w:hint="default"/>
+        <w:sz w:val="20"/>
+      </w:rPr>
+    </w:lvl>
+    <w:lvl w:ilvl="7" w:tentative="1">
+      <w:start w:val="1"/>
+      <w:numFmt w:val="bullet"/>
+      <w:lvlText w:val=""/>
+      <w:lvlJc w:val="left"/>
+      <w:pPr>
+        <w:tabs>
+          <w:tab w:val="num" w:pos="5760"/>
+        </w:tabs>
+        <w:ind w:left="5760" w:hanging="360"/>
+      </w:pPr>
+      <w:rPr>
+        <w:rFonts w:ascii="Wingdings" w:hAnsi="Wingdings" w:hint="default"/>
+        <w:sz w:val="20"/>
+      </w:rPr>
+    </w:lvl>
+    <w:lvl w:ilvl="8" w:tentative="1">
+      <w:start w:val="1"/>
+      <w:numFmt w:val="bullet"/>
+      <w:lvlText w:val=""/>
+      <w:lvlJc w:val="left"/>
+      <w:pPr>
+        <w:tabs>
+          <w:tab w:val="num" w:pos="6480"/>
+        </w:tabs>
+        <w:ind w:left="6480" w:hanging="360"/>
+      </w:pPr>
+      <w:rPr>
+        <w:rFonts w:ascii="Wingdings" w:hAnsi="Wingdings" w:hint="default"/>
+        <w:sz w:val="20"/>
+      </w:rPr>
+    </w:lvl>
+  </w:abstractNum>
+  <w:abstractNum w:abstractNumId="7" w15:restartNumberingAfterBreak="0">
+    <w:nsid w:val="54C66CA0"/>
+    <w:multiLevelType w:val="multilevel"/>
+    <w:tmpl w:val="009E1CA0"/>
+    <w:lvl w:ilvl="0">
+      <w:start w:val="1"/>
+      <w:numFmt w:val="bullet"/>
+      <w:lvlText w:val=""/>
+      <w:lvlJc w:val="left"/>
+      <w:pPr>
+        <w:tabs>
+          <w:tab w:val="num" w:pos="720"/>
+        </w:tabs>
+        <w:ind w:left="720" w:hanging="360"/>
+      </w:pPr>
+      <w:rPr>
+        <w:rFonts w:ascii="Symbol" w:hAnsi="Symbol" w:hint="default"/>
+        <w:sz w:val="20"/>
+      </w:rPr>
+    </w:lvl>
+    <w:lvl w:ilvl="1" w:tentative="1">
+      <w:start w:val="1"/>
+      <w:numFmt w:val="bullet"/>
+      <w:lvlText w:val="o"/>
+      <w:lvlJc w:val="left"/>
+      <w:pPr>
+        <w:tabs>
+          <w:tab w:val="num" w:pos="1440"/>
+        </w:tabs>
+        <w:ind w:left="1440" w:hanging="360"/>
+      </w:pPr>
+      <w:rPr>
+        <w:rFonts w:ascii="Courier New" w:hAnsi="Courier New" w:hint="default"/>
+        <w:sz w:val="20"/>
+      </w:rPr>
+    </w:lvl>
+    <w:lvl w:ilvl="2" w:tentative="1">
+      <w:start w:val="1"/>
+      <w:numFmt w:val="bullet"/>
+      <w:lvlText w:val=""/>
+      <w:lvlJc w:val="left"/>
+      <w:pPr>
+        <w:tabs>
+          <w:tab w:val="num" w:pos="2160"/>
+        </w:tabs>
+        <w:ind w:left="2160" w:hanging="360"/>
+      </w:pPr>
+      <w:rPr>
+        <w:rFonts w:ascii="Wingdings" w:hAnsi="Wingdings" w:hint="default"/>
+        <w:sz w:val="20"/>
+      </w:rPr>
+    </w:lvl>
+    <w:lvl w:ilvl="3" w:tentative="1">
+      <w:start w:val="1"/>
+      <w:numFmt w:val="bullet"/>
+      <w:lvlText w:val=""/>
+      <w:lvlJc w:val="left"/>
+      <w:pPr>
+        <w:tabs>
+          <w:tab w:val="num" w:pos="2880"/>
+        </w:tabs>
+        <w:ind w:left="2880" w:hanging="360"/>
+      </w:pPr>
+      <w:rPr>
+        <w:rFonts w:ascii="Wingdings" w:hAnsi="Wingdings" w:hint="default"/>
+        <w:sz w:val="20"/>
+      </w:rPr>
+    </w:lvl>
+    <w:lvl w:ilvl="4" w:tentative="1">
+      <w:start w:val="1"/>
+      <w:numFmt w:val="bullet"/>
+      <w:lvlText w:val=""/>
+      <w:lvlJc w:val="left"/>
+      <w:pPr>
+        <w:tabs>
+          <w:tab w:val="num" w:pos="3600"/>
+        </w:tabs>
+        <w:ind w:left="3600" w:hanging="360"/>
+      </w:pPr>
+      <w:rPr>
+        <w:rFonts w:ascii="Wingdings" w:hAnsi="Wingdings" w:hint="default"/>
+        <w:sz w:val="20"/>
+      </w:rPr>
+    </w:lvl>
+    <w:lvl w:ilvl="5" w:tentative="1">
+      <w:start w:val="1"/>
+      <w:numFmt w:val="bullet"/>
+      <w:lvlText w:val=""/>
+      <w:lvlJc w:val="left"/>
+      <w:pPr>
+        <w:tabs>
+          <w:tab w:val="num" w:pos="4320"/>
+        </w:tabs>
+        <w:ind w:left="4320" w:hanging="360"/>
+      </w:pPr>
+      <w:rPr>
+        <w:rFonts w:ascii="Wingdings" w:hAnsi="Wingdings" w:hint="default"/>
+        <w:sz w:val="20"/>
+      </w:rPr>
+    </w:lvl>
+    <w:lvl w:ilvl="6" w:tentative="1">
+      <w:start w:val="1"/>
+      <w:numFmt w:val="bullet"/>
+      <w:lvlText w:val=""/>
+      <w:lvlJc w:val="left"/>
+      <w:pPr>
+        <w:tabs>
+          <w:tab w:val="num" w:pos="5040"/>
+        </w:tabs>
+        <w:ind w:left="5040" w:hanging="360"/>
+      </w:pPr>
+      <w:rPr>
+        <w:rFonts w:ascii="Wingdings" w:hAnsi="Wingdings" w:hint="default"/>
+        <w:sz w:val="20"/>
+      </w:rPr>
+    </w:lvl>
+    <w:lvl w:ilvl="7" w:tentative="1">
+      <w:start w:val="1"/>
+      <w:numFmt w:val="bullet"/>
+      <w:lvlText w:val=""/>
+      <w:lvlJc w:val="left"/>
+      <w:pPr>
+        <w:tabs>
+          <w:tab w:val="num" w:pos="5760"/>
+        </w:tabs>
+        <w:ind w:left="5760" w:hanging="360"/>
+      </w:pPr>
+      <w:rPr>
+        <w:rFonts w:ascii="Wingdings" w:hAnsi="Wingdings" w:hint="default"/>
+        <w:sz w:val="20"/>
+      </w:rPr>
+    </w:lvl>
+    <w:lvl w:ilvl="8" w:tentative="1">
+      <w:start w:val="1"/>
+      <w:numFmt w:val="bullet"/>
+      <w:lvlText w:val=""/>
+      <w:lvlJc w:val="left"/>
+      <w:pPr>
+        <w:tabs>
+          <w:tab w:val="num" w:pos="6480"/>
+        </w:tabs>
+        <w:ind w:left="6480" w:hanging="360"/>
+      </w:pPr>
+      <w:rPr>
+        <w:rFonts w:ascii="Wingdings" w:hAnsi="Wingdings" w:hint="default"/>
+        <w:sz w:val="20"/>
+      </w:rPr>
+    </w:lvl>
+  </w:abstractNum>
+  <w:abstractNum w:abstractNumId="8" w15:restartNumberingAfterBreak="0">
+    <w:nsid w:val="67FD1F32"/>
+    <w:multiLevelType w:val="multilevel"/>
+    <w:tmpl w:val="114CD08E"/>
+    <w:lvl w:ilvl="0">
+      <w:start w:val="1"/>
+      <w:numFmt w:val="bullet"/>
+      <w:lvlText w:val=""/>
+      <w:lvlJc w:val="left"/>
+      <w:pPr>
+        <w:tabs>
+          <w:tab w:val="num" w:pos="720"/>
+        </w:tabs>
+        <w:ind w:left="720" w:hanging="360"/>
+      </w:pPr>
+      <w:rPr>
+        <w:rFonts w:ascii="Symbol" w:hAnsi="Symbol" w:hint="default"/>
+        <w:sz w:val="20"/>
+      </w:rPr>
+    </w:lvl>
+    <w:lvl w:ilvl="1" w:tentative="1">
+      <w:start w:val="1"/>
+      <w:numFmt w:val="bullet"/>
+      <w:lvlText w:val="o"/>
+      <w:lvlJc w:val="left"/>
+      <w:pPr>
+        <w:tabs>
+          <w:tab w:val="num" w:pos="1440"/>
+        </w:tabs>
+        <w:ind w:left="1440" w:hanging="360"/>
+      </w:pPr>
+      <w:rPr>
+        <w:rFonts w:ascii="Courier New" w:hAnsi="Courier New" w:hint="default"/>
+        <w:sz w:val="20"/>
+      </w:rPr>
+    </w:lvl>
+    <w:lvl w:ilvl="2" w:tentative="1">
+      <w:start w:val="1"/>
+      <w:numFmt w:val="bullet"/>
+      <w:lvlText w:val=""/>
+      <w:lvlJc w:val="left"/>
+      <w:pPr>
+        <w:tabs>
+          <w:tab w:val="num" w:pos="2160"/>
+        </w:tabs>
+        <w:ind w:left="2160" w:hanging="360"/>
+      </w:pPr>
+      <w:rPr>
+        <w:rFonts w:ascii="Wingdings" w:hAnsi="Wingdings" w:hint="default"/>
+        <w:sz w:val="20"/>
+      </w:rPr>
+    </w:lvl>
+    <w:lvl w:ilvl="3" w:tentative="1">
+      <w:start w:val="1"/>
+      <w:numFmt w:val="bullet"/>
+      <w:lvlText w:val=""/>
+      <w:lvlJc w:val="left"/>
+      <w:pPr>
+        <w:tabs>
+          <w:tab w:val="num" w:pos="2880"/>
+        </w:tabs>
+        <w:ind w:left="2880" w:hanging="360"/>
+      </w:pPr>
+      <w:rPr>
+        <w:rFonts w:ascii="Wingdings" w:hAnsi="Wingdings" w:hint="default"/>
+        <w:sz w:val="20"/>
+      </w:rPr>
+    </w:lvl>
+    <w:lvl w:ilvl="4" w:tentative="1">
+      <w:start w:val="1"/>
+      <w:numFmt w:val="bullet"/>
+      <w:lvlText w:val=""/>
+      <w:lvlJc w:val="left"/>
+      <w:pPr>
+        <w:tabs>
+          <w:tab w:val="num" w:pos="3600"/>
+        </w:tabs>
+        <w:ind w:left="3600" w:hanging="360"/>
+      </w:pPr>
+      <w:rPr>
+        <w:rFonts w:ascii="Wingdings" w:hAnsi="Wingdings" w:hint="default"/>
+        <w:sz w:val="20"/>
+      </w:rPr>
+    </w:lvl>
+    <w:lvl w:ilvl="5" w:tentative="1">
+      <w:start w:val="1"/>
+      <w:numFmt w:val="bullet"/>
+      <w:lvlText w:val=""/>
+      <w:lvlJc w:val="left"/>
+      <w:pPr>
+        <w:tabs>
+          <w:tab w:val="num" w:pos="4320"/>
+        </w:tabs>
+        <w:ind w:left="4320" w:hanging="360"/>
+      </w:pPr>
+      <w:rPr>
+        <w:rFonts w:ascii="Wingdings" w:hAnsi="Wingdings" w:hint="default"/>
+        <w:sz w:val="20"/>
+      </w:rPr>
+    </w:lvl>
+    <w:lvl w:ilvl="6" w:tentative="1">
+      <w:start w:val="1"/>
+      <w:numFmt w:val="bullet"/>
+      <w:lvlText w:val=""/>
+      <w:lvlJc w:val="left"/>
+      <w:pPr>
+        <w:tabs>
+          <w:tab w:val="num" w:pos="5040"/>
+        </w:tabs>
+        <w:ind w:left="5040" w:hanging="360"/>
+      </w:pPr>
+      <w:rPr>
+        <w:rFonts w:ascii="Wingdings" w:hAnsi="Wingdings" w:hint="default"/>
+        <w:sz w:val="20"/>
+      </w:rPr>
+    </w:lvl>
+    <w:lvl w:ilvl="7" w:tentative="1">
+      <w:start w:val="1"/>
+      <w:numFmt w:val="bullet"/>
+      <w:lvlText w:val=""/>
+      <w:lvlJc w:val="left"/>
+      <w:pPr>
+        <w:tabs>
+          <w:tab w:val="num" w:pos="5760"/>
+        </w:tabs>
+        <w:ind w:left="5760" w:hanging="360"/>
+      </w:pPr>
+      <w:rPr>
+        <w:rFonts w:ascii="Wingdings" w:hAnsi="Wingdings" w:hint="default"/>
+        <w:sz w:val="20"/>
+      </w:rPr>
+    </w:lvl>
+    <w:lvl w:ilvl="8" w:tentative="1">
+      <w:start w:val="1"/>
+      <w:numFmt w:val="bullet"/>
+      <w:lvlText w:val=""/>
+      <w:lvlJc w:val="left"/>
+      <w:pPr>
+        <w:tabs>
+          <w:tab w:val="num" w:pos="6480"/>
+        </w:tabs>
+        <w:ind w:left="6480" w:hanging="360"/>
+      </w:pPr>
+      <w:rPr>
+        <w:rFonts w:ascii="Wingdings" w:hAnsi="Wingdings" w:hint="default"/>
+        <w:sz w:val="20"/>
+      </w:rPr>
+    </w:lvl>
+  </w:abstractNum>
+  <w:num w:numId="1" w16cid:durableId="803160041">
+    <w:abstractNumId w:val="8"/>
+  </w:num>
+  <w:num w:numId="2" w16cid:durableId="1529953245">
+    <w:abstractNumId w:val="2"/>
+  </w:num>
+  <w:num w:numId="3" w16cid:durableId="1193686947">
+    <w:abstractNumId w:val="1"/>
+  </w:num>
+  <w:num w:numId="4" w16cid:durableId="1357462995">
+    <w:abstractNumId w:val="3"/>
+  </w:num>
+  <w:num w:numId="5" w16cid:durableId="861632351">
+    <w:abstractNumId w:val="6"/>
+  </w:num>
+  <w:num w:numId="6" w16cid:durableId="994601221">
+    <w:abstractNumId w:val="7"/>
+  </w:num>
+  <w:num w:numId="7" w16cid:durableId="534273436">
+    <w:abstractNumId w:val="5"/>
+  </w:num>
+  <w:num w:numId="8" w16cid:durableId="2030640433">
+    <w:abstractNumId w:val="4"/>
+  </w:num>
+  <w:num w:numId="9" w16cid:durableId="461966072">
+    <w:abstractNumId w:val="0"/>
+  </w:num>
+</w:numbering>
 </file>
 
 <file path=word/styles.xml><?xml version="1.0" encoding="utf-8"?>
@@ -881,7 +5206,6 @@
   <w:style w:type="character" w:default="1" w:styleId="DefaultParagraphFont">
     <w:name w:val="Default Paragraph Font"/>
     <w:uiPriority w:val="1"/>
-    <w:semiHidden/>
     <w:unhideWhenUsed/>
   </w:style>
   <w:style w:type="table" w:default="1" w:styleId="TableNormal">

</xml_diff>

<commit_message>
Lesson 64 Creating Order and Orders Page for the user
</commit_message>
<xml_diff>
--- a/Note3.docx
+++ b/Note3.docx
@@ -93,11 +93,19 @@
         </w:rPr>
         <w:t xml:space="preserve">how to implement </w:t>
       </w:r>
-      <w:r>
-        <w:rPr>
-          <w:lang w:val="en-US"/>
-        </w:rPr>
-        <w:t xml:space="preserve">paytm </w:t>
+      <w:proofErr w:type="spellStart"/>
+      <w:r>
+        <w:rPr>
+          <w:lang w:val="en-US"/>
+        </w:rPr>
+        <w:t>paytm</w:t>
+      </w:r>
+      <w:proofErr w:type="spellEnd"/>
+      <w:r>
+        <w:rPr>
+          <w:lang w:val="en-US"/>
+        </w:rPr>
+        <w:t xml:space="preserve"> </w:t>
       </w:r>
       <w:r>
         <w:rPr>
@@ -109,13 +117,41 @@
         <w:rPr>
           <w:lang w:val="en-US"/>
         </w:rPr>
-        <w:t>If you go to Razorpay or</w:t>
-      </w:r>
-      <w:r>
-        <w:rPr>
-          <w:lang w:val="en-US"/>
-        </w:rPr>
-        <w:t xml:space="preserve"> instamozo then in their d</w:t>
+        <w:t xml:space="preserve">If you go to </w:t>
+      </w:r>
+      <w:proofErr w:type="spellStart"/>
+      <w:r>
+        <w:rPr>
+          <w:lang w:val="en-US"/>
+        </w:rPr>
+        <w:t>Razorpay</w:t>
+      </w:r>
+      <w:proofErr w:type="spellEnd"/>
+      <w:r>
+        <w:rPr>
+          <w:lang w:val="en-US"/>
+        </w:rPr>
+        <w:t xml:space="preserve"> or</w:t>
+      </w:r>
+      <w:r>
+        <w:rPr>
+          <w:lang w:val="en-US"/>
+        </w:rPr>
+        <w:t xml:space="preserve"> </w:t>
+      </w:r>
+      <w:proofErr w:type="spellStart"/>
+      <w:r>
+        <w:rPr>
+          <w:lang w:val="en-US"/>
+        </w:rPr>
+        <w:t>instamozo</w:t>
+      </w:r>
+      <w:proofErr w:type="spellEnd"/>
+      <w:r>
+        <w:rPr>
+          <w:lang w:val="en-US"/>
+        </w:rPr>
+        <w:t xml:space="preserve"> then in their d</w:t>
       </w:r>
       <w:r>
         <w:rPr>
@@ -208,7 +244,21 @@
         <w:rPr>
           <w:lang w:val="en-US"/>
         </w:rPr>
-        <w:t>cing methods (who knows maybe paytm also have).</w:t>
+        <w:t xml:space="preserve">cing methods (who knows maybe </w:t>
+      </w:r>
+      <w:proofErr w:type="spellStart"/>
+      <w:r>
+        <w:rPr>
+          <w:lang w:val="en-US"/>
+        </w:rPr>
+        <w:t>paytm</w:t>
+      </w:r>
+      <w:proofErr w:type="spellEnd"/>
+      <w:r>
+        <w:rPr>
+          <w:lang w:val="en-US"/>
+        </w:rPr>
+        <w:t xml:space="preserve"> also have).</w:t>
       </w:r>
     </w:p>
     <w:p>
@@ -391,7 +441,21 @@
         <w:rPr>
           <w:lang w:val="en-US"/>
         </w:rPr>
-        <w:t>We come to know that in Nextjs we can set a style according to Boolean attribute vari</w:t>
+        <w:t xml:space="preserve">We come to know that in </w:t>
+      </w:r>
+      <w:proofErr w:type="spellStart"/>
+      <w:r>
+        <w:rPr>
+          <w:lang w:val="en-US"/>
+        </w:rPr>
+        <w:t>Nextjs</w:t>
+      </w:r>
+      <w:proofErr w:type="spellEnd"/>
+      <w:r>
+        <w:rPr>
+          <w:lang w:val="en-US"/>
+        </w:rPr>
+        <w:t xml:space="preserve"> we can set a style according to Boolean attribute vari</w:t>
       </w:r>
       <w:r>
         <w:rPr>
@@ -409,7 +473,21 @@
         <w:rPr>
           <w:lang w:val="en-US"/>
         </w:rPr>
-        <w:t xml:space="preserve"> maybe for example dor disabled we can do so. That is disabled:bg-pink-300</w:t>
+        <w:t xml:space="preserve"> maybe for example </w:t>
+      </w:r>
+      <w:proofErr w:type="spellStart"/>
+      <w:r>
+        <w:rPr>
+          <w:lang w:val="en-US"/>
+        </w:rPr>
+        <w:t>dor</w:t>
+      </w:r>
+      <w:proofErr w:type="spellEnd"/>
+      <w:r>
+        <w:rPr>
+          <w:lang w:val="en-US"/>
+        </w:rPr>
+        <w:t xml:space="preserve"> disabled we can do so. That is disabled:bg-pink-300</w:t>
       </w:r>
       <w:r>
         <w:rPr>
@@ -434,6 +512,7 @@
         </w:rPr>
         <w:t xml:space="preserve">You can </w:t>
       </w:r>
+      <w:proofErr w:type="spellStart"/>
       <w:proofErr w:type="gramStart"/>
       <w:r>
         <w:rPr>
@@ -443,6 +522,7 @@
         </w:rPr>
         <w:t>useStateSnippets</w:t>
       </w:r>
+      <w:proofErr w:type="spellEnd"/>
       <w:r>
         <w:rPr>
           <w:b/>
@@ -482,7 +562,25 @@
           <w:bCs/>
           <w:lang w:val="en-US"/>
         </w:rPr>
-        <w:t xml:space="preserve"> to make useState very fast</w:t>
+        <w:t xml:space="preserve"> to make </w:t>
+      </w:r>
+      <w:proofErr w:type="spellStart"/>
+      <w:r>
+        <w:rPr>
+          <w:b/>
+          <w:bCs/>
+          <w:lang w:val="en-US"/>
+        </w:rPr>
+        <w:t>useState</w:t>
+      </w:r>
+      <w:proofErr w:type="spellEnd"/>
+      <w:r>
+        <w:rPr>
+          <w:b/>
+          <w:bCs/>
+          <w:lang w:val="en-US"/>
+        </w:rPr>
+        <w:t xml:space="preserve"> very fast</w:t>
       </w:r>
     </w:p>
     <w:p>
@@ -614,8 +712,9 @@
           <w:color w:val="EE0000"/>
           <w:lang w:val="en-US"/>
         </w:rPr>
-        <w:t xml:space="preserve"> old mongodb it was very merciful it used to ignore if no value passed for a field that has not required to true.</w:t>
-      </w:r>
+        <w:t xml:space="preserve"> old </w:t>
+      </w:r>
+      <w:proofErr w:type="spellStart"/>
       <w:r>
         <w:rPr>
           <w:b/>
@@ -623,6 +722,25 @@
           <w:color w:val="EE0000"/>
           <w:lang w:val="en-US"/>
         </w:rPr>
+        <w:t>mongodb</w:t>
+      </w:r>
+      <w:proofErr w:type="spellEnd"/>
+      <w:r>
+        <w:rPr>
+          <w:b/>
+          <w:bCs/>
+          <w:color w:val="EE0000"/>
+          <w:lang w:val="en-US"/>
+        </w:rPr>
+        <w:t xml:space="preserve"> it was very merciful it used to ignore if no value passed for a field that has not required to true.</w:t>
+      </w:r>
+      <w:r>
+        <w:rPr>
+          <w:b/>
+          <w:bCs/>
+          <w:color w:val="EE0000"/>
+          <w:lang w:val="en-US"/>
+        </w:rPr>
         <w:t xml:space="preserve"> But not anymore </w:t>
       </w:r>
       <w:r>
@@ -953,6 +1071,7 @@
       </w:pPr>
       <w:r>
         <w:rPr>
+          <w:noProof/>
           <w:lang w:val="en-US"/>
         </w:rPr>
         <w:drawing>
@@ -1002,7 +1121,21 @@
         <w:rPr>
           <w:lang w:val="en-US"/>
         </w:rPr>
-        <w:t>The urlCallback is sent this type of data.</w:t>
+        <w:t xml:space="preserve">The </w:t>
+      </w:r>
+      <w:proofErr w:type="spellStart"/>
+      <w:r>
+        <w:rPr>
+          <w:lang w:val="en-US"/>
+        </w:rPr>
+        <w:t>urlCallback</w:t>
+      </w:r>
+      <w:proofErr w:type="spellEnd"/>
+      <w:r>
+        <w:rPr>
+          <w:lang w:val="en-US"/>
+        </w:rPr>
+        <w:t xml:space="preserve"> is sent this type of data.</w:t>
       </w:r>
     </w:p>
     <w:p>
@@ -1037,8 +1170,9 @@
           <w:color w:val="EE0000"/>
           <w:lang w:val="en-US"/>
         </w:rPr>
-        <w:t xml:space="preserve">acher says we get logical error that is no updation was happening in mongodb because </w:t>
-      </w:r>
+        <w:t xml:space="preserve">acher says we get logical error that is no updation was happening in </w:t>
+      </w:r>
+      <w:proofErr w:type="spellStart"/>
       <w:r>
         <w:rPr>
           <w:b/>
@@ -1046,6 +1180,25 @@
           <w:color w:val="EE0000"/>
           <w:lang w:val="en-US"/>
         </w:rPr>
+        <w:t>mongodb</w:t>
+      </w:r>
+      <w:proofErr w:type="spellEnd"/>
+      <w:r>
+        <w:rPr>
+          <w:b/>
+          <w:bCs/>
+          <w:color w:val="EE0000"/>
+          <w:lang w:val="en-US"/>
+        </w:rPr>
+        <w:t xml:space="preserve"> because </w:t>
+      </w:r>
+      <w:r>
+        <w:rPr>
+          <w:b/>
+          <w:bCs/>
+          <w:color w:val="EE0000"/>
+          <w:lang w:val="en-US"/>
+        </w:rPr>
         <w:t xml:space="preserve">some method does not return promise die which error may </w:t>
       </w:r>
       <w:proofErr w:type="gramStart"/>
@@ -1082,7 +1235,23 @@
           <w:bCs/>
         </w:rPr>
         <w:lastRenderedPageBreak/>
-        <w:t>return Response.redirect("/order",302) why we get this error</w:t>
+        <w:t xml:space="preserve">return </w:t>
+      </w:r>
+      <w:proofErr w:type="spellStart"/>
+      <w:r>
+        <w:rPr>
+          <w:b/>
+          <w:bCs/>
+        </w:rPr>
+        <w:t>Response.redirect</w:t>
+      </w:r>
+      <w:proofErr w:type="spellEnd"/>
+      <w:r>
+        <w:rPr>
+          <w:b/>
+          <w:bCs/>
+        </w:rPr>
+        <w:t>("/order",302) why we get this error</w:t>
       </w:r>
     </w:p>
     <w:p>
@@ -1121,7 +1290,15 @@
     </w:p>
     <w:p>
       <w:r>
-        <w:t>return Response.redirect("/order", 302)</w:t>
+        <w:t xml:space="preserve">return </w:t>
+      </w:r>
+      <w:proofErr w:type="spellStart"/>
+      <w:r>
+        <w:t>Response.redirect</w:t>
+      </w:r>
+      <w:proofErr w:type="spellEnd"/>
+      <w:r>
+        <w:t>("/order", 302)</w:t>
       </w:r>
     </w:p>
     <w:p>
@@ -1134,12 +1311,21 @@
       <w:r>
         <w:t xml:space="preserve"> Fails because </w:t>
       </w:r>
-      <w:r>
-        <w:rPr>
-          <w:b/>
-          <w:bCs/>
-        </w:rPr>
-        <w:t>Response.redirect expects a full URL</w:t>
+      <w:proofErr w:type="spellStart"/>
+      <w:r>
+        <w:rPr>
+          <w:b/>
+          <w:bCs/>
+        </w:rPr>
+        <w:t>Response.redirect</w:t>
+      </w:r>
+      <w:proofErr w:type="spellEnd"/>
+      <w:r>
+        <w:rPr>
+          <w:b/>
+          <w:bCs/>
+        </w:rPr>
+        <w:t xml:space="preserve"> expects a full URL</w:t>
       </w:r>
       <w:r>
         <w:t>, not just a relative path</w:t>
@@ -1148,7 +1334,7 @@
     <w:p>
       <w:r>
         <w:pict w14:anchorId="53939596">
-          <v:rect id="_x0000_i1133" style="width:0;height:1.5pt" o:hralign="center" o:hrstd="t" o:hr="t" fillcolor="#a0a0a0" stroked="f"/>
+          <v:rect id="_x0000_i1025" style="width:0;height:1.5pt" o:hralign="center" o:hrstd="t" o:hr="t" fillcolor="#a0a0a0" stroked="f"/>
         </w:pict>
       </w:r>
     </w:p>
@@ -1216,7 +1402,7 @@
     <w:p>
       <w:r>
         <w:pict w14:anchorId="5FDE82AB">
-          <v:rect id="_x0000_i1134" style="width:0;height:1.5pt" o:hralign="center" o:hrstd="t" o:hr="t" fillcolor="#a0a0a0" stroked="f"/>
+          <v:rect id="_x0000_i1026" style="width:0;height:1.5pt" o:hralign="center" o:hrstd="t" o:hr="t" fillcolor="#a0a0a0" stroked="f"/>
         </w:pict>
       </w:r>
     </w:p>
@@ -1268,21 +1454,34 @@
     </w:p>
     <w:p>
       <w:r>
-        <w:t>return Response.redirect(`${</w:t>
-      </w:r>
+        <w:t xml:space="preserve">return </w:t>
+      </w:r>
+      <w:proofErr w:type="spellStart"/>
+      <w:r>
+        <w:t>Response.redirect</w:t>
+      </w:r>
+      <w:proofErr w:type="spellEnd"/>
+      <w:r>
+        <w:t>(`${</w:t>
+      </w:r>
+      <w:proofErr w:type="spellStart"/>
       <w:proofErr w:type="gramStart"/>
       <w:r>
         <w:t>process.env.NEXT</w:t>
       </w:r>
       <w:proofErr w:type="gramEnd"/>
       <w:r>
-        <w:t>_PUBLIC_HOST}/order`, 302);</w:t>
+        <w:t>_PUBLIC_HOST</w:t>
+      </w:r>
+      <w:proofErr w:type="spellEnd"/>
+      <w:r>
+        <w:t>}/order`, 302);</w:t>
       </w:r>
     </w:p>
     <w:p>
       <w:r>
         <w:pict w14:anchorId="7647B887">
-          <v:rect id="_x0000_i1135" style="width:0;height:1.5pt" o:hralign="center" o:hrstd="t" o:hr="t" fillcolor="#a0a0a0" stroked="f"/>
+          <v:rect id="_x0000_i1027" style="width:0;height:1.5pt" o:hralign="center" o:hrstd="t" o:hr="t" fillcolor="#a0a0a0" stroked="f"/>
         </w:pict>
       </w:r>
     </w:p>
@@ -1316,7 +1515,15 @@
     </w:p>
     <w:p>
       <w:r>
-        <w:t xml:space="preserve">return Response.redirect(new </w:t>
+        <w:t xml:space="preserve">return </w:t>
+      </w:r>
+      <w:proofErr w:type="spellStart"/>
+      <w:r>
+        <w:t>Response.redirect</w:t>
+      </w:r>
+      <w:proofErr w:type="spellEnd"/>
+      <w:r>
+        <w:t xml:space="preserve">(new </w:t>
       </w:r>
       <w:proofErr w:type="gramStart"/>
       <w:r>
@@ -1375,7 +1582,7 @@
     <w:p>
       <w:r>
         <w:pict w14:anchorId="387F0E27">
-          <v:rect id="_x0000_i1136" style="width:0;height:1.5pt" o:hralign="center" o:hrstd="t" o:hr="t" fillcolor="#a0a0a0" stroked="f"/>
+          <v:rect id="_x0000_i1028" style="width:0;height:1.5pt" o:hralign="center" o:hrstd="t" o:hr="t" fillcolor="#a0a0a0" stroked="f"/>
         </w:pict>
       </w:r>
     </w:p>
@@ -1434,7 +1641,7 @@
     <w:p>
       <w:r>
         <w:pict w14:anchorId="7D4EB26D">
-          <v:rect id="_x0000_i1137" style="width:0;height:1.5pt" o:hralign="center" o:hrstd="t" o:hr="t" fillcolor="#a0a0a0" stroked="f"/>
+          <v:rect id="_x0000_i1029" style="width:0;height:1.5pt" o:hralign="center" o:hrstd="t" o:hr="t" fillcolor="#a0a0a0" stroked="f"/>
         </w:pict>
       </w:r>
     </w:p>
@@ -1462,8 +1669,13 @@
       </w:r>
     </w:p>
     <w:p>
-      <w:r>
-        <w:t xml:space="preserve">Response.redirect needs a full URL, so use new </w:t>
+      <w:proofErr w:type="spellStart"/>
+      <w:r>
+        <w:t>Response.redirect</w:t>
+      </w:r>
+      <w:proofErr w:type="spellEnd"/>
+      <w:r>
+        <w:t xml:space="preserve"> needs a full URL, so use new </w:t>
       </w:r>
       <w:proofErr w:type="gramStart"/>
       <w:r>
@@ -1477,7 +1689,7 @@
     <w:p>
       <w:r>
         <w:pict w14:anchorId="4F1FEBA5">
-          <v:rect id="_x0000_i1138" style="width:0;height:1.5pt" o:hralign="center" o:hrstd="t" o:hr="t" fillcolor="#a0a0a0" stroked="f"/>
+          <v:rect id="_x0000_i1030" style="width:0;height:1.5pt" o:hralign="center" o:hrstd="t" o:hr="t" fillcolor="#a0a0a0" stroked="f"/>
         </w:pict>
       </w:r>
     </w:p>
@@ -1506,7 +1718,23 @@
           <w:b/>
           <w:bCs/>
         </w:rPr>
-        <w:t>) vs Response.redirect() (important distinction)</w:t>
+        <w:t xml:space="preserve">) vs </w:t>
+      </w:r>
+      <w:proofErr w:type="spellStart"/>
+      <w:r>
+        <w:rPr>
+          <w:b/>
+          <w:bCs/>
+        </w:rPr>
+        <w:t>Response.redirect</w:t>
+      </w:r>
+      <w:proofErr w:type="spellEnd"/>
+      <w:r>
+        <w:rPr>
+          <w:b/>
+          <w:bCs/>
+        </w:rPr>
+        <w:t>() (important distinction)</w:t>
       </w:r>
       <w:r>
         <w:t>.</w:t>
@@ -1561,7 +1789,23 @@
           <w:b/>
           <w:bCs/>
         </w:rPr>
-        <w:t xml:space="preserve"> Why Response.redirect() needs full URL</w:t>
+        <w:t xml:space="preserve"> Why </w:t>
+      </w:r>
+      <w:proofErr w:type="spellStart"/>
+      <w:r>
+        <w:rPr>
+          <w:b/>
+          <w:bCs/>
+        </w:rPr>
+        <w:t>Response.redirect</w:t>
+      </w:r>
+      <w:proofErr w:type="spellEnd"/>
+      <w:r>
+        <w:rPr>
+          <w:b/>
+          <w:bCs/>
+        </w:rPr>
+        <w:t>() needs full URL</w:t>
       </w:r>
     </w:p>
     <w:p>
@@ -1588,7 +1832,7 @@
     <w:p>
       <w:r>
         <w:pict w14:anchorId="7146F152">
-          <v:rect id="_x0000_i1181" style="width:0;height:1.5pt" o:hralign="center" o:hrstd="t" o:hr="t" fillcolor="#a0a0a0" stroked="f"/>
+          <v:rect id="_x0000_i1031" style="width:0;height:1.5pt" o:hralign="center" o:hrstd="t" o:hr="t" fillcolor="#a0a0a0" stroked="f"/>
         </w:pict>
       </w:r>
     </w:p>
@@ -1631,10 +1875,12 @@
       </w:r>
     </w:p>
     <w:p>
+      <w:proofErr w:type="spellStart"/>
       <w:proofErr w:type="gramStart"/>
       <w:r>
         <w:t>window.location</w:t>
       </w:r>
+      <w:proofErr w:type="spellEnd"/>
       <w:proofErr w:type="gramEnd"/>
       <w:r>
         <w:t xml:space="preserve"> = "/order"</w:t>
@@ -1681,7 +1927,7 @@
     <w:p>
       <w:r>
         <w:pict w14:anchorId="49A4CC93">
-          <v:rect id="_x0000_i1182" style="width:0;height:1.5pt" o:hralign="center" o:hrstd="t" o:hr="t" fillcolor="#a0a0a0" stroked="f"/>
+          <v:rect id="_x0000_i1032" style="width:0;height:1.5pt" o:hralign="center" o:hrstd="t" o:hr="t" fillcolor="#a0a0a0" stroked="f"/>
         </w:pict>
       </w:r>
     </w:p>
@@ -1701,8 +1947,13 @@
       </w:r>
     </w:p>
     <w:p>
-      <w:r>
-        <w:t>Response.redirect("/order")</w:t>
+      <w:proofErr w:type="spellStart"/>
+      <w:r>
+        <w:t>Response.redirect</w:t>
+      </w:r>
+      <w:proofErr w:type="spellEnd"/>
+      <w:r>
+        <w:t>("/order")</w:t>
       </w:r>
     </w:p>
     <w:p>
@@ -1798,7 +2049,7 @@
     <w:p>
       <w:r>
         <w:pict w14:anchorId="524911EC">
-          <v:rect id="_x0000_i1183" style="width:0;height:1.5pt" o:hralign="center" o:hrstd="t" o:hr="t" fillcolor="#a0a0a0" stroked="f"/>
+          <v:rect id="_x0000_i1033" style="width:0;height:1.5pt" o:hralign="center" o:hrstd="t" o:hr="t" fillcolor="#a0a0a0" stroked="f"/>
         </w:pict>
       </w:r>
     </w:p>
@@ -1842,7 +2093,7 @@
     <w:p>
       <w:r>
         <w:pict w14:anchorId="58416180">
-          <v:rect id="_x0000_i1184" style="width:0;height:1.5pt" o:hralign="center" o:hrstd="t" o:hr="t" fillcolor="#a0a0a0" stroked="f"/>
+          <v:rect id="_x0000_i1034" style="width:0;height:1.5pt" o:hralign="center" o:hrstd="t" o:hr="t" fillcolor="#a0a0a0" stroked="f"/>
         </w:pict>
       </w:r>
     </w:p>
@@ -1907,7 +2158,7 @@
     <w:p>
       <w:r>
         <w:pict w14:anchorId="5F465260">
-          <v:rect id="_x0000_i1185" style="width:0;height:1.5pt" o:hralign="center" o:hrstd="t" o:hr="t" fillcolor="#a0a0a0" stroked="f"/>
+          <v:rect id="_x0000_i1035" style="width:0;height:1.5pt" o:hralign="center" o:hrstd="t" o:hr="t" fillcolor="#a0a0a0" stroked="f"/>
         </w:pict>
       </w:r>
     </w:p>
@@ -1975,7 +2226,7 @@
     <w:p>
       <w:r>
         <w:pict w14:anchorId="27D315C7">
-          <v:rect id="_x0000_i1186" style="width:0;height:1.5pt" o:hralign="center" o:hrstd="t" o:hr="t" fillcolor="#a0a0a0" stroked="f"/>
+          <v:rect id="_x0000_i1036" style="width:0;height:1.5pt" o:hralign="center" o:hrstd="t" o:hr="t" fillcolor="#a0a0a0" stroked="f"/>
         </w:pict>
       </w:r>
     </w:p>
@@ -2003,25 +2254,48 @@
       </w:r>
     </w:p>
     <w:p>
-      <w:r>
-        <w:t>Response.redirect() needs a full URL because the server doesn’t know the current domain, unlike the browser.</w:t>
-      </w:r>
-    </w:p>
-    <w:p>
-      <w:pPr>
-        <w:rPr>
-          <w:b/>
-          <w:bCs/>
-          <w:lang w:val="en-US"/>
-        </w:rPr>
-      </w:pPr>
-      <w:r>
-        <w:rPr>
-          <w:b/>
-          <w:bCs/>
-          <w:lang w:val="en-US"/>
-        </w:rPr>
-        <w:t>but why server don't knwo domain it can point to itself</w:t>
+      <w:proofErr w:type="spellStart"/>
+      <w:r>
+        <w:t>Response.redirect</w:t>
+      </w:r>
+      <w:proofErr w:type="spellEnd"/>
+      <w:r>
+        <w:t>() needs a full URL because the server doesn’t know the current domain, unlike the browser.</w:t>
+      </w:r>
+    </w:p>
+    <w:p>
+      <w:pPr>
+        <w:rPr>
+          <w:b/>
+          <w:bCs/>
+          <w:lang w:val="en-US"/>
+        </w:rPr>
+      </w:pPr>
+      <w:r>
+        <w:rPr>
+          <w:b/>
+          <w:bCs/>
+          <w:lang w:val="en-US"/>
+        </w:rPr>
+        <w:t xml:space="preserve">but why server don't </w:t>
+      </w:r>
+      <w:proofErr w:type="spellStart"/>
+      <w:r>
+        <w:rPr>
+          <w:b/>
+          <w:bCs/>
+          <w:lang w:val="en-US"/>
+        </w:rPr>
+        <w:t>knwo</w:t>
+      </w:r>
+      <w:proofErr w:type="spellEnd"/>
+      <w:r>
+        <w:rPr>
+          <w:b/>
+          <w:bCs/>
+          <w:lang w:val="en-US"/>
+        </w:rPr>
+        <w:t xml:space="preserve"> domain it can point to itself</w:t>
       </w:r>
     </w:p>
     <w:p>
@@ -2101,7 +2375,7 @@
     <w:p>
       <w:r>
         <w:pict w14:anchorId="4BE64276">
-          <v:rect id="_x0000_i1235" style="width:0;height:1.5pt" o:hralign="center" o:hrstd="t" o:hr="t" fillcolor="#a0a0a0" stroked="f"/>
+          <v:rect id="_x0000_i1037" style="width:0;height:1.5pt" o:hralign="center" o:hrstd="t" o:hr="t" fillcolor="#a0a0a0" stroked="f"/>
         </w:pict>
       </w:r>
     </w:p>
@@ -2174,7 +2448,7 @@
     <w:p>
       <w:r>
         <w:pict w14:anchorId="5B9085ED">
-          <v:rect id="_x0000_i1236" style="width:0;height:1.5pt" o:hralign="center" o:hrstd="t" o:hr="t" fillcolor="#a0a0a0" stroked="f"/>
+          <v:rect id="_x0000_i1038" style="width:0;height:1.5pt" o:hralign="center" o:hrstd="t" o:hr="t" fillcolor="#a0a0a0" stroked="f"/>
         </w:pict>
       </w:r>
     </w:p>
@@ -2234,7 +2508,7 @@
     <w:p>
       <w:r>
         <w:pict w14:anchorId="526EC5DD">
-          <v:rect id="_x0000_i1237" style="width:0;height:1.5pt" o:hralign="center" o:hrstd="t" o:hr="t" fillcolor="#a0a0a0" stroked="f"/>
+          <v:rect id="_x0000_i1039" style="width:0;height:1.5pt" o:hralign="center" o:hrstd="t" o:hr="t" fillcolor="#a0a0a0" stroked="f"/>
         </w:pict>
       </w:r>
     </w:p>
@@ -2315,7 +2589,7 @@
     <w:p>
       <w:r>
         <w:pict w14:anchorId="7EA99748">
-          <v:rect id="_x0000_i1238" style="width:0;height:1.5pt" o:hralign="center" o:hrstd="t" o:hr="t" fillcolor="#a0a0a0" stroked="f"/>
+          <v:rect id="_x0000_i1040" style="width:0;height:1.5pt" o:hralign="center" o:hrstd="t" o:hr="t" fillcolor="#a0a0a0" stroked="f"/>
         </w:pict>
       </w:r>
     </w:p>
@@ -2384,7 +2658,7 @@
     <w:p>
       <w:r>
         <w:pict w14:anchorId="4B1DA9DB">
-          <v:rect id="_x0000_i1239" style="width:0;height:1.5pt" o:hralign="center" o:hrstd="t" o:hr="t" fillcolor="#a0a0a0" stroked="f"/>
+          <v:rect id="_x0000_i1041" style="width:0;height:1.5pt" o:hralign="center" o:hrstd="t" o:hr="t" fillcolor="#a0a0a0" stroked="f"/>
         </w:pict>
       </w:r>
     </w:p>
@@ -2419,7 +2693,7 @@
     <w:p>
       <w:r>
         <w:pict w14:anchorId="4C0A0469">
-          <v:rect id="_x0000_i1240" style="width:0;height:1.5pt" o:hralign="center" o:hrstd="t" o:hr="t" fillcolor="#a0a0a0" stroked="f"/>
+          <v:rect id="_x0000_i1042" style="width:0;height:1.5pt" o:hralign="center" o:hrstd="t" o:hr="t" fillcolor="#a0a0a0" stroked="f"/>
         </w:pict>
       </w:r>
     </w:p>
@@ -2454,7 +2728,7 @@
     <w:p>
       <w:r>
         <w:pict w14:anchorId="3757FF6B">
-          <v:rect id="_x0000_i1241" style="width:0;height:1.5pt" o:hralign="center" o:hrstd="t" o:hr="t" fillcolor="#a0a0a0" stroked="f"/>
+          <v:rect id="_x0000_i1043" style="width:0;height:1.5pt" o:hralign="center" o:hrstd="t" o:hr="t" fillcolor="#a0a0a0" stroked="f"/>
         </w:pict>
       </w:r>
     </w:p>
@@ -2462,12 +2736,21 @@
       <w:r>
         <w:t xml:space="preserve">If you want, I can show you how this behaves in </w:t>
       </w:r>
-      <w:r>
-        <w:rPr>
-          <w:b/>
-          <w:bCs/>
-        </w:rPr>
-        <w:t>Vercel / production vs localhost</w:t>
+      <w:proofErr w:type="spellStart"/>
+      <w:r>
+        <w:rPr>
+          <w:b/>
+          <w:bCs/>
+        </w:rPr>
+        <w:t>Vercel</w:t>
+      </w:r>
+      <w:proofErr w:type="spellEnd"/>
+      <w:r>
+        <w:rPr>
+          <w:b/>
+          <w:bCs/>
+        </w:rPr>
+        <w:t xml:space="preserve"> / production vs localhost</w:t>
       </w:r>
       <w:r>
         <w:t xml:space="preserve"> (very useful insight).</w:t>
@@ -2487,7 +2770,25 @@
           <w:bCs/>
           <w:lang w:val="en-US"/>
         </w:rPr>
-        <w:t>but in old NExtjs it was possible</w:t>
+        <w:t xml:space="preserve">but in old </w:t>
+      </w:r>
+      <w:proofErr w:type="spellStart"/>
+      <w:r>
+        <w:rPr>
+          <w:b/>
+          <w:bCs/>
+          <w:lang w:val="en-US"/>
+        </w:rPr>
+        <w:t>NExtjs</w:t>
+      </w:r>
+      <w:proofErr w:type="spellEnd"/>
+      <w:r>
+        <w:rPr>
+          <w:b/>
+          <w:bCs/>
+          <w:lang w:val="en-US"/>
+        </w:rPr>
+        <w:t xml:space="preserve"> it was possible</w:t>
       </w:r>
     </w:p>
     <w:p>
@@ -2545,7 +2846,7 @@
     <w:p>
       <w:r>
         <w:pict w14:anchorId="787AE54F">
-          <v:rect id="_x0000_i1279" style="width:0;height:1.5pt" o:hralign="center" o:hrstd="t" o:hr="t" fillcolor="#a0a0a0" stroked="f"/>
+          <v:rect id="_x0000_i1044" style="width:0;height:1.5pt" o:hralign="center" o:hrstd="t" o:hr="t" fillcolor="#a0a0a0" stroked="f"/>
         </w:pict>
       </w:r>
     </w:p>
@@ -2578,10 +2879,12 @@
       </w:r>
     </w:p>
     <w:p>
+      <w:proofErr w:type="spellStart"/>
       <w:proofErr w:type="gramStart"/>
       <w:r>
         <w:t>res.redirect</w:t>
       </w:r>
+      <w:proofErr w:type="spellEnd"/>
       <w:proofErr w:type="gramEnd"/>
       <w:r>
         <w:t>("/order")</w:t>
@@ -2626,13 +2929,18 @@
       <w:r>
         <w:t>Internally used request info (</w:t>
       </w:r>
+      <w:proofErr w:type="spellStart"/>
       <w:proofErr w:type="gramStart"/>
       <w:r>
         <w:t>req.headers</w:t>
       </w:r>
       <w:proofErr w:type="gramEnd"/>
       <w:r>
-        <w:t>.host)</w:t>
+        <w:t>.host</w:t>
+      </w:r>
+      <w:proofErr w:type="spellEnd"/>
+      <w:r>
+        <w:t>)</w:t>
       </w:r>
     </w:p>
     <w:p>
@@ -2649,7 +2957,7 @@
     <w:p>
       <w:r>
         <w:pict w14:anchorId="1DBC0668">
-          <v:rect id="_x0000_i1280" style="width:0;height:1.5pt" o:hralign="center" o:hrstd="t" o:hr="t" fillcolor="#a0a0a0" stroked="f"/>
+          <v:rect id="_x0000_i1045" style="width:0;height:1.5pt" o:hralign="center" o:hrstd="t" o:hr="t" fillcolor="#a0a0a0" stroked="f"/>
         </w:pict>
       </w:r>
     </w:p>
@@ -2683,7 +2991,15 @@
     </w:p>
     <w:p>
       <w:r>
-        <w:t>return Response.redirect(...)</w:t>
+        <w:t xml:space="preserve">return </w:t>
+      </w:r>
+      <w:proofErr w:type="spellStart"/>
+      <w:r>
+        <w:t>Response.redirect</w:t>
+      </w:r>
+      <w:proofErr w:type="spellEnd"/>
+      <w:r>
+        <w:t>(...)</w:t>
       </w:r>
     </w:p>
     <w:p>
@@ -2731,7 +3047,7 @@
     <w:p>
       <w:r>
         <w:pict w14:anchorId="514E7D40">
-          <v:rect id="_x0000_i1281" style="width:0;height:1.5pt" o:hralign="center" o:hrstd="t" o:hr="t" fillcolor="#a0a0a0" stroked="f"/>
+          <v:rect id="_x0000_i1046" style="width:0;height:1.5pt" o:hralign="center" o:hrstd="t" o:hr="t" fillcolor="#a0a0a0" stroked="f"/>
         </w:pict>
       </w:r>
     </w:p>
@@ -2893,10 +3209,12 @@
             <w:hideMark/>
           </w:tcPr>
           <w:p>
+            <w:proofErr w:type="spellStart"/>
             <w:proofErr w:type="gramStart"/>
             <w:r>
               <w:t>res.redirect</w:t>
             </w:r>
+            <w:proofErr w:type="spellEnd"/>
             <w:proofErr w:type="gramEnd"/>
             <w:r>
               <w:t xml:space="preserve">("/x") </w:t>
@@ -2916,8 +3234,13 @@
             <w:hideMark/>
           </w:tcPr>
           <w:p>
+            <w:proofErr w:type="spellStart"/>
             <w:r>
-              <w:t xml:space="preserve">Response.redirect("/x") </w:t>
+              <w:t>Response.redirect</w:t>
+            </w:r>
+            <w:proofErr w:type="spellEnd"/>
+            <w:r>
+              <w:t xml:space="preserve">("/x") </w:t>
             </w:r>
             <w:r>
               <w:rPr>
@@ -2932,7 +3255,7 @@
     <w:p>
       <w:r>
         <w:pict w14:anchorId="4B27E64D">
-          <v:rect id="_x0000_i1282" style="width:0;height:1.5pt" o:hralign="center" o:hrstd="t" o:hr="t" fillcolor="#a0a0a0" stroked="f"/>
+          <v:rect id="_x0000_i1047" style="width:0;height:1.5pt" o:hralign="center" o:hrstd="t" o:hr="t" fillcolor="#a0a0a0" stroked="f"/>
         </w:pict>
       </w:r>
     </w:p>
@@ -3006,7 +3329,7 @@
     <w:p>
       <w:r>
         <w:pict w14:anchorId="54BB00F2">
-          <v:rect id="_x0000_i1283" style="width:0;height:1.5pt" o:hralign="center" o:hrstd="t" o:hr="t" fillcolor="#a0a0a0" stroked="f"/>
+          <v:rect id="_x0000_i1048" style="width:0;height:1.5pt" o:hralign="center" o:hrstd="t" o:hr="t" fillcolor="#a0a0a0" stroked="f"/>
         </w:pict>
       </w:r>
     </w:p>
@@ -3042,13 +3365,23 @@
       <w:r>
         <w:t xml:space="preserve">In old Next.js, </w:t>
       </w:r>
+      <w:proofErr w:type="spellStart"/>
       <w:proofErr w:type="gramStart"/>
       <w:r>
         <w:t>res.redirect</w:t>
       </w:r>
+      <w:proofErr w:type="spellEnd"/>
       <w:proofErr w:type="gramEnd"/>
       <w:r>
-        <w:t xml:space="preserve"> auto-built the full URL, but modern Next.js uses standard Response.redirect, which requires a full URL.</w:t>
+        <w:t xml:space="preserve"> auto-built the full URL, but modern Next.js uses standard </w:t>
+      </w:r>
+      <w:proofErr w:type="spellStart"/>
+      <w:r>
+        <w:t>Response.redirect</w:t>
+      </w:r>
+      <w:proofErr w:type="spellEnd"/>
+      <w:r>
+        <w:t>, which requires a full URL.</w:t>
       </w:r>
     </w:p>
     <w:p>
@@ -3211,6 +3544,958 @@
           <w:lang w:val="en-US"/>
         </w:rPr>
         <w:t>)</w:t>
+      </w:r>
+    </w:p>
+    <w:p>
+      <w:pPr>
+        <w:rPr>
+          <w:b/>
+          <w:bCs/>
+          <w:lang w:val="en-US"/>
+        </w:rPr>
+      </w:pPr>
+      <w:r>
+        <w:rPr>
+          <w:b/>
+          <w:bCs/>
+          <w:lang w:val="en-US"/>
+        </w:rPr>
+        <w:t xml:space="preserve">tell us in what </w:t>
+      </w:r>
+      <w:proofErr w:type="spellStart"/>
+      <w:r>
+        <w:rPr>
+          <w:b/>
+          <w:bCs/>
+          <w:lang w:val="en-US"/>
+        </w:rPr>
+        <w:t>scenerio</w:t>
+      </w:r>
+      <w:proofErr w:type="spellEnd"/>
+      <w:r>
+        <w:rPr>
+          <w:b/>
+          <w:bCs/>
+          <w:lang w:val="en-US"/>
+        </w:rPr>
+        <w:t xml:space="preserve"> the payme</w:t>
+      </w:r>
+      <w:r>
+        <w:rPr>
+          <w:b/>
+          <w:bCs/>
+          <w:lang w:val="en-US"/>
+        </w:rPr>
+        <w:t>n</w:t>
+      </w:r>
+      <w:r>
+        <w:rPr>
+          <w:b/>
+          <w:bCs/>
+          <w:lang w:val="en-US"/>
+        </w:rPr>
+        <w:t xml:space="preserve">t is </w:t>
+      </w:r>
+      <w:proofErr w:type="gramStart"/>
+      <w:r>
+        <w:rPr>
+          <w:b/>
+          <w:bCs/>
+          <w:lang w:val="en-US"/>
+        </w:rPr>
+        <w:t>pen</w:t>
+      </w:r>
+      <w:r>
+        <w:rPr>
+          <w:b/>
+          <w:bCs/>
+          <w:lang w:val="en-US"/>
+        </w:rPr>
+        <w:t>d</w:t>
+      </w:r>
+      <w:r>
+        <w:rPr>
+          <w:b/>
+          <w:bCs/>
+          <w:lang w:val="en-US"/>
+        </w:rPr>
+        <w:t>ing(</w:t>
+      </w:r>
+      <w:proofErr w:type="gramEnd"/>
+      <w:r>
+        <w:rPr>
+          <w:b/>
+          <w:bCs/>
+          <w:lang w:val="en-US"/>
+        </w:rPr>
+        <w:t>very short)</w:t>
+      </w:r>
+    </w:p>
+    <w:p>
+      <w:r>
+        <w:rPr>
+          <w:rFonts w:ascii="Segoe UI Emoji" w:hAnsi="Segoe UI Emoji" w:cs="Segoe UI Emoji"/>
+        </w:rPr>
+        <w:t>✔️</w:t>
+      </w:r>
+      <w:r>
+        <w:t xml:space="preserve"> Payment is </w:t>
+      </w:r>
+      <w:r>
+        <w:rPr>
+          <w:b/>
+          <w:bCs/>
+        </w:rPr>
+        <w:t>PENDING</w:t>
+      </w:r>
+      <w:r>
+        <w:t xml:space="preserve"> when the user has started payment but </w:t>
+      </w:r>
+      <w:r>
+        <w:rPr>
+          <w:b/>
+          <w:bCs/>
+        </w:rPr>
+        <w:t>has not completed it yet</w:t>
+      </w:r>
+      <w:r>
+        <w:t xml:space="preserve"> (e.g., OTP not entered, UPI not approved, or bank response delayed).</w:t>
+      </w:r>
+    </w:p>
+    <w:p>
+      <w:pPr>
+        <w:rPr>
+          <w:b/>
+          <w:bCs/>
+          <w:lang w:val="en-US"/>
+        </w:rPr>
+      </w:pPr>
+      <w:proofErr w:type="spellStart"/>
+      <w:r>
+        <w:rPr>
+          <w:b/>
+          <w:bCs/>
+          <w:lang w:val="en-US"/>
+        </w:rPr>
+        <w:t>no</w:t>
+      </w:r>
+      <w:proofErr w:type="spellEnd"/>
+      <w:r>
+        <w:rPr>
+          <w:b/>
+          <w:bCs/>
+          <w:lang w:val="en-US"/>
+        </w:rPr>
+        <w:t xml:space="preserve"> in terms of staging</w:t>
+      </w:r>
+    </w:p>
+    <w:p>
+      <w:r>
+        <w:t>Got it—</w:t>
+      </w:r>
+      <w:r>
+        <w:rPr>
+          <w:b/>
+          <w:bCs/>
+        </w:rPr>
+        <w:t>in staging (test environment)</w:t>
+      </w:r>
+      <w:r>
+        <w:t xml:space="preserve"> </w:t>
+      </w:r>
+      <w:r>
+        <w:rPr>
+          <w:rFonts w:ascii="Segoe UI Emoji" w:hAnsi="Segoe UI Emoji" w:cs="Segoe UI Emoji"/>
+        </w:rPr>
+        <w:t>👍</w:t>
+      </w:r>
+    </w:p>
+    <w:p>
+      <w:r>
+        <w:rPr>
+          <w:rFonts w:ascii="Segoe UI Emoji" w:hAnsi="Segoe UI Emoji" w:cs="Segoe UI Emoji"/>
+        </w:rPr>
+        <w:t>✔️</w:t>
+      </w:r>
+      <w:r>
+        <w:t xml:space="preserve"> Payment becomes </w:t>
+      </w:r>
+      <w:r>
+        <w:rPr>
+          <w:b/>
+          <w:bCs/>
+        </w:rPr>
+        <w:t>PENDING</w:t>
+      </w:r>
+      <w:r>
+        <w:t xml:space="preserve"> when you </w:t>
+      </w:r>
+      <w:r>
+        <w:rPr>
+          <w:b/>
+          <w:bCs/>
+        </w:rPr>
+        <w:t>don’t complete the test payment flow</w:t>
+      </w:r>
+    </w:p>
+    <w:p>
+      <w:r>
+        <w:pict w14:anchorId="015EB9B2">
+          <v:rect id="_x0000_i1049" style="width:0;height:1.5pt" o:hralign="center" o:hrstd="t" o:hr="t" fillcolor="#a0a0a0" stroked="f"/>
+        </w:pict>
+      </w:r>
+    </w:p>
+    <w:p>
+      <w:pPr>
+        <w:rPr>
+          <w:b/>
+          <w:bCs/>
+        </w:rPr>
+      </w:pPr>
+      <w:r>
+        <w:rPr>
+          <w:rFonts w:ascii="Segoe UI Emoji" w:hAnsi="Segoe UI Emoji" w:cs="Segoe UI Emoji"/>
+          <w:b/>
+          <w:bCs/>
+        </w:rPr>
+        <w:t>🎯</w:t>
+      </w:r>
+      <w:r>
+        <w:rPr>
+          <w:b/>
+          <w:bCs/>
+        </w:rPr>
+        <w:t xml:space="preserve"> Very short scenarios (staging)</w:t>
+      </w:r>
+    </w:p>
+    <w:p>
+      <w:pPr>
+        <w:numPr>
+          <w:ilvl w:val="0"/>
+          <w:numId w:val="10"/>
+        </w:numPr>
+      </w:pPr>
+      <w:r>
+        <w:t xml:space="preserve">You </w:t>
+      </w:r>
+      <w:r>
+        <w:rPr>
+          <w:b/>
+          <w:bCs/>
+        </w:rPr>
+        <w:t>don’t click “Success”</w:t>
+      </w:r>
+      <w:r>
+        <w:t xml:space="preserve"> on Paytm test page</w:t>
+      </w:r>
+    </w:p>
+    <w:p>
+      <w:pPr>
+        <w:numPr>
+          <w:ilvl w:val="0"/>
+          <w:numId w:val="10"/>
+        </w:numPr>
+      </w:pPr>
+      <w:r>
+        <w:lastRenderedPageBreak/>
+        <w:t xml:space="preserve">You </w:t>
+      </w:r>
+      <w:r>
+        <w:rPr>
+          <w:b/>
+          <w:bCs/>
+        </w:rPr>
+        <w:t>close/refresh the page</w:t>
+      </w:r>
+    </w:p>
+    <w:p>
+      <w:pPr>
+        <w:numPr>
+          <w:ilvl w:val="0"/>
+          <w:numId w:val="10"/>
+        </w:numPr>
+      </w:pPr>
+      <w:r>
+        <w:t xml:space="preserve">You </w:t>
+      </w:r>
+      <w:r>
+        <w:rPr>
+          <w:b/>
+          <w:bCs/>
+        </w:rPr>
+        <w:t>don’t approve UPI / OTP</w:t>
+      </w:r>
+    </w:p>
+    <w:p>
+      <w:pPr>
+        <w:numPr>
+          <w:ilvl w:val="0"/>
+          <w:numId w:val="10"/>
+        </w:numPr>
+      </w:pPr>
+      <w:r>
+        <w:t xml:space="preserve">You </w:t>
+      </w:r>
+      <w:r>
+        <w:rPr>
+          <w:b/>
+          <w:bCs/>
+        </w:rPr>
+        <w:t>leave the payment incomplete</w:t>
+      </w:r>
+    </w:p>
+    <w:p>
+      <w:r>
+        <w:pict w14:anchorId="2A06A480">
+          <v:rect id="_x0000_i1050" style="width:0;height:1.5pt" o:hralign="center" o:hrstd="t" o:hr="t" fillcolor="#a0a0a0" stroked="f"/>
+        </w:pict>
+      </w:r>
+    </w:p>
+    <w:p>
+      <w:pPr>
+        <w:rPr>
+          <w:b/>
+          <w:bCs/>
+        </w:rPr>
+      </w:pPr>
+      <w:r>
+        <w:rPr>
+          <w:rFonts w:ascii="Segoe UI Emoji" w:hAnsi="Segoe UI Emoji" w:cs="Segoe UI Emoji"/>
+          <w:b/>
+          <w:bCs/>
+        </w:rPr>
+        <w:t>🧾</w:t>
+      </w:r>
+      <w:r>
+        <w:rPr>
+          <w:b/>
+          <w:bCs/>
+        </w:rPr>
+        <w:t xml:space="preserve"> Meaning</w:t>
+      </w:r>
+    </w:p>
+    <w:p>
+      <w:r>
+        <w:rPr>
+          <w:rFonts w:ascii="Segoe UI Emoji" w:hAnsi="Segoe UI Emoji" w:cs="Segoe UI Emoji"/>
+        </w:rPr>
+        <w:t>✔️</w:t>
+      </w:r>
+      <w:r>
+        <w:t xml:space="preserve"> Paytm is still “waiting” for user action → so STATUS = PENDING</w:t>
+      </w:r>
+    </w:p>
+    <w:p>
+      <w:r>
+        <w:pict w14:anchorId="5BE19D3D">
+          <v:rect id="_x0000_i1051" style="width:0;height:1.5pt" o:hralign="center" o:hrstd="t" o:hr="t" fillcolor="#a0a0a0" stroked="f"/>
+        </w:pict>
+      </w:r>
+    </w:p>
+    <w:p>
+      <w:pPr>
+        <w:rPr>
+          <w:b/>
+          <w:bCs/>
+        </w:rPr>
+      </w:pPr>
+      <w:r>
+        <w:rPr>
+          <w:rFonts w:ascii="Segoe UI Emoji" w:hAnsi="Segoe UI Emoji" w:cs="Segoe UI Emoji"/>
+          <w:b/>
+          <w:bCs/>
+        </w:rPr>
+        <w:t>🚀</w:t>
+      </w:r>
+      <w:r>
+        <w:rPr>
+          <w:b/>
+          <w:bCs/>
+        </w:rPr>
+        <w:t xml:space="preserve"> One-line answer</w:t>
+      </w:r>
+    </w:p>
+    <w:p>
+      <w:r>
+        <w:t>In staging, payment is PENDING when you don’t complete the test payment (no success/failure action taken).</w:t>
+      </w:r>
+    </w:p>
+    <w:p>
+      <w:pPr>
+        <w:rPr>
+          <w:b/>
+          <w:bCs/>
+          <w:lang w:val="en-US"/>
+        </w:rPr>
+      </w:pPr>
+      <w:proofErr w:type="gramStart"/>
+      <w:r>
+        <w:rPr>
+          <w:b/>
+          <w:bCs/>
+          <w:lang w:val="en-US"/>
+        </w:rPr>
+        <w:t>so</w:t>
+      </w:r>
+      <w:proofErr w:type="gramEnd"/>
+      <w:r>
+        <w:rPr>
+          <w:b/>
+          <w:bCs/>
+          <w:lang w:val="en-US"/>
+        </w:rPr>
+        <w:t xml:space="preserve"> by pen</w:t>
+      </w:r>
+      <w:r>
+        <w:rPr>
+          <w:b/>
+          <w:bCs/>
+          <w:lang w:val="en-US"/>
+        </w:rPr>
+        <w:t>d</w:t>
+      </w:r>
+      <w:r>
+        <w:rPr>
+          <w:b/>
+          <w:bCs/>
+          <w:lang w:val="en-US"/>
+        </w:rPr>
+        <w:t xml:space="preserve">ing means user started the transaction but </w:t>
+      </w:r>
+      <w:proofErr w:type="spellStart"/>
+      <w:r>
+        <w:rPr>
+          <w:b/>
+          <w:bCs/>
+          <w:lang w:val="en-US"/>
+        </w:rPr>
+        <w:t>thwn</w:t>
+      </w:r>
+      <w:proofErr w:type="spellEnd"/>
+      <w:r>
+        <w:rPr>
+          <w:b/>
+          <w:bCs/>
+          <w:lang w:val="en-US"/>
+        </w:rPr>
+        <w:t xml:space="preserve"> in between like waiting for </w:t>
+      </w:r>
+      <w:proofErr w:type="spellStart"/>
+      <w:r>
+        <w:rPr>
+          <w:b/>
+          <w:bCs/>
+          <w:lang w:val="en-US"/>
+        </w:rPr>
+        <w:t>otp</w:t>
+      </w:r>
+      <w:proofErr w:type="spellEnd"/>
+      <w:r>
+        <w:rPr>
+          <w:b/>
+          <w:bCs/>
+          <w:lang w:val="en-US"/>
+        </w:rPr>
+        <w:t xml:space="preserve"> closed </w:t>
+      </w:r>
+      <w:proofErr w:type="spellStart"/>
+      <w:r>
+        <w:rPr>
+          <w:b/>
+          <w:bCs/>
+          <w:lang w:val="en-US"/>
+        </w:rPr>
+        <w:t>teh</w:t>
+      </w:r>
+      <w:proofErr w:type="spellEnd"/>
+      <w:r>
+        <w:rPr>
+          <w:b/>
+          <w:bCs/>
+          <w:lang w:val="en-US"/>
+        </w:rPr>
+        <w:t xml:space="preserve"> website (</w:t>
+      </w:r>
+      <w:proofErr w:type="spellStart"/>
+      <w:r>
+        <w:rPr>
+          <w:b/>
+          <w:bCs/>
+          <w:lang w:val="en-US"/>
+        </w:rPr>
+        <w:t>oneliner</w:t>
+      </w:r>
+      <w:proofErr w:type="spellEnd"/>
+      <w:r>
+        <w:rPr>
+          <w:b/>
+          <w:bCs/>
+          <w:lang w:val="en-US"/>
+        </w:rPr>
+        <w:t>)</w:t>
+      </w:r>
+    </w:p>
+    <w:p>
+      <w:pPr>
+        <w:pBdr>
+          <w:bottom w:val="single" w:sz="12" w:space="1" w:color="auto"/>
+        </w:pBdr>
+      </w:pPr>
+      <w:r>
+        <w:rPr>
+          <w:rFonts w:ascii="Segoe UI Emoji" w:hAnsi="Segoe UI Emoji" w:cs="Segoe UI Emoji"/>
+        </w:rPr>
+        <w:t>✔️</w:t>
+      </w:r>
+      <w:r>
+        <w:t xml:space="preserve"> Yes—PENDING means the user started the transaction but didn’t complete it (e.g., closed the page while waiting for OTP/approval).</w:t>
+      </w:r>
+    </w:p>
+    <w:p>
+      <w:pPr>
+        <w:rPr>
+          <w:b/>
+          <w:bCs/>
+          <w:lang w:val="en-US"/>
+        </w:rPr>
+      </w:pPr>
+      <w:r>
+        <w:rPr>
+          <w:b/>
+          <w:bCs/>
+          <w:lang w:val="en-US"/>
+        </w:rPr>
+        <w:t>New Lesson</w:t>
+      </w:r>
+    </w:p>
+    <w:p>
+      <w:pPr>
+        <w:rPr>
+          <w:lang w:val="en-US"/>
+        </w:rPr>
+      </w:pPr>
+      <w:r>
+        <w:rPr>
+          <w:lang w:val="en-US"/>
+        </w:rPr>
+        <w:t>If you have visited any website then you might know that there is order page and then there is orders page</w:t>
+      </w:r>
+      <w:r>
+        <w:rPr>
+          <w:lang w:val="en-US"/>
+        </w:rPr>
+        <w:t xml:space="preserve"> in order page there is information of a particular order</w:t>
+      </w:r>
+      <w:r>
+        <w:rPr>
+          <w:lang w:val="en-US"/>
+        </w:rPr>
+        <w:t xml:space="preserve"> having an order id </w:t>
+      </w:r>
+      <w:r>
+        <w:rPr>
+          <w:lang w:val="en-US"/>
+        </w:rPr>
+        <w:t xml:space="preserve">which have all the details </w:t>
+      </w:r>
+      <w:r>
+        <w:rPr>
+          <w:lang w:val="en-US"/>
+        </w:rPr>
+        <w:t>of a particular order</w:t>
+      </w:r>
+      <w:r>
+        <w:rPr>
+          <w:lang w:val="en-US"/>
+        </w:rPr>
+        <w:t xml:space="preserve">. </w:t>
+      </w:r>
+      <w:r>
+        <w:rPr>
+          <w:lang w:val="en-US"/>
+        </w:rPr>
+        <w:t xml:space="preserve">And in orders page al the orders </w:t>
+      </w:r>
+      <w:r>
+        <w:rPr>
+          <w:lang w:val="en-US"/>
+        </w:rPr>
+        <w:t xml:space="preserve">of a user </w:t>
+      </w:r>
+      <w:r>
+        <w:rPr>
+          <w:lang w:val="en-US"/>
+        </w:rPr>
+        <w:t xml:space="preserve">are </w:t>
+      </w:r>
+      <w:r>
+        <w:rPr>
+          <w:lang w:val="en-US"/>
+        </w:rPr>
+        <w:t>present there</w:t>
+      </w:r>
+      <w:r>
+        <w:rPr>
+          <w:lang w:val="en-US"/>
+        </w:rPr>
+        <w:t xml:space="preserve"> so the they can choose an order and track it (maybe </w:t>
+      </w:r>
+      <w:proofErr w:type="gramStart"/>
+      <w:r>
+        <w:rPr>
+          <w:lang w:val="en-US"/>
+        </w:rPr>
+        <w:t>opening  a</w:t>
+      </w:r>
+      <w:proofErr w:type="gramEnd"/>
+      <w:r>
+        <w:rPr>
+          <w:lang w:val="en-US"/>
+        </w:rPr>
+        <w:t xml:space="preserve"> particular order page of order in orders page)</w:t>
+      </w:r>
+      <w:r>
+        <w:rPr>
+          <w:lang w:val="en-US"/>
+        </w:rPr>
+        <w:t xml:space="preserve"> </w:t>
+      </w:r>
+      <w:r>
+        <w:rPr>
+          <w:lang w:val="en-US"/>
+        </w:rPr>
+        <w:t>and regarding that if</w:t>
+      </w:r>
+      <w:r>
+        <w:rPr>
+          <w:lang w:val="en-US"/>
+        </w:rPr>
+        <w:t xml:space="preserve"> we want to tak</w:t>
+      </w:r>
+      <w:r>
+        <w:rPr>
+          <w:lang w:val="en-US"/>
+        </w:rPr>
+        <w:t>e</w:t>
+      </w:r>
+      <w:r>
+        <w:rPr>
+          <w:lang w:val="en-US"/>
+        </w:rPr>
+        <w:t xml:space="preserve"> resolution </w:t>
+      </w:r>
+      <w:r>
+        <w:rPr>
+          <w:lang w:val="en-US"/>
+        </w:rPr>
+        <w:t xml:space="preserve">from customer help </w:t>
+      </w:r>
+      <w:proofErr w:type="gramStart"/>
+      <w:r>
+        <w:rPr>
+          <w:lang w:val="en-US"/>
+        </w:rPr>
+        <w:t>desk(</w:t>
+      </w:r>
+      <w:proofErr w:type="gramEnd"/>
+      <w:r>
+        <w:rPr>
+          <w:lang w:val="en-US"/>
+        </w:rPr>
+        <w:t>who knows)</w:t>
+      </w:r>
+      <w:r>
+        <w:rPr>
+          <w:lang w:val="en-US"/>
+        </w:rPr>
+        <w:t xml:space="preserve"> then it can quote order </w:t>
+      </w:r>
+      <w:proofErr w:type="gramStart"/>
+      <w:r>
+        <w:rPr>
+          <w:lang w:val="en-US"/>
+        </w:rPr>
+        <w:t xml:space="preserve">id </w:t>
+      </w:r>
+      <w:r>
+        <w:rPr>
+          <w:lang w:val="en-US"/>
+        </w:rPr>
+        <w:t xml:space="preserve"> and</w:t>
+      </w:r>
+      <w:proofErr w:type="gramEnd"/>
+      <w:r>
+        <w:rPr>
+          <w:lang w:val="en-US"/>
+        </w:rPr>
+        <w:t xml:space="preserve"> take </w:t>
+      </w:r>
+      <w:r>
+        <w:rPr>
+          <w:lang w:val="en-US"/>
+        </w:rPr>
+        <w:t xml:space="preserve">resolution. </w:t>
+      </w:r>
+    </w:p>
+    <w:p>
+      <w:pPr>
+        <w:rPr>
+          <w:b/>
+          <w:bCs/>
+        </w:rPr>
+      </w:pPr>
+      <w:r>
+        <w:rPr>
+          <w:rFonts w:ascii="Segoe UI Emoji" w:hAnsi="Segoe UI Emoji" w:cs="Segoe UI Emoji"/>
+        </w:rPr>
+        <w:t>✔️</w:t>
+      </w:r>
+      <w:r>
+        <w:t xml:space="preserve"> </w:t>
+      </w:r>
+      <w:r>
+        <w:rPr>
+          <w:b/>
+          <w:bCs/>
+        </w:rPr>
+        <w:t>Resolution = the issue/problem is fixed or settled</w:t>
+      </w:r>
+    </w:p>
+    <w:p>
+      <w:pPr>
+        <w:rPr>
+          <w:lang w:val="en-US"/>
+        </w:rPr>
+      </w:pPr>
+      <w:proofErr w:type="spellStart"/>
+      <w:r>
+        <w:rPr>
+          <w:lang w:val="en-US"/>
+        </w:rPr>
+        <w:t>F</w:t>
+      </w:r>
+      <w:r>
+        <w:rPr>
+          <w:lang w:val="en-US"/>
+        </w:rPr>
+        <w:t>in</w:t>
+      </w:r>
+      <w:r>
+        <w:rPr>
+          <w:lang w:val="en-US"/>
+        </w:rPr>
+        <w:t>d</w:t>
+      </w:r>
+      <w:r>
+        <w:rPr>
+          <w:lang w:val="en-US"/>
+        </w:rPr>
+        <w:t>One</w:t>
+      </w:r>
+      <w:r>
+        <w:rPr>
+          <w:lang w:val="en-US"/>
+        </w:rPr>
+        <w:t>AndUpdate</w:t>
+      </w:r>
+      <w:proofErr w:type="spellEnd"/>
+      <w:r>
+        <w:rPr>
+          <w:lang w:val="en-US"/>
+        </w:rPr>
+        <w:t xml:space="preserve"> </w:t>
+      </w:r>
+      <w:r>
+        <w:rPr>
+          <w:lang w:val="en-US"/>
+        </w:rPr>
+        <w:t>re</w:t>
+      </w:r>
+      <w:r>
+        <w:rPr>
+          <w:lang w:val="en-US"/>
+        </w:rPr>
+        <w:t>t</w:t>
+      </w:r>
+      <w:r>
+        <w:rPr>
+          <w:lang w:val="en-US"/>
+        </w:rPr>
+        <w:t>urn the original unaltered document.</w:t>
+      </w:r>
+    </w:p>
+    <w:p>
+      <w:pPr>
+        <w:rPr>
+          <w:b/>
+          <w:bCs/>
+          <w:lang w:val="en-US"/>
+        </w:rPr>
+      </w:pPr>
+      <w:proofErr w:type="gramStart"/>
+      <w:r>
+        <w:rPr>
+          <w:b/>
+          <w:bCs/>
+          <w:lang w:val="en-US"/>
+        </w:rPr>
+        <w:t>Note:-</w:t>
+      </w:r>
+      <w:proofErr w:type="gramEnd"/>
+    </w:p>
+    <w:p>
+      <w:pPr>
+        <w:pBdr>
+          <w:bottom w:val="single" w:sz="12" w:space="1" w:color="auto"/>
+        </w:pBdr>
+        <w:rPr>
+          <w:b/>
+          <w:bCs/>
+          <w:color w:val="EE0000"/>
+          <w:lang w:val="en-US"/>
+        </w:rPr>
+      </w:pPr>
+      <w:r>
+        <w:rPr>
+          <w:b/>
+          <w:bCs/>
+          <w:color w:val="EE0000"/>
+          <w:lang w:val="en-US"/>
+        </w:rPr>
+        <w:t xml:space="preserve">WE can get the data from the token by verify method of </w:t>
+      </w:r>
+      <w:proofErr w:type="spellStart"/>
+      <w:r>
+        <w:rPr>
+          <w:b/>
+          <w:bCs/>
+          <w:color w:val="EE0000"/>
+          <w:lang w:val="en-US"/>
+        </w:rPr>
+        <w:t>jwt</w:t>
+      </w:r>
+      <w:proofErr w:type="spellEnd"/>
+      <w:r>
+        <w:rPr>
+          <w:b/>
+          <w:bCs/>
+          <w:color w:val="EE0000"/>
+          <w:lang w:val="en-US"/>
+        </w:rPr>
+        <w:t xml:space="preserve"> object</w:t>
+      </w:r>
+    </w:p>
+    <w:p>
+      <w:pPr>
+        <w:rPr>
+          <w:b/>
+          <w:bCs/>
+          <w:lang w:val="en-US"/>
+        </w:rPr>
+      </w:pPr>
+      <w:r>
+        <w:rPr>
+          <w:b/>
+          <w:bCs/>
+          <w:lang w:val="en-US"/>
+        </w:rPr>
+        <w:t xml:space="preserve">Now we thing modern </w:t>
+      </w:r>
+      <w:proofErr w:type="spellStart"/>
+      <w:r>
+        <w:rPr>
+          <w:b/>
+          <w:bCs/>
+          <w:lang w:val="en-US"/>
+        </w:rPr>
+        <w:t>Nextjs</w:t>
+      </w:r>
+      <w:proofErr w:type="spellEnd"/>
+      <w:r>
+        <w:rPr>
+          <w:b/>
+          <w:bCs/>
+          <w:lang w:val="en-US"/>
+        </w:rPr>
+        <w:t xml:space="preserve"> has a standard for id for </w:t>
+      </w:r>
+      <w:proofErr w:type="spellStart"/>
+      <w:r>
+        <w:rPr>
+          <w:b/>
+          <w:bCs/>
+          <w:lang w:val="en-US"/>
+        </w:rPr>
+        <w:t>mongodb</w:t>
+      </w:r>
+      <w:proofErr w:type="spellEnd"/>
+      <w:r>
+        <w:rPr>
+          <w:b/>
+          <w:bCs/>
+          <w:lang w:val="en-US"/>
+        </w:rPr>
+        <w:t xml:space="preserve"> otherwise </w:t>
+      </w:r>
+      <w:proofErr w:type="spellStart"/>
+      <w:r>
+        <w:rPr>
+          <w:b/>
+          <w:bCs/>
+          <w:lang w:val="en-US"/>
+        </w:rPr>
+        <w:t>findByid</w:t>
+      </w:r>
+      <w:proofErr w:type="spellEnd"/>
+      <w:r>
+        <w:rPr>
+          <w:b/>
+          <w:bCs/>
+          <w:lang w:val="en-US"/>
+        </w:rPr>
+        <w:t xml:space="preserve"> will throw an exception</w:t>
+      </w:r>
+      <w:r>
+        <w:rPr>
+          <w:b/>
+          <w:bCs/>
+          <w:lang w:val="en-US"/>
+        </w:rPr>
+        <w:t xml:space="preserve">. </w:t>
+      </w:r>
+      <w:r>
+        <w:rPr>
+          <w:b/>
+          <w:bCs/>
+          <w:lang w:val="en-US"/>
+        </w:rPr>
+        <w:t xml:space="preserve">but </w:t>
+      </w:r>
+      <w:r>
+        <w:rPr>
+          <w:b/>
+          <w:bCs/>
+          <w:lang w:val="en-US"/>
+        </w:rPr>
+        <w:t xml:space="preserve">in older version there was no such </w:t>
+      </w:r>
+      <w:proofErr w:type="spellStart"/>
+      <w:r>
+        <w:rPr>
+          <w:b/>
+          <w:bCs/>
+          <w:lang w:val="en-US"/>
+        </w:rPr>
+        <w:t>findById</w:t>
+      </w:r>
+      <w:proofErr w:type="spellEnd"/>
+      <w:r>
+        <w:rPr>
+          <w:b/>
+          <w:bCs/>
+          <w:lang w:val="en-US"/>
+        </w:rPr>
+        <w:t xml:space="preserve"> accepted it.</w:t>
       </w:r>
     </w:p>
     <w:p>
@@ -3233,6 +4518,155 @@
 <file path=word/numbering.xml><?xml version="1.0" encoding="utf-8"?>
 <w:numbering xmlns:wpc="http://schemas.microsoft.com/office/word/2010/wordprocessingCanvas" xmlns:cx="http://schemas.microsoft.com/office/drawing/2014/chartex" xmlns:cx1="http://schemas.microsoft.com/office/drawing/2015/9/8/chartex" xmlns:cx2="http://schemas.microsoft.com/office/drawing/2015/10/21/chartex" xmlns:cx3="http://schemas.microsoft.com/office/drawing/2016/5/9/chartex" xmlns:cx4="http://schemas.microsoft.com/office/drawing/2016/5/10/chartex" xmlns:cx5="http://schemas.microsoft.com/office/drawing/2016/5/11/chartex" xmlns:cx6="http://schemas.microsoft.com/office/drawing/2016/5/12/chartex" xmlns:cx7="http://schemas.microsoft.com/office/drawing/2016/5/13/chartex" xmlns:cx8="http://schemas.microsoft.com/office/drawing/2016/5/14/chartex" xmlns:mc="http://schemas.openxmlformats.org/markup-compatibility/2006" xmlns:aink="http://schemas.microsoft.com/office/drawing/2016/ink" xmlns:am3d="http://schemas.microsoft.com/office/drawing/2017/model3d" xmlns:o="urn:schemas-microsoft-com:office:office" xmlns:oel="http://schemas.microsoft.com/office/2019/extlst" xmlns:r="http://schemas.openxmlformats.org/officeDocument/2006/relationships" xmlns:m="http://schemas.openxmlformats.org/officeDocument/2006/math" xmlns:v="urn:schemas-microsoft-com:vml" xmlns:wp14="http://schemas.microsoft.com/office/word/2010/wordprocessingDrawing" xmlns:wp="http://schemas.openxmlformats.org/drawingml/2006/wordprocessingDrawing" xmlns:w10="urn:schemas-microsoft-com:office:word" xmlns:w="http://schemas.openxmlformats.org/wordprocessingml/2006/main" xmlns:w14="http://schemas.microsoft.com/office/word/2010/wordml" xmlns:w15="http://schemas.microsoft.com/office/word/2012/wordml" xmlns:w16cex="http://schemas.microsoft.com/office/word/2018/wordml/cex" xmlns:w16cid="http://schemas.microsoft.com/office/word/2016/wordml/cid" xmlns:w16="http://schemas.microsoft.com/office/word/2018/wordml" xmlns:w16du="http://schemas.microsoft.com/office/word/2023/wordml/word16du" xmlns:w16sdtdh="http://schemas.microsoft.com/office/word/2020/wordml/sdtdatahash" xmlns:w16sdtfl="http://schemas.microsoft.com/office/word/2024/wordml/sdtformatlock" xmlns:w16se="http://schemas.microsoft.com/office/word/2015/wordml/symex" xmlns:wpg="http://schemas.microsoft.com/office/word/2010/wordprocessingGroup" xmlns:wpi="http://schemas.microsoft.com/office/word/2010/wordprocessingInk" xmlns:wne="http://schemas.microsoft.com/office/word/2006/wordml" xmlns:wps="http://schemas.microsoft.com/office/word/2010/wordprocessingShape" mc:Ignorable="w14 w15 w16se w16cid w16 w16cex w16sdtdh w16sdtfl w16du wp14">
   <w:abstractNum w:abstractNumId="0" w15:restartNumberingAfterBreak="0">
+    <w:nsid w:val="0E63190B"/>
+    <w:multiLevelType w:val="multilevel"/>
+    <w:tmpl w:val="CF521104"/>
+    <w:lvl w:ilvl="0">
+      <w:start w:val="1"/>
+      <w:numFmt w:val="bullet"/>
+      <w:lvlText w:val=""/>
+      <w:lvlJc w:val="left"/>
+      <w:pPr>
+        <w:tabs>
+          <w:tab w:val="num" w:pos="720"/>
+        </w:tabs>
+        <w:ind w:left="720" w:hanging="360"/>
+      </w:pPr>
+      <w:rPr>
+        <w:rFonts w:ascii="Symbol" w:hAnsi="Symbol" w:hint="default"/>
+        <w:sz w:val="20"/>
+      </w:rPr>
+    </w:lvl>
+    <w:lvl w:ilvl="1" w:tentative="1">
+      <w:start w:val="1"/>
+      <w:numFmt w:val="bullet"/>
+      <w:lvlText w:val="o"/>
+      <w:lvlJc w:val="left"/>
+      <w:pPr>
+        <w:tabs>
+          <w:tab w:val="num" w:pos="1440"/>
+        </w:tabs>
+        <w:ind w:left="1440" w:hanging="360"/>
+      </w:pPr>
+      <w:rPr>
+        <w:rFonts w:ascii="Courier New" w:hAnsi="Courier New" w:hint="default"/>
+        <w:sz w:val="20"/>
+      </w:rPr>
+    </w:lvl>
+    <w:lvl w:ilvl="2" w:tentative="1">
+      <w:start w:val="1"/>
+      <w:numFmt w:val="bullet"/>
+      <w:lvlText w:val=""/>
+      <w:lvlJc w:val="left"/>
+      <w:pPr>
+        <w:tabs>
+          <w:tab w:val="num" w:pos="2160"/>
+        </w:tabs>
+        <w:ind w:left="2160" w:hanging="360"/>
+      </w:pPr>
+      <w:rPr>
+        <w:rFonts w:ascii="Wingdings" w:hAnsi="Wingdings" w:hint="default"/>
+        <w:sz w:val="20"/>
+      </w:rPr>
+    </w:lvl>
+    <w:lvl w:ilvl="3" w:tentative="1">
+      <w:start w:val="1"/>
+      <w:numFmt w:val="bullet"/>
+      <w:lvlText w:val=""/>
+      <w:lvlJc w:val="left"/>
+      <w:pPr>
+        <w:tabs>
+          <w:tab w:val="num" w:pos="2880"/>
+        </w:tabs>
+        <w:ind w:left="2880" w:hanging="360"/>
+      </w:pPr>
+      <w:rPr>
+        <w:rFonts w:ascii="Wingdings" w:hAnsi="Wingdings" w:hint="default"/>
+        <w:sz w:val="20"/>
+      </w:rPr>
+    </w:lvl>
+    <w:lvl w:ilvl="4" w:tentative="1">
+      <w:start w:val="1"/>
+      <w:numFmt w:val="bullet"/>
+      <w:lvlText w:val=""/>
+      <w:lvlJc w:val="left"/>
+      <w:pPr>
+        <w:tabs>
+          <w:tab w:val="num" w:pos="3600"/>
+        </w:tabs>
+        <w:ind w:left="3600" w:hanging="360"/>
+      </w:pPr>
+      <w:rPr>
+        <w:rFonts w:ascii="Wingdings" w:hAnsi="Wingdings" w:hint="default"/>
+        <w:sz w:val="20"/>
+      </w:rPr>
+    </w:lvl>
+    <w:lvl w:ilvl="5" w:tentative="1">
+      <w:start w:val="1"/>
+      <w:numFmt w:val="bullet"/>
+      <w:lvlText w:val=""/>
+      <w:lvlJc w:val="left"/>
+      <w:pPr>
+        <w:tabs>
+          <w:tab w:val="num" w:pos="4320"/>
+        </w:tabs>
+        <w:ind w:left="4320" w:hanging="360"/>
+      </w:pPr>
+      <w:rPr>
+        <w:rFonts w:ascii="Wingdings" w:hAnsi="Wingdings" w:hint="default"/>
+        <w:sz w:val="20"/>
+      </w:rPr>
+    </w:lvl>
+    <w:lvl w:ilvl="6" w:tentative="1">
+      <w:start w:val="1"/>
+      <w:numFmt w:val="bullet"/>
+      <w:lvlText w:val=""/>
+      <w:lvlJc w:val="left"/>
+      <w:pPr>
+        <w:tabs>
+          <w:tab w:val="num" w:pos="5040"/>
+        </w:tabs>
+        <w:ind w:left="5040" w:hanging="360"/>
+      </w:pPr>
+      <w:rPr>
+        <w:rFonts w:ascii="Wingdings" w:hAnsi="Wingdings" w:hint="default"/>
+        <w:sz w:val="20"/>
+      </w:rPr>
+    </w:lvl>
+    <w:lvl w:ilvl="7" w:tentative="1">
+      <w:start w:val="1"/>
+      <w:numFmt w:val="bullet"/>
+      <w:lvlText w:val=""/>
+      <w:lvlJc w:val="left"/>
+      <w:pPr>
+        <w:tabs>
+          <w:tab w:val="num" w:pos="5760"/>
+        </w:tabs>
+        <w:ind w:left="5760" w:hanging="360"/>
+      </w:pPr>
+      <w:rPr>
+        <w:rFonts w:ascii="Wingdings" w:hAnsi="Wingdings" w:hint="default"/>
+        <w:sz w:val="20"/>
+      </w:rPr>
+    </w:lvl>
+    <w:lvl w:ilvl="8" w:tentative="1">
+      <w:start w:val="1"/>
+      <w:numFmt w:val="bullet"/>
+      <w:lvlText w:val=""/>
+      <w:lvlJc w:val="left"/>
+      <w:pPr>
+        <w:tabs>
+          <w:tab w:val="num" w:pos="6480"/>
+        </w:tabs>
+        <w:ind w:left="6480" w:hanging="360"/>
+      </w:pPr>
+      <w:rPr>
+        <w:rFonts w:ascii="Wingdings" w:hAnsi="Wingdings" w:hint="default"/>
+        <w:sz w:val="20"/>
+      </w:rPr>
+    </w:lvl>
+  </w:abstractNum>
+  <w:abstractNum w:abstractNumId="1" w15:restartNumberingAfterBreak="0">
     <w:nsid w:val="12562D16"/>
     <w:multiLevelType w:val="multilevel"/>
     <w:tmpl w:val="C486EBF8"/>
@@ -3381,7 +4815,7 @@
       </w:rPr>
     </w:lvl>
   </w:abstractNum>
-  <w:abstractNum w:abstractNumId="1" w15:restartNumberingAfterBreak="0">
+  <w:abstractNum w:abstractNumId="2" w15:restartNumberingAfterBreak="0">
     <w:nsid w:val="151C097E"/>
     <w:multiLevelType w:val="multilevel"/>
     <w:tmpl w:val="A6323EAA"/>
@@ -3530,7 +4964,7 @@
       </w:rPr>
     </w:lvl>
   </w:abstractNum>
-  <w:abstractNum w:abstractNumId="2" w15:restartNumberingAfterBreak="0">
+  <w:abstractNum w:abstractNumId="3" w15:restartNumberingAfterBreak="0">
     <w:nsid w:val="1CE83152"/>
     <w:multiLevelType w:val="multilevel"/>
     <w:tmpl w:val="93A6B55A"/>
@@ -3679,7 +5113,7 @@
       </w:rPr>
     </w:lvl>
   </w:abstractNum>
-  <w:abstractNum w:abstractNumId="3" w15:restartNumberingAfterBreak="0">
+  <w:abstractNum w:abstractNumId="4" w15:restartNumberingAfterBreak="0">
     <w:nsid w:val="266656E6"/>
     <w:multiLevelType w:val="multilevel"/>
     <w:tmpl w:val="F604C1A0"/>
@@ -3828,7 +5262,7 @@
       </w:rPr>
     </w:lvl>
   </w:abstractNum>
-  <w:abstractNum w:abstractNumId="4" w15:restartNumberingAfterBreak="0">
+  <w:abstractNum w:abstractNumId="5" w15:restartNumberingAfterBreak="0">
     <w:nsid w:val="27564D58"/>
     <w:multiLevelType w:val="multilevel"/>
     <w:tmpl w:val="D6C4AA12"/>
@@ -3977,7 +5411,7 @@
       </w:rPr>
     </w:lvl>
   </w:abstractNum>
-  <w:abstractNum w:abstractNumId="5" w15:restartNumberingAfterBreak="0">
+  <w:abstractNum w:abstractNumId="6" w15:restartNumberingAfterBreak="0">
     <w:nsid w:val="5232049B"/>
     <w:multiLevelType w:val="multilevel"/>
     <w:tmpl w:val="C91E334C"/>
@@ -4126,7 +5560,7 @@
       </w:rPr>
     </w:lvl>
   </w:abstractNum>
-  <w:abstractNum w:abstractNumId="6" w15:restartNumberingAfterBreak="0">
+  <w:abstractNum w:abstractNumId="7" w15:restartNumberingAfterBreak="0">
     <w:nsid w:val="546C033C"/>
     <w:multiLevelType w:val="multilevel"/>
     <w:tmpl w:val="71AC7086"/>
@@ -4275,7 +5709,7 @@
       </w:rPr>
     </w:lvl>
   </w:abstractNum>
-  <w:abstractNum w:abstractNumId="7" w15:restartNumberingAfterBreak="0">
+  <w:abstractNum w:abstractNumId="8" w15:restartNumberingAfterBreak="0">
     <w:nsid w:val="54C66CA0"/>
     <w:multiLevelType w:val="multilevel"/>
     <w:tmpl w:val="009E1CA0"/>
@@ -4424,7 +5858,7 @@
       </w:rPr>
     </w:lvl>
   </w:abstractNum>
-  <w:abstractNum w:abstractNumId="8" w15:restartNumberingAfterBreak="0">
+  <w:abstractNum w:abstractNumId="9" w15:restartNumberingAfterBreak="0">
     <w:nsid w:val="67FD1F32"/>
     <w:multiLevelType w:val="multilevel"/>
     <w:tmpl w:val="114CD08E"/>
@@ -4574,30 +6008,33 @@
     </w:lvl>
   </w:abstractNum>
   <w:num w:numId="1" w16cid:durableId="803160041">
+    <w:abstractNumId w:val="9"/>
+  </w:num>
+  <w:num w:numId="2" w16cid:durableId="1529953245">
+    <w:abstractNumId w:val="3"/>
+  </w:num>
+  <w:num w:numId="3" w16cid:durableId="1193686947">
+    <w:abstractNumId w:val="2"/>
+  </w:num>
+  <w:num w:numId="4" w16cid:durableId="1357462995">
+    <w:abstractNumId w:val="4"/>
+  </w:num>
+  <w:num w:numId="5" w16cid:durableId="861632351">
+    <w:abstractNumId w:val="7"/>
+  </w:num>
+  <w:num w:numId="6" w16cid:durableId="994601221">
     <w:abstractNumId w:val="8"/>
   </w:num>
-  <w:num w:numId="2" w16cid:durableId="1529953245">
-    <w:abstractNumId w:val="2"/>
+  <w:num w:numId="7" w16cid:durableId="534273436">
+    <w:abstractNumId w:val="6"/>
   </w:num>
-  <w:num w:numId="3" w16cid:durableId="1193686947">
+  <w:num w:numId="8" w16cid:durableId="2030640433">
+    <w:abstractNumId w:val="5"/>
+  </w:num>
+  <w:num w:numId="9" w16cid:durableId="461966072">
     <w:abstractNumId w:val="1"/>
   </w:num>
-  <w:num w:numId="4" w16cid:durableId="1357462995">
-    <w:abstractNumId w:val="3"/>
-  </w:num>
-  <w:num w:numId="5" w16cid:durableId="861632351">
-    <w:abstractNumId w:val="6"/>
-  </w:num>
-  <w:num w:numId="6" w16cid:durableId="994601221">
-    <w:abstractNumId w:val="7"/>
-  </w:num>
-  <w:num w:numId="7" w16cid:durableId="534273436">
-    <w:abstractNumId w:val="5"/>
-  </w:num>
-  <w:num w:numId="8" w16cid:durableId="2030640433">
-    <w:abstractNumId w:val="4"/>
-  </w:num>
-  <w:num w:numId="9" w16cid:durableId="461966072">
+  <w:num w:numId="10" w16cid:durableId="603419282">
     <w:abstractNumId w:val="0"/>
   </w:num>
 </w:numbering>
@@ -5206,6 +6643,7 @@
   <w:style w:type="character" w:default="1" w:styleId="DefaultParagraphFont">
     <w:name w:val="Default Paragraph Font"/>
     <w:uiPriority w:val="1"/>
+    <w:semiHidden/>
     <w:unhideWhenUsed/>
   </w:style>
   <w:style w:type="table" w:default="1" w:styleId="TableNormal">

</xml_diff>